<commit_message>
Selection study: BM25 and fused baselines, e2e harness (oracle-target, same-budget), reranker script
- select.mjs: BM25 (only memories sharing a term) and reciprocal-rank fusion
- 15 conditions; baselines analysed as a separate Holm family
- e2e/: real-model runner (fork of the extraction step, checked equal to the server),
  dry run results; real pilot is running separately and is not included here
- run-rerank.mjs + analyze_rerank.py: cross-encoder baseline for a machine with internet
- README.md with commands; paper updated (tables, figure 9, text)

Co-Authored-By: Claude Opus 5.5 <noreply@anthropic.com>
Claude-Session: https://claude.ai/code/session_0199uMN2tRAqpJR3sfk69y1g
</commit_message>
<xml_diff>
--- a/paper/aura-paper.docx
+++ b/paper/aura-paper.docx
@@ -2758,20 +2758,6 @@
           <w:b/>
           <w:sz w:val="18"/>
         </w:rPr>
-        <w:t xml:space="preserve">baselines</w:t>
-      </w:r>
-      <w:r>
-        <w:rPr>
-          <w:b/>
-          <w:sz w:val="18"/>
-        </w:rPr>
-        <w:t xml:space="preserve"> </w:t>
-      </w:r>
-      <w:r>
-        <w:rPr>
-          <w:b/>
-          <w:sz w:val="18"/>
-        </w:rPr>
         <w:t xml:space="preserve">and</w:t>
       </w:r>
       <w:r>
@@ -2786,6 +2772,48 @@
           <w:b/>
           <w:sz w:val="18"/>
         </w:rPr>
+        <w:t xml:space="preserve">keyword</w:t>
+      </w:r>
+      <w:r>
+        <w:rPr>
+          <w:b/>
+          <w:sz w:val="18"/>
+        </w:rPr>
+        <w:t xml:space="preserve"> </w:t>
+      </w:r>
+      <w:r>
+        <w:rPr>
+          <w:b/>
+          <w:sz w:val="18"/>
+        </w:rPr>
+        <w:t xml:space="preserve">baselines,</w:t>
+      </w:r>
+      <w:r>
+        <w:rPr>
+          <w:b/>
+          <w:sz w:val="18"/>
+        </w:rPr>
+        <w:t xml:space="preserve"> </w:t>
+      </w:r>
+      <w:r>
+        <w:rPr>
+          <w:b/>
+          <w:sz w:val="18"/>
+        </w:rPr>
+        <w:t xml:space="preserve">and</w:t>
+      </w:r>
+      <w:r>
+        <w:rPr>
+          <w:b/>
+          <w:sz w:val="18"/>
+        </w:rPr>
+        <w:t xml:space="preserve"> </w:t>
+      </w:r>
+      <w:r>
+        <w:rPr>
+          <w:b/>
+          <w:sz w:val="18"/>
+        </w:rPr>
         <w:t xml:space="preserve">change</w:t>
       </w:r>
       <w:r>
@@ -3761,7 +3789,7 @@
           <w:b/>
           <w:sz w:val="18"/>
         </w:rPr>
-        <w:t xml:space="preserve">11.5%</w:t>
+        <w:t xml:space="preserve">10.0%</w:t>
       </w:r>
       <w:r>
         <w:rPr>
@@ -3873,7 +3901,567 @@
           <w:b/>
           <w:sz w:val="18"/>
         </w:rPr>
-        <w:t xml:space="preserve">eleven</w:t>
+        <w:t xml:space="preserve">15 selection</w:t>
+      </w:r>
+      <w:r>
+        <w:rPr>
+          <w:b/>
+          <w:sz w:val="18"/>
+        </w:rPr>
+        <w:t xml:space="preserve"> </w:t>
+      </w:r>
+      <w:r>
+        <w:rPr>
+          <w:b/>
+          <w:sz w:val="18"/>
+        </w:rPr>
+        <w:t xml:space="preserve">variants,</w:t>
+      </w:r>
+      <w:r>
+        <w:rPr>
+          <w:b/>
+          <w:sz w:val="18"/>
+        </w:rPr>
+        <w:t xml:space="preserve"> </w:t>
+      </w:r>
+      <w:r>
+        <w:rPr>
+          <w:b/>
+          <w:sz w:val="18"/>
+        </w:rPr>
+        <w:t xml:space="preserve">including</w:t>
+      </w:r>
+      <w:r>
+        <w:rPr>
+          <w:b/>
+          <w:sz w:val="18"/>
+        </w:rPr>
+        <w:t xml:space="preserve"> </w:t>
+      </w:r>
+      <w:r>
+        <w:rPr>
+          <w:b/>
+          <w:sz w:val="18"/>
+        </w:rPr>
+        <w:t xml:space="preserve">keyword</w:t>
+      </w:r>
+      <w:r>
+        <w:rPr>
+          <w:b/>
+          <w:sz w:val="18"/>
+        </w:rPr>
+        <w:t xml:space="preserve"> </w:t>
+      </w:r>
+      <w:r>
+        <w:rPr>
+          <w:b/>
+          <w:sz w:val="18"/>
+        </w:rPr>
+        <w:t xml:space="preserve">(BM25)</w:t>
+      </w:r>
+      <w:r>
+        <w:rPr>
+          <w:b/>
+          <w:sz w:val="18"/>
+        </w:rPr>
+        <w:t xml:space="preserve"> </w:t>
+      </w:r>
+      <w:r>
+        <w:rPr>
+          <w:b/>
+          <w:sz w:val="18"/>
+        </w:rPr>
+        <w:t xml:space="preserve">and</w:t>
+      </w:r>
+      <w:r>
+        <w:rPr>
+          <w:b/>
+          <w:sz w:val="18"/>
+        </w:rPr>
+        <w:t xml:space="preserve"> </w:t>
+      </w:r>
+      <w:r>
+        <w:rPr>
+          <w:b/>
+          <w:sz w:val="18"/>
+        </w:rPr>
+        <w:t xml:space="preserve">fused</w:t>
+      </w:r>
+      <w:r>
+        <w:rPr>
+          <w:b/>
+          <w:sz w:val="18"/>
+        </w:rPr>
+        <w:t xml:space="preserve"> </w:t>
+      </w:r>
+      <w:r>
+        <w:rPr>
+          <w:b/>
+          <w:sz w:val="18"/>
+        </w:rPr>
+        <w:t xml:space="preserve">rankings,</w:t>
+      </w:r>
+      <w:r>
+        <w:rPr>
+          <w:b/>
+          <w:sz w:val="18"/>
+        </w:rPr>
+        <w:t xml:space="preserve"> </w:t>
+      </w:r>
+      <w:r>
+        <w:rPr>
+          <w:b/>
+          <w:sz w:val="18"/>
+        </w:rPr>
+        <w:t xml:space="preserve">which</w:t>
+      </w:r>
+      <w:r>
+        <w:rPr>
+          <w:b/>
+          <w:sz w:val="18"/>
+        </w:rPr>
+        <w:t xml:space="preserve"> </w:t>
+      </w:r>
+      <w:r>
+        <w:rPr>
+          <w:b/>
+          <w:sz w:val="18"/>
+        </w:rPr>
+        <w:t xml:space="preserve">do</w:t>
+      </w:r>
+      <w:r>
+        <w:rPr>
+          <w:b/>
+          <w:sz w:val="18"/>
+        </w:rPr>
+        <w:t xml:space="preserve"> </w:t>
+      </w:r>
+      <w:r>
+        <w:rPr>
+          <w:b/>
+          <w:sz w:val="18"/>
+        </w:rPr>
+        <w:t xml:space="preserve">no</w:t>
+      </w:r>
+      <w:r>
+        <w:rPr>
+          <w:b/>
+          <w:sz w:val="18"/>
+        </w:rPr>
+        <w:t xml:space="preserve"> </w:t>
+      </w:r>
+      <w:r>
+        <w:rPr>
+          <w:b/>
+          <w:sz w:val="18"/>
+        </w:rPr>
+        <w:t xml:space="preserve">better</w:t>
+      </w:r>
+      <w:r>
+        <w:rPr>
+          <w:b/>
+          <w:sz w:val="18"/>
+        </w:rPr>
+        <w:t xml:space="preserve"> </w:t>
+      </w:r>
+      <w:r>
+        <w:rPr>
+          <w:b/>
+          <w:sz w:val="18"/>
+        </w:rPr>
+        <w:t xml:space="preserve">than</w:t>
+      </w:r>
+      <w:r>
+        <w:rPr>
+          <w:b/>
+          <w:sz w:val="18"/>
+        </w:rPr>
+        <w:t xml:space="preserve"> </w:t>
+      </w:r>
+      <w:r>
+        <w:rPr>
+          <w:b/>
+          <w:sz w:val="18"/>
+        </w:rPr>
+        <w:t xml:space="preserve">the</w:t>
+      </w:r>
+      <w:r>
+        <w:rPr>
+          <w:b/>
+          <w:sz w:val="18"/>
+        </w:rPr>
+        <w:t xml:space="preserve"> </w:t>
+      </w:r>
+      <w:r>
+        <w:rPr>
+          <w:b/>
+          <w:sz w:val="18"/>
+        </w:rPr>
+        <w:t xml:space="preserve">plain</w:t>
+      </w:r>
+      <w:r>
+        <w:rPr>
+          <w:b/>
+          <w:sz w:val="18"/>
+        </w:rPr>
+        <w:t xml:space="preserve"> </w:t>
+      </w:r>
+      <w:r>
+        <w:rPr>
+          <w:b/>
+          <w:sz w:val="18"/>
+        </w:rPr>
+        <w:t xml:space="preserve">list.</w:t>
+      </w:r>
+      <w:r>
+        <w:rPr>
+          <w:b/>
+          <w:sz w:val="18"/>
+        </w:rPr>
+        <w:t xml:space="preserve"> </w:t>
+      </w:r>
+      <w:r>
+        <w:rPr>
+          <w:b/>
+          <w:sz w:val="18"/>
+        </w:rPr>
+        <w:t xml:space="preserve">Third,</w:t>
+      </w:r>
+      <w:r>
+        <w:rPr>
+          <w:b/>
+          <w:sz w:val="18"/>
+        </w:rPr>
+        <w:t xml:space="preserve"> </w:t>
+      </w:r>
+      <w:r>
+        <w:rPr>
+          <w:b/>
+          <w:sz w:val="18"/>
+        </w:rPr>
+        <w:t xml:space="preserve">with</w:t>
+      </w:r>
+      <w:r>
+        <w:rPr>
+          <w:b/>
+          <w:sz w:val="18"/>
+        </w:rPr>
+        <w:t xml:space="preserve"> </w:t>
+      </w:r>
+      <w:r>
+        <w:rPr>
+          <w:b/>
+          <w:sz w:val="18"/>
+        </w:rPr>
+        <w:t xml:space="preserve">two</w:t>
+      </w:r>
+      <w:r>
+        <w:rPr>
+          <w:b/>
+          <w:sz w:val="18"/>
+        </w:rPr>
+        <w:t xml:space="preserve"> </w:t>
+      </w:r>
+      <w:r>
+        <w:rPr>
+          <w:b/>
+          <w:sz w:val="18"/>
+        </w:rPr>
+        <w:t xml:space="preserve">real</w:t>
+      </w:r>
+      <w:r>
+        <w:rPr>
+          <w:b/>
+          <w:sz w:val="18"/>
+        </w:rPr>
+        <w:t xml:space="preserve"> </w:t>
+      </w:r>
+      <w:r>
+        <w:rPr>
+          <w:b/>
+          <w:sz w:val="18"/>
+        </w:rPr>
+        <w:t xml:space="preserve">Gemini</w:t>
+      </w:r>
+      <w:r>
+        <w:rPr>
+          <w:b/>
+          <w:sz w:val="18"/>
+        </w:rPr>
+        <w:t xml:space="preserve"> </w:t>
+      </w:r>
+      <w:r>
+        <w:rPr>
+          <w:b/>
+          <w:sz w:val="18"/>
+        </w:rPr>
+        <w:t xml:space="preserve">extractors</w:t>
+      </w:r>
+      <w:r>
+        <w:rPr>
+          <w:b/>
+          <w:sz w:val="18"/>
+        </w:rPr>
+        <w:t xml:space="preserve"> </w:t>
+      </w:r>
+      <w:r>
+        <w:rPr>
+          <w:b/>
+          <w:sz w:val="18"/>
+        </w:rPr>
+        <w:t xml:space="preserve">(12</w:t>
+      </w:r>
+      <w:r>
+        <w:rPr>
+          <w:b/>
+          <w:sz w:val="18"/>
+        </w:rPr>
+        <w:t xml:space="preserve"> </w:t>
+      </w:r>
+      <w:r>
+        <w:rPr>
+          <w:b/>
+          <w:sz w:val="18"/>
+        </w:rPr>
+        <w:t xml:space="preserve">personas</w:t>
+      </w:r>
+      <w:r>
+        <w:rPr>
+          <w:b/>
+          <w:sz w:val="18"/>
+        </w:rPr>
+        <w:t xml:space="preserve"> </w:t>
+      </w:r>
+      <w:r>
+        <w:rPr>
+          <w:b/>
+          <w:sz w:val="18"/>
+        </w:rPr>
+        <w:t xml:space="preserve">each)</w:t>
+      </w:r>
+      <w:r>
+        <w:rPr>
+          <w:b/>
+          <w:sz w:val="18"/>
+        </w:rPr>
+        <w:t xml:space="preserve"> </w:t>
+      </w:r>
+      <w:r>
+        <w:rPr>
+          <w:b/>
+          <w:sz w:val="18"/>
+        </w:rPr>
+        <w:t xml:space="preserve">the</w:t>
+      </w:r>
+      <w:r>
+        <w:rPr>
+          <w:b/>
+          <w:sz w:val="18"/>
+        </w:rPr>
+        <w:t xml:space="preserve"> </w:t>
+      </w:r>
+      <w:r>
+        <w:rPr>
+          <w:b/>
+          <w:sz w:val="18"/>
+        </w:rPr>
+        <w:t xml:space="preserve">target</w:t>
+      </w:r>
+      <w:r>
+        <w:rPr>
+          <w:b/>
+          <w:sz w:val="18"/>
+        </w:rPr>
+        <w:t xml:space="preserve"> </w:t>
+      </w:r>
+      <w:r>
+        <w:rPr>
+          <w:b/>
+          <w:sz w:val="18"/>
+        </w:rPr>
+        <w:t xml:space="preserve">was</w:t>
+      </w:r>
+      <w:r>
+        <w:rPr>
+          <w:b/>
+          <w:sz w:val="18"/>
+        </w:rPr>
+        <w:t xml:space="preserve"> </w:t>
+      </w:r>
+      <w:r>
+        <w:rPr>
+          <w:b/>
+          <w:sz w:val="18"/>
+        </w:rPr>
+        <w:t xml:space="preserve">missing</w:t>
+      </w:r>
+      <w:r>
+        <w:rPr>
+          <w:b/>
+          <w:sz w:val="18"/>
+        </w:rPr>
+        <w:t xml:space="preserve"> </w:t>
+      </w:r>
+      <w:r>
+        <w:rPr>
+          <w:b/>
+          <w:sz w:val="18"/>
+        </w:rPr>
+        <w:t xml:space="preserve">from</w:t>
+      </w:r>
+      <w:r>
+        <w:rPr>
+          <w:b/>
+          <w:sz w:val="18"/>
+        </w:rPr>
+        <w:t xml:space="preserve"> </w:t>
+      </w:r>
+      <w:r>
+        <w:rPr>
+          <w:b/>
+          <w:sz w:val="18"/>
+        </w:rPr>
+        <w:t xml:space="preserve">the</w:t>
+      </w:r>
+      <w:r>
+        <w:rPr>
+          <w:b/>
+          <w:sz w:val="18"/>
+        </w:rPr>
+        <w:t xml:space="preserve"> </w:t>
+      </w:r>
+      <w:r>
+        <w:rPr>
+          <w:b/>
+          <w:sz w:val="18"/>
+        </w:rPr>
+        <w:t xml:space="preserve">prompt</w:t>
+      </w:r>
+      <w:r>
+        <w:rPr>
+          <w:b/>
+          <w:sz w:val="18"/>
+        </w:rPr>
+        <w:t xml:space="preserve"> </w:t>
+      </w:r>
+      <w:r>
+        <w:rPr>
+          <w:b/>
+          <w:sz w:val="18"/>
+        </w:rPr>
+        <w:t xml:space="preserve">in</w:t>
+      </w:r>
+      <w:r>
+        <w:rPr>
+          <w:b/>
+          <w:sz w:val="18"/>
+        </w:rPr>
+        <w:t xml:space="preserve"> </w:t>
+      </w:r>
+      <w:r>
+        <w:rPr>
+          <w:b/>
+          <w:sz w:val="18"/>
+        </w:rPr>
+        <w:t xml:space="preserve">25 and</w:t>
+      </w:r>
+      <w:r>
+        <w:rPr>
+          <w:b/>
+          <w:sz w:val="18"/>
+        </w:rPr>
+        <w:t xml:space="preserve"> </w:t>
+      </w:r>
+      <w:r>
+        <w:rPr>
+          <w:b/>
+          <w:sz w:val="18"/>
+        </w:rPr>
+        <w:t xml:space="preserve">22 of</w:t>
+      </w:r>
+      <w:r>
+        <w:rPr>
+          <w:b/>
+          <w:sz w:val="18"/>
+        </w:rPr>
+        <w:t xml:space="preserve"> </w:t>
+      </w:r>
+      <w:r>
+        <w:rPr>
+          <w:b/>
+          <w:sz w:val="18"/>
+        </w:rPr>
+        <w:t xml:space="preserve">136</w:t>
+      </w:r>
+      <w:r>
+        <w:rPr>
+          <w:b/>
+          <w:sz w:val="18"/>
+        </w:rPr>
+        <w:t xml:space="preserve"> </w:t>
+      </w:r>
+      <w:r>
+        <w:rPr>
+          <w:b/>
+          <w:sz w:val="18"/>
+        </w:rPr>
+        <w:t xml:space="preserve">change</w:t>
+      </w:r>
+      <w:r>
+        <w:rPr>
+          <w:b/>
+          <w:sz w:val="18"/>
+        </w:rPr>
+        <w:t xml:space="preserve"> </w:t>
+      </w:r>
+      <w:r>
+        <w:rPr>
+          <w:b/>
+          <w:sz w:val="18"/>
+        </w:rPr>
+        <w:t xml:space="preserve">turns</w:t>
+      </w:r>
+      <w:r>
+        <w:rPr>
+          <w:b/>
+          <w:sz w:val="18"/>
+        </w:rPr>
+        <w:t xml:space="preserve"> </w:t>
+      </w:r>
+      <w:r>
+        <w:rPr>
+          <w:b/>
+          <w:sz w:val="18"/>
+        </w:rPr>
+        <w:t xml:space="preserve">with</w:t>
+      </w:r>
+      <w:r>
+        <w:rPr>
+          <w:b/>
+          <w:sz w:val="18"/>
+        </w:rPr>
+        <w:t xml:space="preserve"> </w:t>
+      </w:r>
+      <w:r>
+        <w:rPr>
+          <w:b/>
+          <w:sz w:val="18"/>
+        </w:rPr>
+        <w:t xml:space="preserve">the</w:t>
+      </w:r>
+      <w:r>
+        <w:rPr>
+          <w:b/>
+          <w:sz w:val="18"/>
+        </w:rPr>
+        <w:t xml:space="preserve"> </w:t>
+      </w:r>
+      <w:r>
+        <w:rPr>
+          <w:b/>
+          <w:sz w:val="18"/>
+        </w:rPr>
+        <w:t xml:space="preserve">default</w:t>
       </w:r>
       <w:r>
         <w:rPr>
@@ -3901,21 +4489,35 @@
           <w:b/>
           <w:sz w:val="18"/>
         </w:rPr>
-        <w:t xml:space="preserve">variants.</w:t>
-      </w:r>
-      <w:r>
-        <w:rPr>
-          <w:b/>
-          <w:sz w:val="18"/>
-        </w:rPr>
-        <w:t xml:space="preserve"> </w:t>
-      </w:r>
-      <w:r>
-        <w:rPr>
-          <w:b/>
-          <w:sz w:val="18"/>
-        </w:rPr>
-        <w:t xml:space="preserve">Third,</w:t>
+        <w:t xml:space="preserve">and</w:t>
+      </w:r>
+      <w:r>
+        <w:rPr>
+          <w:b/>
+          <w:sz w:val="18"/>
+        </w:rPr>
+        <w:t xml:space="preserve"> </w:t>
+      </w:r>
+      <w:r>
+        <w:rPr>
+          <w:b/>
+          <w:sz w:val="18"/>
+        </w:rPr>
+        <w:t xml:space="preserve">in</w:t>
+      </w:r>
+      <w:r>
+        <w:rPr>
+          <w:b/>
+          <w:sz w:val="18"/>
+        </w:rPr>
+        <w:t xml:space="preserve"> </w:t>
+      </w:r>
+      <w:r>
+        <w:rPr>
+          <w:b/>
+          <w:sz w:val="18"/>
+        </w:rPr>
+        <w:t xml:space="preserve">none</w:t>
       </w:r>
       <w:r>
         <w:rPr>
@@ -3943,104 +4545,6 @@
           <w:b/>
           <w:sz w:val="18"/>
         </w:rPr>
-        <w:t xml:space="preserve">two</w:t>
-      </w:r>
-      <w:r>
-        <w:rPr>
-          <w:b/>
-          <w:sz w:val="18"/>
-        </w:rPr>
-        <w:t xml:space="preserve"> </w:t>
-      </w:r>
-      <w:r>
-        <w:rPr>
-          <w:b/>
-          <w:sz w:val="18"/>
-        </w:rPr>
-        <w:t xml:space="preserve">real</w:t>
-      </w:r>
-      <w:r>
-        <w:rPr>
-          <w:b/>
-          <w:sz w:val="18"/>
-        </w:rPr>
-        <w:t xml:space="preserve"> </w:t>
-      </w:r>
-      <w:r>
-        <w:rPr>
-          <w:b/>
-          <w:sz w:val="18"/>
-        </w:rPr>
-        <w:t xml:space="preserve">Gemini</w:t>
-      </w:r>
-      <w:r>
-        <w:rPr>
-          <w:b/>
-          <w:sz w:val="18"/>
-        </w:rPr>
-        <w:t xml:space="preserve"> </w:t>
-      </w:r>
-      <w:r>
-        <w:rPr>
-          <w:b/>
-          <w:sz w:val="18"/>
-        </w:rPr>
-        <w:t xml:space="preserve">extractors</w:t>
-      </w:r>
-      <w:r>
-        <w:rPr>
-          <w:b/>
-          <w:sz w:val="18"/>
-        </w:rPr>
-        <w:t xml:space="preserve"> </w:t>
-      </w:r>
-      <w:r>
-        <w:rPr>
-          <w:b/>
-          <w:sz w:val="18"/>
-        </w:rPr>
-        <w:t xml:space="preserve">(12</w:t>
-      </w:r>
-      <w:r>
-        <w:rPr>
-          <w:b/>
-          <w:sz w:val="18"/>
-        </w:rPr>
-        <w:t xml:space="preserve"> </w:t>
-      </w:r>
-      <w:r>
-        <w:rPr>
-          <w:b/>
-          <w:sz w:val="18"/>
-        </w:rPr>
-        <w:t xml:space="preserve">personas</w:t>
-      </w:r>
-      <w:r>
-        <w:rPr>
-          <w:b/>
-          <w:sz w:val="18"/>
-        </w:rPr>
-        <w:t xml:space="preserve"> </w:t>
-      </w:r>
-      <w:r>
-        <w:rPr>
-          <w:b/>
-          <w:sz w:val="18"/>
-        </w:rPr>
-        <w:t xml:space="preserve">each)</w:t>
-      </w:r>
-      <w:r>
-        <w:rPr>
-          <w:b/>
-          <w:sz w:val="18"/>
-        </w:rPr>
-        <w:t xml:space="preserve"> </w:t>
-      </w:r>
-      <w:r>
-        <w:rPr>
-          <w:b/>
-          <w:sz w:val="18"/>
-        </w:rPr>
         <w:t xml:space="preserve">the</w:t>
       </w:r>
       <w:r>
@@ -4055,49 +4559,63 @@
           <w:b/>
           <w:sz w:val="18"/>
         </w:rPr>
-        <w:t xml:space="preserve">target</w:t>
-      </w:r>
-      <w:r>
-        <w:rPr>
-          <w:b/>
-          <w:sz w:val="18"/>
-        </w:rPr>
-        <w:t xml:space="preserve"> </w:t>
-      </w:r>
-      <w:r>
-        <w:rPr>
-          <w:b/>
-          <w:sz w:val="18"/>
-        </w:rPr>
-        <w:t xml:space="preserve">was</w:t>
-      </w:r>
-      <w:r>
-        <w:rPr>
-          <w:b/>
-          <w:sz w:val="18"/>
-        </w:rPr>
-        <w:t xml:space="preserve"> </w:t>
-      </w:r>
-      <w:r>
-        <w:rPr>
-          <w:b/>
-          <w:sz w:val="18"/>
-        </w:rPr>
-        <w:t xml:space="preserve">missing</w:t>
-      </w:r>
-      <w:r>
-        <w:rPr>
-          <w:b/>
-          <w:sz w:val="18"/>
-        </w:rPr>
-        <w:t xml:space="preserve"> </w:t>
-      </w:r>
-      <w:r>
-        <w:rPr>
-          <w:b/>
-          <w:sz w:val="18"/>
-        </w:rPr>
-        <w:t xml:space="preserve">from</w:t>
+        <w:t xml:space="preserve">adaptive</w:t>
+      </w:r>
+      <w:r>
+        <w:rPr>
+          <w:b/>
+          <w:sz w:val="18"/>
+        </w:rPr>
+        <w:t xml:space="preserve"> </w:t>
+      </w:r>
+      <w:r>
+        <w:rPr>
+          <w:b/>
+          <w:sz w:val="18"/>
+        </w:rPr>
+        <w:t xml:space="preserve">selection</w:t>
+      </w:r>
+      <w:r>
+        <w:rPr>
+          <w:b/>
+          <w:sz w:val="18"/>
+        </w:rPr>
+        <w:t xml:space="preserve"> </w:t>
+      </w:r>
+      <w:r>
+        <w:rPr>
+          <w:b/>
+          <w:sz w:val="18"/>
+        </w:rPr>
+        <w:t xml:space="preserve">(run</w:t>
+      </w:r>
+      <w:r>
+        <w:rPr>
+          <w:b/>
+          <w:sz w:val="18"/>
+        </w:rPr>
+        <w:t xml:space="preserve"> </w:t>
+      </w:r>
+      <w:r>
+        <w:rPr>
+          <w:b/>
+          <w:sz w:val="18"/>
+        </w:rPr>
+        <w:t xml:space="preserve">together</w:t>
+      </w:r>
+      <w:r>
+        <w:rPr>
+          <w:b/>
+          <w:sz w:val="18"/>
+        </w:rPr>
+        <w:t xml:space="preserve"> </w:t>
+      </w:r>
+      <w:r>
+        <w:rPr>
+          <w:b/>
+          <w:sz w:val="18"/>
+        </w:rPr>
+        <w:t xml:space="preserve">with</w:t>
       </w:r>
       <w:r>
         <w:rPr>
@@ -4125,245 +4643,91 @@
           <w:b/>
           <w:sz w:val="18"/>
         </w:rPr>
-        <w:t xml:space="preserve">prompt</w:t>
-      </w:r>
-      <w:r>
-        <w:rPr>
-          <w:b/>
-          <w:sz w:val="18"/>
-        </w:rPr>
-        <w:t xml:space="preserve"> </w:t>
-      </w:r>
-      <w:r>
-        <w:rPr>
-          <w:b/>
-          <w:sz w:val="18"/>
-        </w:rPr>
-        <w:t xml:space="preserve">in</w:t>
-      </w:r>
-      <w:r>
-        <w:rPr>
-          <w:b/>
-          <w:sz w:val="18"/>
-        </w:rPr>
-        <w:t xml:space="preserve"> </w:t>
-      </w:r>
-      <w:r>
-        <w:rPr>
-          <w:b/>
-          <w:sz w:val="18"/>
-        </w:rPr>
-        <w:t xml:space="preserve">25 and</w:t>
-      </w:r>
-      <w:r>
-        <w:rPr>
-          <w:b/>
-          <w:sz w:val="18"/>
-        </w:rPr>
-        <w:t xml:space="preserve"> </w:t>
-      </w:r>
-      <w:r>
-        <w:rPr>
-          <w:b/>
-          <w:sz w:val="18"/>
-        </w:rPr>
-        <w:t xml:space="preserve">22 of</w:t>
-      </w:r>
-      <w:r>
-        <w:rPr>
-          <w:b/>
-          <w:sz w:val="18"/>
-        </w:rPr>
-        <w:t xml:space="preserve"> </w:t>
-      </w:r>
-      <w:r>
-        <w:rPr>
-          <w:b/>
-          <w:sz w:val="18"/>
-        </w:rPr>
-        <w:t xml:space="preserve">136</w:t>
-      </w:r>
-      <w:r>
-        <w:rPr>
-          <w:b/>
-          <w:sz w:val="18"/>
-        </w:rPr>
-        <w:t xml:space="preserve"> </w:t>
-      </w:r>
-      <w:r>
-        <w:rPr>
-          <w:b/>
-          <w:sz w:val="18"/>
-        </w:rPr>
-        <w:t xml:space="preserve">change</w:t>
-      </w:r>
-      <w:r>
-        <w:rPr>
-          <w:b/>
-          <w:sz w:val="18"/>
-        </w:rPr>
-        <w:t xml:space="preserve"> </w:t>
-      </w:r>
-      <w:r>
-        <w:rPr>
-          <w:b/>
-          <w:sz w:val="18"/>
-        </w:rPr>
-        <w:t xml:space="preserve">turns</w:t>
-      </w:r>
-      <w:r>
-        <w:rPr>
-          <w:b/>
-          <w:sz w:val="18"/>
-        </w:rPr>
-        <w:t xml:space="preserve"> </w:t>
-      </w:r>
-      <w:r>
-        <w:rPr>
-          <w:b/>
-          <w:sz w:val="18"/>
-        </w:rPr>
-        <w:t xml:space="preserve">with</w:t>
-      </w:r>
-      <w:r>
-        <w:rPr>
-          <w:b/>
-          <w:sz w:val="18"/>
-        </w:rPr>
-        <w:t xml:space="preserve"> </w:t>
-      </w:r>
-      <w:r>
-        <w:rPr>
-          <w:b/>
-          <w:sz w:val="18"/>
-        </w:rPr>
-        <w:t xml:space="preserve">the</w:t>
-      </w:r>
-      <w:r>
-        <w:rPr>
-          <w:b/>
-          <w:sz w:val="18"/>
-        </w:rPr>
-        <w:t xml:space="preserve"> </w:t>
-      </w:r>
-      <w:r>
-        <w:rPr>
-          <w:b/>
-          <w:sz w:val="18"/>
-        </w:rPr>
-        <w:t xml:space="preserve">default</w:t>
-      </w:r>
-      <w:r>
-        <w:rPr>
-          <w:b/>
-          <w:sz w:val="18"/>
-        </w:rPr>
-        <w:t xml:space="preserve"> </w:t>
-      </w:r>
-      <w:r>
-        <w:rPr>
-          <w:b/>
-          <w:sz w:val="18"/>
-        </w:rPr>
-        <w:t xml:space="preserve">selection</w:t>
-      </w:r>
-      <w:r>
-        <w:rPr>
-          <w:b/>
-          <w:sz w:val="18"/>
-        </w:rPr>
-        <w:t xml:space="preserve"> </w:t>
-      </w:r>
-      <w:r>
-        <w:rPr>
-          <w:b/>
-          <w:sz w:val="18"/>
-        </w:rPr>
-        <w:t xml:space="preserve">and</w:t>
-      </w:r>
-      <w:r>
-        <w:rPr>
-          <w:b/>
-          <w:sz w:val="18"/>
-        </w:rPr>
-        <w:t xml:space="preserve"> </w:t>
-      </w:r>
-      <w:r>
-        <w:rPr>
-          <w:b/>
-          <w:sz w:val="18"/>
-        </w:rPr>
-        <w:t xml:space="preserve">in</w:t>
-      </w:r>
-      <w:r>
-        <w:rPr>
-          <w:b/>
-          <w:sz w:val="18"/>
-        </w:rPr>
-        <w:t xml:space="preserve"> </w:t>
-      </w:r>
-      <w:r>
-        <w:rPr>
-          <w:b/>
-          <w:sz w:val="18"/>
-        </w:rPr>
-        <w:t xml:space="preserve">none</w:t>
-      </w:r>
-      <w:r>
-        <w:rPr>
-          <w:b/>
-          <w:sz w:val="18"/>
-        </w:rPr>
-        <w:t xml:space="preserve"> </w:t>
-      </w:r>
-      <w:r>
-        <w:rPr>
-          <w:b/>
-          <w:sz w:val="18"/>
-        </w:rPr>
-        <w:t xml:space="preserve">with</w:t>
-      </w:r>
-      <w:r>
-        <w:rPr>
-          <w:b/>
-          <w:sz w:val="18"/>
-        </w:rPr>
-        <w:t xml:space="preserve"> </w:t>
-      </w:r>
-      <w:r>
-        <w:rPr>
-          <w:b/>
-          <w:sz w:val="18"/>
-        </w:rPr>
-        <w:t xml:space="preserve">the</w:t>
-      </w:r>
-      <w:r>
-        <w:rPr>
-          <w:b/>
-          <w:sz w:val="18"/>
-        </w:rPr>
-        <w:t xml:space="preserve"> </w:t>
-      </w:r>
-      <w:r>
-        <w:rPr>
-          <w:b/>
-          <w:sz w:val="18"/>
-        </w:rPr>
-        <w:t xml:space="preserve">adaptive</w:t>
-      </w:r>
-      <w:r>
-        <w:rPr>
-          <w:b/>
-          <w:sz w:val="18"/>
-        </w:rPr>
-        <w:t xml:space="preserve"> </w:t>
-      </w:r>
-      <w:r>
-        <w:rPr>
-          <w:b/>
-          <w:sz w:val="18"/>
-        </w:rPr>
-        <w:t xml:space="preserve">selection;</w:t>
+        <w:t xml:space="preserve">re-proposal</w:t>
+      </w:r>
+      <w:r>
+        <w:rPr>
+          <w:b/>
+          <w:sz w:val="18"/>
+        </w:rPr>
+        <w:t xml:space="preserve"> </w:t>
+      </w:r>
+      <w:r>
+        <w:rPr>
+          <w:b/>
+          <w:sz w:val="18"/>
+        </w:rPr>
+        <w:t xml:space="preserve">rule,</w:t>
+      </w:r>
+      <w:r>
+        <w:rPr>
+          <w:b/>
+          <w:sz w:val="18"/>
+        </w:rPr>
+        <w:t xml:space="preserve"> </w:t>
+      </w:r>
+      <w:r>
+        <w:rPr>
+          <w:b/>
+          <w:sz w:val="18"/>
+        </w:rPr>
+        <w:t xml:space="preserve">which</w:t>
+      </w:r>
+      <w:r>
+        <w:rPr>
+          <w:b/>
+          <w:sz w:val="18"/>
+        </w:rPr>
+        <w:t xml:space="preserve"> </w:t>
+      </w:r>
+      <w:r>
+        <w:rPr>
+          <w:b/>
+          <w:sz w:val="18"/>
+        </w:rPr>
+        <w:t xml:space="preserve">does</w:t>
+      </w:r>
+      <w:r>
+        <w:rPr>
+          <w:b/>
+          <w:sz w:val="18"/>
+        </w:rPr>
+        <w:t xml:space="preserve"> </w:t>
+      </w:r>
+      <w:r>
+        <w:rPr>
+          <w:b/>
+          <w:sz w:val="18"/>
+        </w:rPr>
+        <w:t xml:space="preserve">not</w:t>
+      </w:r>
+      <w:r>
+        <w:rPr>
+          <w:b/>
+          <w:sz w:val="18"/>
+        </w:rPr>
+        <w:t xml:space="preserve"> </w:t>
+      </w:r>
+      <w:r>
+        <w:rPr>
+          <w:b/>
+          <w:sz w:val="18"/>
+        </w:rPr>
+        <w:t xml:space="preserve">affect</w:t>
+      </w:r>
+      <w:r>
+        <w:rPr>
+          <w:b/>
+          <w:sz w:val="18"/>
+        </w:rPr>
+        <w:t xml:space="preserve"> </w:t>
+      </w:r>
+      <w:r>
+        <w:rPr>
+          <w:b/>
+          <w:sz w:val="18"/>
+        </w:rPr>
+        <w:t xml:space="preserve">selection);</w:t>
       </w:r>
       <w:r>
         <w:rPr>
@@ -5321,7 +5685,7 @@
         <w:t xml:space="preserve"> </w:t>
       </w:r>
       <w:r>
-        <w:t xml:space="preserve">We define reachability on the final extractor prompt for known change events, distinguish it from retrieval recall, and measure it over store sizes, message forms and kinds of change on two test sets (Sec. VIII). A controlled study on a new test set of 40 personas with eleven selection variants, including same-size baselines and change messages held out from the selection’s cue words, shows that removing the minimum score and searching per sentence each add about 0.1, that more candidates on a change cue add almost nothing on their own, that the adaptive selection reaches the same share as a plain larger list while showing 19% fewer candidates, and that about one target in nine stays out of reach of every variant (Sec. IX).</w:t>
+        <w:t xml:space="preserve">We define reachability on the final extractor prompt for known change events, distinguish it from retrieval recall, and measure it over store sizes, message forms and kinds of change on two test sets (Sec. VIII). A controlled study on a new test set of 40 personas with 15 selection variants, including same-size, keyword (BM25) and fused baselines and change messages held out from the selection’s cue words, shows that removing the minimum score and searching per sentence each add about 0.1, that more candidates on a change cue add almost nothing on their own, that the adaptive selection reaches the same share as a plain larger list while showing 19% fewer candidates, that keyword and fused rankings do no better than the plain list, and that about one target in ten stays out of reach of every variant (Sec. IX).</w:t>
       </w:r>
     </w:p>
     <w:p>
@@ -5342,7 +5706,7 @@
         <w:t xml:space="preserve"> </w:t>
       </w:r>
       <w:r>
-        <w:t xml:space="preserve">With two Gemini extractors we evaluate the adaptive selection (F2) and a re-proposal rule (F1) in a paired ablation: F2 removed every observed missing target and the stale facts under the gate at about 35% more prompt tokens; F1 showed no measurable benefit (Sec. X–XI). An external LongMemEval check is reported with its limits (Sec. XII). The harness, both test-set generators and all raw results are released.</w:t>
+        <w:t xml:space="preserve">With two Gemini extractors we evaluate the adaptive selection (F2) and a re-proposal rule (F1) in a paired ablation: with F2 (run together with F1) no change target was missing and the stale facts under the gate disappeared, at about 35% more prompt tokens; F1 alone showed no measurable benefit (Sec. X–XI). An external LongMemEval check is reported with its limits (Sec. XII). The harness, both test-set generators and all raw results are released.</w:t>
       </w:r>
     </w:p>
     <w:p>
@@ -23277,7 +23641,7 @@
         <w:t xml:space="preserve"> </w:t>
       </w:r>
       <w:r>
-        <w:t xml:space="preserve">Table XIV lists eleven selection conditions: the four modes in AURA, four ablations that switch the adaptive mode’s parts on one at a time or in pairs, and three</w:t>
+        <w:t xml:space="preserve">Table XIV lists 15 selection conditions: the four modes in AURA, four ablations that switch the adaptive mode’s parts on one at a time or in pairs, three</w:t>
       </w:r>
       <w:r>
         <w:t xml:space="preserve"> </w:t>
@@ -23293,7 +23657,30 @@
         <w:t xml:space="preserve"> </w:t>
       </w:r>
       <w:r>
-        <w:t xml:space="preserve">baselines that always show 24 matches. All conditions are computed from AURA’s own search; for the four modes that exist in AURA, a test confirms that the computed candidate lists are identical to those of AURA’s selection code. The server code was not changed.</w:t>
+        <w:t xml:space="preserve">baselines that always show 24 matches, and four retrieval baselines added after the pre-registered design: BM25 keyword ranking (</w:t>
+      </w:r>
+      <w:r>
+        <w:rPr>
+          <w:iCs/>
+          <w:i/>
+        </w:rPr>
+        <w:t xml:space="preserve">k_1=1.2</w:t>
+      </w:r>
+      <w:r>
+        <w:t xml:space="preserve">,</w:t>
+      </w:r>
+      <w:r>
+        <w:t xml:space="preserve"> </w:t>
+      </w:r>
+      <w:r>
+        <w:rPr>
+          <w:iCs/>
+          <w:i/>
+        </w:rPr>
+        <w:t xml:space="preserve">b=0.75</w:t>
+      </w:r>
+      <w:r>
+        <w:t xml:space="preserve">, AURA’s tokeniser, only memories sharing a term with the message) with 12 and 24 matches, and reciprocal-rank fusion of BM25 with AURA’s ranking, for the whole message and per sentence. All conditions are computed from AURA’s own search; for the four modes that exist in AURA, a test confirms that the computed candidate lists are identical to those of AURA’s selection code. The server code was not changed.</w:t>
       </w:r>
     </w:p>
     <w:p>
@@ -23317,7 +23704,7 @@
         <w:t xml:space="preserve">,</w:t>
       </w:r>
       <w:r>
-        <w:t xml:space="preserve">000 resamples). Six comparisons were fixed before the run and are Holm-corrected; they use exact sign tests over personas on paired per-persona rates (Table XV). Other comparisons are labelled exploratory.</w:t>
+        <w:t xml:space="preserve">000 resamples). Six comparisons were fixed before the run and are Holm-corrected; they use exact sign tests over personas on paired per-persona rates (Table XV). The four comparisons for the added retrieval baselines form a second, separately Holm-corrected family. Other comparisons are labelled exploratory.</w:t>
       </w:r>
     </w:p>
     <w:p>
@@ -25616,6 +26003,7 @@
           <w:p>
             <w:pPr>
               <w:pStyle w:val="Compact"/>
+              <w:keepNext/>
               <w:spacing w:after="0"/>
               <w:jc w:val="left"/>
             </w:pPr>
@@ -25654,6 +26042,7 @@
           <w:p>
             <w:pPr>
               <w:pStyle w:val="Compact"/>
+              <w:keepNext/>
               <w:spacing w:after="0"/>
               <w:jc w:val="left"/>
             </w:pPr>
@@ -25676,6 +26065,7 @@
           <w:p>
             <w:pPr>
               <w:pStyle w:val="Compact"/>
+              <w:keepNext/>
               <w:spacing w:after="0"/>
               <w:jc w:val="left"/>
             </w:pPr>
@@ -25698,6 +26088,7 @@
           <w:p>
             <w:pPr>
               <w:pStyle w:val="Compact"/>
+              <w:keepNext/>
               <w:spacing w:after="0"/>
               <w:jc w:val="left"/>
             </w:pPr>
@@ -25720,6 +26111,7 @@
           <w:p>
             <w:pPr>
               <w:pStyle w:val="Compact"/>
+              <w:keepNext/>
               <w:spacing w:after="0"/>
               <w:jc w:val="left"/>
             </w:pPr>
@@ -25742,6 +26134,7 @@
           <w:p>
             <w:pPr>
               <w:pStyle w:val="Compact"/>
+              <w:keepNext/>
               <w:spacing w:after="0"/>
               <w:jc w:val="left"/>
             </w:pPr>
@@ -25764,6 +26157,7 @@
           <w:p>
             <w:pPr>
               <w:pStyle w:val="Compact"/>
+              <w:keepNext/>
               <w:spacing w:after="0"/>
               <w:jc w:val="left"/>
             </w:pPr>
@@ -25786,6 +26180,7 @@
           <w:p>
             <w:pPr>
               <w:pStyle w:val="Compact"/>
+              <w:keepNext/>
               <w:spacing w:after="0"/>
               <w:jc w:val="left"/>
             </w:pPr>
@@ -25795,6 +26190,806 @@
                 <w:sz w:val="16"/>
               </w:rPr>
               <w:t xml:space="preserve">0.913 / 0.828 / 0.855</w:t>
+            </w:r>
+          </w:p>
+        </w:tc>
+      </w:tr>
+      <w:tr>
+        <w:tc>
+          <w:tcPr>
+            <w:tcMar>
+              <w:left w:w="40" w:type="dxa"/>
+              <w:right w:w="40" w:type="dxa"/>
+            </w:tcMar>
+          </w:tcPr>
+          <w:p>
+            <w:pPr>
+              <w:pStyle w:val="Compact"/>
+              <w:keepNext/>
+              <w:spacing w:after="0"/>
+              <w:jc w:val="left"/>
+            </w:pPr>
+            <w:r>
+              <w:rPr>
+                <w:rFonts w:ascii="Times New Roman" w:hAnsi="Times New Roman"/>
+                <w:sz w:val="16"/>
+              </w:rPr>
+              <w:t xml:space="preserve">BM25,</w:t>
+            </w:r>
+            <w:r>
+              <w:rPr>
+                <w:rFonts w:ascii="Times New Roman" w:hAnsi="Times New Roman"/>
+                <w:sz w:val="16"/>
+              </w:rPr>
+              <w:t xml:space="preserve"> </w:t>
+            </w:r>
+            <w:r>
+              <w:rPr>
+                <w:iCs/>
+                <w:rFonts w:ascii="Times New Roman" w:hAnsi="Times New Roman"/>
+                <w:i/>
+                <w:sz w:val="16"/>
+              </w:rPr>
+              <w:t xml:space="preserve">k=12</w:t>
+            </w:r>
+          </w:p>
+        </w:tc>
+        <w:tc>
+          <w:tcPr>
+            <w:tcMar>
+              <w:left w:w="40" w:type="dxa"/>
+              <w:right w:w="40" w:type="dxa"/>
+            </w:tcMar>
+          </w:tcPr>
+          <w:p>
+            <w:pPr>
+              <w:pStyle w:val="Compact"/>
+              <w:keepNext/>
+              <w:spacing w:after="0"/>
+              <w:jc w:val="left"/>
+            </w:pPr>
+            <w:r>
+              <w:rPr>
+                <w:rFonts w:ascii="Times New Roman" w:hAnsi="Times New Roman"/>
+                <w:sz w:val="16"/>
+              </w:rPr>
+              <w:t xml:space="preserve">lexical</w:t>
+            </w:r>
+          </w:p>
+        </w:tc>
+        <w:tc>
+          <w:tcPr>
+            <w:tcMar>
+              <w:left w:w="40" w:type="dxa"/>
+              <w:right w:w="40" w:type="dxa"/>
+            </w:tcMar>
+          </w:tcPr>
+          <w:p>
+            <w:pPr>
+              <w:pStyle w:val="Compact"/>
+              <w:keepNext/>
+              <w:spacing w:after="0"/>
+              <w:jc w:val="left"/>
+            </w:pPr>
+            <w:r>
+              <w:rPr>
+                <w:rFonts w:ascii="Times New Roman" w:hAnsi="Times New Roman"/>
+                <w:sz w:val="16"/>
+              </w:rPr>
+              <w:t xml:space="preserve">no</w:t>
+            </w:r>
+          </w:p>
+        </w:tc>
+        <w:tc>
+          <w:tcPr>
+            <w:tcMar>
+              <w:left w:w="40" w:type="dxa"/>
+              <w:right w:w="40" w:type="dxa"/>
+            </w:tcMar>
+          </w:tcPr>
+          <w:p>
+            <w:pPr>
+              <w:pStyle w:val="Compact"/>
+              <w:keepNext/>
+              <w:spacing w:after="0"/>
+              <w:jc w:val="left"/>
+            </w:pPr>
+            <w:r>
+              <w:rPr>
+                <w:rFonts w:ascii="Times New Roman" w:hAnsi="Times New Roman"/>
+                <w:sz w:val="16"/>
+              </w:rPr>
+              <w:t xml:space="preserve">–</w:t>
+            </w:r>
+          </w:p>
+        </w:tc>
+        <w:tc>
+          <w:tcPr>
+            <w:tcMar>
+              <w:left w:w="40" w:type="dxa"/>
+              <w:right w:w="40" w:type="dxa"/>
+            </w:tcMar>
+          </w:tcPr>
+          <w:p>
+            <w:pPr>
+              <w:pStyle w:val="Compact"/>
+              <w:keepNext/>
+              <w:spacing w:after="0"/>
+              <w:jc w:val="left"/>
+            </w:pPr>
+            <w:r>
+              <w:rPr>
+                <w:rFonts w:ascii="Times New Roman" w:hAnsi="Times New Roman"/>
+                <w:sz w:val="16"/>
+              </w:rPr>
+              <w:t xml:space="preserve">12</w:t>
+            </w:r>
+          </w:p>
+        </w:tc>
+        <w:tc>
+          <w:tcPr>
+            <w:tcMar>
+              <w:left w:w="40" w:type="dxa"/>
+              <w:right w:w="40" w:type="dxa"/>
+            </w:tcMar>
+          </w:tcPr>
+          <w:p>
+            <w:pPr>
+              <w:pStyle w:val="Compact"/>
+              <w:keepNext/>
+              <w:spacing w:after="0"/>
+              <w:jc w:val="left"/>
+            </w:pPr>
+            <w:r>
+              <w:rPr>
+                <w:rFonts w:ascii="Times New Roman" w:hAnsi="Times New Roman"/>
+                <w:sz w:val="16"/>
+              </w:rPr>
+              <w:t xml:space="preserve">0.726 [0.715, 0.737]</w:t>
+            </w:r>
+          </w:p>
+        </w:tc>
+        <w:tc>
+          <w:tcPr>
+            <w:tcMar>
+              <w:left w:w="40" w:type="dxa"/>
+              <w:right w:w="40" w:type="dxa"/>
+            </w:tcMar>
+          </w:tcPr>
+          <w:p>
+            <w:pPr>
+              <w:pStyle w:val="Compact"/>
+              <w:keepNext/>
+              <w:spacing w:after="0"/>
+              <w:jc w:val="left"/>
+            </w:pPr>
+            <w:r>
+              <w:rPr>
+                <w:rFonts w:ascii="Times New Roman" w:hAnsi="Times New Roman"/>
+                <w:sz w:val="16"/>
+              </w:rPr>
+              <w:t xml:space="preserve">14.6</w:t>
+            </w:r>
+          </w:p>
+        </w:tc>
+        <w:tc>
+          <w:tcPr>
+            <w:tcMar>
+              <w:left w:w="40" w:type="dxa"/>
+              <w:right w:w="40" w:type="dxa"/>
+            </w:tcMar>
+          </w:tcPr>
+          <w:p>
+            <w:pPr>
+              <w:pStyle w:val="Compact"/>
+              <w:keepNext/>
+              <w:spacing w:after="0"/>
+              <w:jc w:val="left"/>
+            </w:pPr>
+            <w:r>
+              <w:rPr>
+                <w:rFonts w:ascii="Times New Roman" w:hAnsi="Times New Roman"/>
+                <w:sz w:val="16"/>
+              </w:rPr>
+              <w:t xml:space="preserve">0.724 / 0.727 / 0.686</w:t>
+            </w:r>
+          </w:p>
+        </w:tc>
+      </w:tr>
+      <w:tr>
+        <w:tc>
+          <w:tcPr>
+            <w:tcMar>
+              <w:left w:w="40" w:type="dxa"/>
+              <w:right w:w="40" w:type="dxa"/>
+            </w:tcMar>
+          </w:tcPr>
+          <w:p>
+            <w:pPr>
+              <w:pStyle w:val="Compact"/>
+              <w:keepNext/>
+              <w:spacing w:after="0"/>
+              <w:jc w:val="left"/>
+            </w:pPr>
+            <w:r>
+              <w:rPr>
+                <w:rFonts w:ascii="Times New Roman" w:hAnsi="Times New Roman"/>
+                <w:sz w:val="16"/>
+              </w:rPr>
+              <w:t xml:space="preserve">BM25,</w:t>
+            </w:r>
+            <w:r>
+              <w:rPr>
+                <w:rFonts w:ascii="Times New Roman" w:hAnsi="Times New Roman"/>
+                <w:sz w:val="16"/>
+              </w:rPr>
+              <w:t xml:space="preserve"> </w:t>
+            </w:r>
+            <w:r>
+              <w:rPr>
+                <w:iCs/>
+                <w:rFonts w:ascii="Times New Roman" w:hAnsi="Times New Roman"/>
+                <w:i/>
+                <w:sz w:val="16"/>
+              </w:rPr>
+              <w:t xml:space="preserve">k=24</w:t>
+            </w:r>
+          </w:p>
+        </w:tc>
+        <w:tc>
+          <w:tcPr>
+            <w:tcMar>
+              <w:left w:w="40" w:type="dxa"/>
+              <w:right w:w="40" w:type="dxa"/>
+            </w:tcMar>
+          </w:tcPr>
+          <w:p>
+            <w:pPr>
+              <w:pStyle w:val="Compact"/>
+              <w:keepNext/>
+              <w:spacing w:after="0"/>
+              <w:jc w:val="left"/>
+            </w:pPr>
+            <w:r>
+              <w:rPr>
+                <w:rFonts w:ascii="Times New Roman" w:hAnsi="Times New Roman"/>
+                <w:sz w:val="16"/>
+              </w:rPr>
+              <w:t xml:space="preserve">lexical</w:t>
+            </w:r>
+          </w:p>
+        </w:tc>
+        <w:tc>
+          <w:tcPr>
+            <w:tcMar>
+              <w:left w:w="40" w:type="dxa"/>
+              <w:right w:w="40" w:type="dxa"/>
+            </w:tcMar>
+          </w:tcPr>
+          <w:p>
+            <w:pPr>
+              <w:pStyle w:val="Compact"/>
+              <w:keepNext/>
+              <w:spacing w:after="0"/>
+              <w:jc w:val="left"/>
+            </w:pPr>
+            <w:r>
+              <w:rPr>
+                <w:rFonts w:ascii="Times New Roman" w:hAnsi="Times New Roman"/>
+                <w:sz w:val="16"/>
+              </w:rPr>
+              <w:t xml:space="preserve">no</w:t>
+            </w:r>
+          </w:p>
+        </w:tc>
+        <w:tc>
+          <w:tcPr>
+            <w:tcMar>
+              <w:left w:w="40" w:type="dxa"/>
+              <w:right w:w="40" w:type="dxa"/>
+            </w:tcMar>
+          </w:tcPr>
+          <w:p>
+            <w:pPr>
+              <w:pStyle w:val="Compact"/>
+              <w:keepNext/>
+              <w:spacing w:after="0"/>
+              <w:jc w:val="left"/>
+            </w:pPr>
+            <w:r>
+              <w:rPr>
+                <w:rFonts w:ascii="Times New Roman" w:hAnsi="Times New Roman"/>
+                <w:sz w:val="16"/>
+              </w:rPr>
+              <w:t xml:space="preserve">–</w:t>
+            </w:r>
+          </w:p>
+        </w:tc>
+        <w:tc>
+          <w:tcPr>
+            <w:tcMar>
+              <w:left w:w="40" w:type="dxa"/>
+              <w:right w:w="40" w:type="dxa"/>
+            </w:tcMar>
+          </w:tcPr>
+          <w:p>
+            <w:pPr>
+              <w:pStyle w:val="Compact"/>
+              <w:keepNext/>
+              <w:spacing w:after="0"/>
+              <w:jc w:val="left"/>
+            </w:pPr>
+            <w:r>
+              <w:rPr>
+                <w:rFonts w:ascii="Times New Roman" w:hAnsi="Times New Roman"/>
+                <w:sz w:val="16"/>
+              </w:rPr>
+              <w:t xml:space="preserve">24</w:t>
+            </w:r>
+          </w:p>
+        </w:tc>
+        <w:tc>
+          <w:tcPr>
+            <w:tcMar>
+              <w:left w:w="40" w:type="dxa"/>
+              <w:right w:w="40" w:type="dxa"/>
+            </w:tcMar>
+          </w:tcPr>
+          <w:p>
+            <w:pPr>
+              <w:pStyle w:val="Compact"/>
+              <w:keepNext/>
+              <w:spacing w:after="0"/>
+              <w:jc w:val="left"/>
+            </w:pPr>
+            <w:r>
+              <w:rPr>
+                <w:rFonts w:ascii="Times New Roman" w:hAnsi="Times New Roman"/>
+                <w:sz w:val="16"/>
+              </w:rPr>
+              <w:t xml:space="preserve">0.728 [0.718, 0.739]</w:t>
+            </w:r>
+          </w:p>
+        </w:tc>
+        <w:tc>
+          <w:tcPr>
+            <w:tcMar>
+              <w:left w:w="40" w:type="dxa"/>
+              <w:right w:w="40" w:type="dxa"/>
+            </w:tcMar>
+          </w:tcPr>
+          <w:p>
+            <w:pPr>
+              <w:pStyle w:val="Compact"/>
+              <w:keepNext/>
+              <w:spacing w:after="0"/>
+              <w:jc w:val="left"/>
+            </w:pPr>
+            <w:r>
+              <w:rPr>
+                <w:rFonts w:ascii="Times New Roman" w:hAnsi="Times New Roman"/>
+                <w:sz w:val="16"/>
+              </w:rPr>
+              <w:t xml:space="preserve">18.6</w:t>
+            </w:r>
+          </w:p>
+        </w:tc>
+        <w:tc>
+          <w:tcPr>
+            <w:tcMar>
+              <w:left w:w="40" w:type="dxa"/>
+              <w:right w:w="40" w:type="dxa"/>
+            </w:tcMar>
+          </w:tcPr>
+          <w:p>
+            <w:pPr>
+              <w:pStyle w:val="Compact"/>
+              <w:keepNext/>
+              <w:spacing w:after="0"/>
+              <w:jc w:val="left"/>
+            </w:pPr>
+            <w:r>
+              <w:rPr>
+                <w:rFonts w:ascii="Times New Roman" w:hAnsi="Times New Roman"/>
+                <w:sz w:val="16"/>
+              </w:rPr>
+              <w:t xml:space="preserve">0.724 / 0.732 / 0.688</w:t>
+            </w:r>
+          </w:p>
+        </w:tc>
+      </w:tr>
+      <w:tr>
+        <w:tc>
+          <w:tcPr>
+            <w:tcMar>
+              <w:left w:w="40" w:type="dxa"/>
+              <w:right w:w="40" w:type="dxa"/>
+            </w:tcMar>
+          </w:tcPr>
+          <w:p>
+            <w:pPr>
+              <w:pStyle w:val="Compact"/>
+              <w:keepNext/>
+              <w:spacing w:after="0"/>
+              <w:jc w:val="left"/>
+            </w:pPr>
+            <w:r>
+              <w:rPr>
+                <w:rFonts w:ascii="Times New Roman" w:hAnsi="Times New Roman"/>
+                <w:sz w:val="16"/>
+              </w:rPr>
+              <w:t xml:space="preserve">fusion (RRF),</w:t>
+            </w:r>
+            <w:r>
+              <w:rPr>
+                <w:rFonts w:ascii="Times New Roman" w:hAnsi="Times New Roman"/>
+                <w:sz w:val="16"/>
+              </w:rPr>
+              <w:t xml:space="preserve"> </w:t>
+            </w:r>
+            <w:r>
+              <w:rPr>
+                <w:iCs/>
+                <w:rFonts w:ascii="Times New Roman" w:hAnsi="Times New Roman"/>
+                <w:i/>
+                <w:sz w:val="16"/>
+              </w:rPr>
+              <w:t xml:space="preserve">k=24</w:t>
+            </w:r>
+          </w:p>
+        </w:tc>
+        <w:tc>
+          <w:tcPr>
+            <w:tcMar>
+              <w:left w:w="40" w:type="dxa"/>
+              <w:right w:w="40" w:type="dxa"/>
+            </w:tcMar>
+          </w:tcPr>
+          <w:p>
+            <w:pPr>
+              <w:pStyle w:val="Compact"/>
+              <w:keepNext/>
+              <w:spacing w:after="0"/>
+              <w:jc w:val="left"/>
+            </w:pPr>
+            <w:r>
+              <w:rPr>
+                <w:rFonts w:ascii="Times New Roman" w:hAnsi="Times New Roman"/>
+                <w:sz w:val="16"/>
+              </w:rPr>
+              <w:t xml:space="preserve">fused</w:t>
+            </w:r>
+          </w:p>
+        </w:tc>
+        <w:tc>
+          <w:tcPr>
+            <w:tcMar>
+              <w:left w:w="40" w:type="dxa"/>
+              <w:right w:w="40" w:type="dxa"/>
+            </w:tcMar>
+          </w:tcPr>
+          <w:p>
+            <w:pPr>
+              <w:pStyle w:val="Compact"/>
+              <w:keepNext/>
+              <w:spacing w:after="0"/>
+              <w:jc w:val="left"/>
+            </w:pPr>
+            <w:r>
+              <w:rPr>
+                <w:rFonts w:ascii="Times New Roman" w:hAnsi="Times New Roman"/>
+                <w:sz w:val="16"/>
+              </w:rPr>
+              <w:t xml:space="preserve">no</w:t>
+            </w:r>
+          </w:p>
+        </w:tc>
+        <w:tc>
+          <w:tcPr>
+            <w:tcMar>
+              <w:left w:w="40" w:type="dxa"/>
+              <w:right w:w="40" w:type="dxa"/>
+            </w:tcMar>
+          </w:tcPr>
+          <w:p>
+            <w:pPr>
+              <w:pStyle w:val="Compact"/>
+              <w:keepNext/>
+              <w:spacing w:after="0"/>
+              <w:jc w:val="left"/>
+            </w:pPr>
+            <w:r>
+              <w:rPr>
+                <w:rFonts w:ascii="Times New Roman" w:hAnsi="Times New Roman"/>
+                <w:sz w:val="16"/>
+              </w:rPr>
+              <w:t xml:space="preserve">–</w:t>
+            </w:r>
+          </w:p>
+        </w:tc>
+        <w:tc>
+          <w:tcPr>
+            <w:tcMar>
+              <w:left w:w="40" w:type="dxa"/>
+              <w:right w:w="40" w:type="dxa"/>
+            </w:tcMar>
+          </w:tcPr>
+          <w:p>
+            <w:pPr>
+              <w:pStyle w:val="Compact"/>
+              <w:keepNext/>
+              <w:spacing w:after="0"/>
+              <w:jc w:val="left"/>
+            </w:pPr>
+            <w:r>
+              <w:rPr>
+                <w:rFonts w:ascii="Times New Roman" w:hAnsi="Times New Roman"/>
+                <w:sz w:val="16"/>
+              </w:rPr>
+              <w:t xml:space="preserve">24</w:t>
+            </w:r>
+          </w:p>
+        </w:tc>
+        <w:tc>
+          <w:tcPr>
+            <w:tcMar>
+              <w:left w:w="40" w:type="dxa"/>
+              <w:right w:w="40" w:type="dxa"/>
+            </w:tcMar>
+          </w:tcPr>
+          <w:p>
+            <w:pPr>
+              <w:pStyle w:val="Compact"/>
+              <w:keepNext/>
+              <w:spacing w:after="0"/>
+              <w:jc w:val="left"/>
+            </w:pPr>
+            <w:r>
+              <w:rPr>
+                <w:rFonts w:ascii="Times New Roman" w:hAnsi="Times New Roman"/>
+                <w:sz w:val="16"/>
+              </w:rPr>
+              <w:t xml:space="preserve">0.843 [0.832, 0.856]</w:t>
+            </w:r>
+          </w:p>
+        </w:tc>
+        <w:tc>
+          <w:tcPr>
+            <w:tcMar>
+              <w:left w:w="40" w:type="dxa"/>
+              <w:right w:w="40" w:type="dxa"/>
+            </w:tcMar>
+          </w:tcPr>
+          <w:p>
+            <w:pPr>
+              <w:pStyle w:val="Compact"/>
+              <w:keepNext/>
+              <w:spacing w:after="0"/>
+              <w:jc w:val="left"/>
+            </w:pPr>
+            <w:r>
+              <w:rPr>
+                <w:rFonts w:ascii="Times New Roman" w:hAnsi="Times New Roman"/>
+                <w:sz w:val="16"/>
+              </w:rPr>
+              <w:t xml:space="preserve">31.5</w:t>
+            </w:r>
+          </w:p>
+        </w:tc>
+        <w:tc>
+          <w:tcPr>
+            <w:tcMar>
+              <w:left w:w="40" w:type="dxa"/>
+              <w:right w:w="40" w:type="dxa"/>
+            </w:tcMar>
+          </w:tcPr>
+          <w:p>
+            <w:pPr>
+              <w:pStyle w:val="Compact"/>
+              <w:keepNext/>
+              <w:spacing w:after="0"/>
+              <w:jc w:val="left"/>
+            </w:pPr>
+            <w:r>
+              <w:rPr>
+                <w:rFonts w:ascii="Times New Roman" w:hAnsi="Times New Roman"/>
+                <w:sz w:val="16"/>
+              </w:rPr>
+              <w:t xml:space="preserve">0.899 / 0.788 / 0.816</w:t>
+            </w:r>
+          </w:p>
+        </w:tc>
+      </w:tr>
+      <w:tr>
+        <w:tc>
+          <w:tcPr>
+            <w:tcMar>
+              <w:left w:w="40" w:type="dxa"/>
+              <w:right w:w="40" w:type="dxa"/>
+            </w:tcMar>
+          </w:tcPr>
+          <w:p>
+            <w:pPr>
+              <w:pStyle w:val="Compact"/>
+              <w:spacing w:after="0"/>
+              <w:jc w:val="left"/>
+            </w:pPr>
+            <w:r>
+              <w:rPr>
+                <w:rFonts w:ascii="Times New Roman" w:hAnsi="Times New Roman"/>
+                <w:sz w:val="16"/>
+              </w:rPr>
+              <w:t xml:space="preserve">per sentence + fusion,</w:t>
+            </w:r>
+            <w:r>
+              <w:rPr>
+                <w:rFonts w:ascii="Times New Roman" w:hAnsi="Times New Roman"/>
+                <w:sz w:val="16"/>
+              </w:rPr>
+              <w:t xml:space="preserve"> </w:t>
+            </w:r>
+            <w:r>
+              <w:rPr>
+                <w:iCs/>
+                <w:rFonts w:ascii="Times New Roman" w:hAnsi="Times New Roman"/>
+                <w:i/>
+                <w:sz w:val="16"/>
+              </w:rPr>
+              <w:t xml:space="preserve">k=24</w:t>
+            </w:r>
+          </w:p>
+        </w:tc>
+        <w:tc>
+          <w:tcPr>
+            <w:tcMar>
+              <w:left w:w="40" w:type="dxa"/>
+              <w:right w:w="40" w:type="dxa"/>
+            </w:tcMar>
+          </w:tcPr>
+          <w:p>
+            <w:pPr>
+              <w:pStyle w:val="Compact"/>
+              <w:spacing w:after="0"/>
+              <w:jc w:val="left"/>
+            </w:pPr>
+            <w:r>
+              <w:rPr>
+                <w:rFonts w:ascii="Times New Roman" w:hAnsi="Times New Roman"/>
+                <w:sz w:val="16"/>
+              </w:rPr>
+              <w:t xml:space="preserve">fused</w:t>
+            </w:r>
+          </w:p>
+        </w:tc>
+        <w:tc>
+          <w:tcPr>
+            <w:tcMar>
+              <w:left w:w="40" w:type="dxa"/>
+              <w:right w:w="40" w:type="dxa"/>
+            </w:tcMar>
+          </w:tcPr>
+          <w:p>
+            <w:pPr>
+              <w:pStyle w:val="Compact"/>
+              <w:spacing w:after="0"/>
+              <w:jc w:val="left"/>
+            </w:pPr>
+            <w:r>
+              <w:rPr>
+                <w:rFonts w:ascii="Times New Roman" w:hAnsi="Times New Roman"/>
+                <w:sz w:val="16"/>
+              </w:rPr>
+              <w:t xml:space="preserve">yes</w:t>
+            </w:r>
+          </w:p>
+        </w:tc>
+        <w:tc>
+          <w:tcPr>
+            <w:tcMar>
+              <w:left w:w="40" w:type="dxa"/>
+              <w:right w:w="40" w:type="dxa"/>
+            </w:tcMar>
+          </w:tcPr>
+          <w:p>
+            <w:pPr>
+              <w:pStyle w:val="Compact"/>
+              <w:spacing w:after="0"/>
+              <w:jc w:val="left"/>
+            </w:pPr>
+            <w:r>
+              <w:rPr>
+                <w:rFonts w:ascii="Times New Roman" w:hAnsi="Times New Roman"/>
+                <w:sz w:val="16"/>
+              </w:rPr>
+              <w:t xml:space="preserve">–</w:t>
+            </w:r>
+          </w:p>
+        </w:tc>
+        <w:tc>
+          <w:tcPr>
+            <w:tcMar>
+              <w:left w:w="40" w:type="dxa"/>
+              <w:right w:w="40" w:type="dxa"/>
+            </w:tcMar>
+          </w:tcPr>
+          <w:p>
+            <w:pPr>
+              <w:pStyle w:val="Compact"/>
+              <w:spacing w:after="0"/>
+              <w:jc w:val="left"/>
+            </w:pPr>
+            <w:r>
+              <w:rPr>
+                <w:rFonts w:ascii="Times New Roman" w:hAnsi="Times New Roman"/>
+                <w:sz w:val="16"/>
+              </w:rPr>
+              <w:t xml:space="preserve">24</w:t>
+            </w:r>
+          </w:p>
+        </w:tc>
+        <w:tc>
+          <w:tcPr>
+            <w:tcMar>
+              <w:left w:w="40" w:type="dxa"/>
+              <w:right w:w="40" w:type="dxa"/>
+            </w:tcMar>
+          </w:tcPr>
+          <w:p>
+            <w:pPr>
+              <w:pStyle w:val="Compact"/>
+              <w:spacing w:after="0"/>
+              <w:jc w:val="left"/>
+            </w:pPr>
+            <w:r>
+              <w:rPr>
+                <w:rFonts w:ascii="Times New Roman" w:hAnsi="Times New Roman"/>
+                <w:sz w:val="16"/>
+              </w:rPr>
+              <w:t xml:space="preserve">0.861 [0.848, 0.874]</w:t>
+            </w:r>
+          </w:p>
+        </w:tc>
+        <w:tc>
+          <w:tcPr>
+            <w:tcMar>
+              <w:left w:w="40" w:type="dxa"/>
+              <w:right w:w="40" w:type="dxa"/>
+            </w:tcMar>
+          </w:tcPr>
+          <w:p>
+            <w:pPr>
+              <w:pStyle w:val="Compact"/>
+              <w:spacing w:after="0"/>
+              <w:jc w:val="left"/>
+            </w:pPr>
+            <w:r>
+              <w:rPr>
+                <w:rFonts w:ascii="Times New Roman" w:hAnsi="Times New Roman"/>
+                <w:sz w:val="16"/>
+              </w:rPr>
+              <w:t xml:space="preserve">31.5</w:t>
+            </w:r>
+          </w:p>
+        </w:tc>
+        <w:tc>
+          <w:tcPr>
+            <w:tcMar>
+              <w:left w:w="40" w:type="dxa"/>
+              <w:right w:w="40" w:type="dxa"/>
+            </w:tcMar>
+          </w:tcPr>
+          <w:p>
+            <w:pPr>
+              <w:pStyle w:val="Compact"/>
+              <w:spacing w:after="0"/>
+              <w:jc w:val="left"/>
+            </w:pPr>
+            <w:r>
+              <w:rPr>
+                <w:rFonts w:ascii="Times New Roman" w:hAnsi="Times New Roman"/>
+                <w:sz w:val="16"/>
+              </w:rPr>
+              <w:t xml:space="preserve">0.899 / 0.823 / 0.835</w:t>
             </w:r>
           </w:p>
         </w:tc>
@@ -27148,13 +28343,13 @@
           <w:bCs/>
           <w:b/>
         </w:rPr>
-        <w:t xml:space="preserve">What no variant fixes.</w:t>
-      </w:r>
-      <w:r>
-        <w:t xml:space="preserve"> </w:t>
-      </w:r>
-      <w:r>
-        <w:t xml:space="preserve">At</w:t>
+        <w:t xml:space="preserve">Keyword and fused rankings.</w:t>
+      </w:r>
+      <w:r>
+        <w:t xml:space="preserve"> </w:t>
+      </w:r>
+      <w:r>
+        <w:t xml:space="preserve">BM25 on its own reaches 0.726 with up to 12 matches, more than the default (+0.059, Holm</w:t>
       </w:r>
       <w:r>
         <w:t xml:space="preserve"> </w:t>
@@ -27164,10 +28359,67 @@
           <w:iCs/>
           <w:i/>
         </w:rPr>
+        <w:t xml:space="preserve">p&lt;0.001</w:t>
+      </w:r>
+      <w:r>
+        <w:t xml:space="preserve">), because it has no minimum score; with up to 24 matches it reaches 0.728, since often fewer than 24 memories share a word with the message (18.6 candidates on average), and it stays well below the same-size embedding list (-0.121). Fusing BM25 with AURA’s ranking reaches 0.843, the same as the plain embedding list (-0.006, Holm</w:t>
+      </w:r>
+      <w:r>
+        <w:t xml:space="preserve"> </w:t>
+      </w:r>
+      <w:r>
+        <w:rPr>
+          <w:iCs/>
+          <w:i/>
+        </w:rPr>
+        <w:t xml:space="preserve">p=0.377</w:t>
+      </w:r>
+      <w:r>
+        <w:t xml:space="preserve">), and per-sentence fusion 0.861 (-0.009 against per-sentence embedding search, Holm</w:t>
+      </w:r>
+      <w:r>
+        <w:t xml:space="preserve"> </w:t>
+      </w:r>
+      <w:r>
+        <w:rPr>
+          <w:iCs/>
+          <w:i/>
+        </w:rPr>
+        <w:t xml:space="preserve">p=0.220</w:t>
+      </w:r>
+      <w:r>
+        <w:t xml:space="preserve">). On this test set, adding keyword evidence does not improve on a larger embedding list. A first BM25 run that kept memories with zero score ranked them in insertion order, which placed the persona’s own (oldest) facts first and inflated BM25 strongly; we report only the corrected run and mention this because the artefact is easy to reproduce by accident.</w:t>
+      </w:r>
+    </w:p>
+    <w:p>
+      <w:pPr>
+        <w:pStyle w:val="BodyText"/>
+      </w:pPr>
+      <w:r>
+        <w:rPr>
+          <w:bCs/>
+          <w:b/>
+        </w:rPr>
+        <w:t xml:space="preserve">What no variant fixes.</w:t>
+      </w:r>
+      <w:r>
+        <w:t xml:space="preserve"> </w:t>
+      </w:r>
+      <w:r>
+        <w:t xml:space="preserve">At</w:t>
+      </w:r>
+      <w:r>
+        <w:t xml:space="preserve"> </w:t>
+      </w:r>
+      <w:r>
+        <w:rPr>
+          <w:iCs/>
+          <w:i/>
+        </w:rPr>
         <w:t xml:space="preserve">N=350</w:t>
       </w:r>
       <w:r>
-        <w:t xml:space="preserve">, 11.5% of change events are reached by none of the eleven conditions, and only 0.849 of targets are among the 24 best matches for the whole message even without a minimum score. These are messages that name the new value but share little with the stored sentence, for example a car model mentioned without the word</w:t>
+        <w:t xml:space="preserve">, 10.0% of change events are reached by none of the 15 conditions, and only 0.849 of targets are among the 24 best matches for the whole message even without a minimum score. These are messages that name the new value but share little with the stored sentence, for example a car model mentioned without the word</w:t>
       </w:r>
       <w:r>
         <w:t xml:space="preserve"> </w:t>
@@ -41109,7 +42361,7 @@
         <w:t xml:space="preserve"> </w:t>
       </w:r>
       <w:r>
-        <w:t xml:space="preserve">F2 enlarges the prompt by about a third, and in the selection study a plain list of the same size reached as many targets. About one target in nine at</w:t>
+        <w:t xml:space="preserve">F2 enlarges the prompt by about a third, and in the selection study a plain list of the same size reached as many targets. Keyword and fused rankings did no better, and about one target in ten at</w:t>
       </w:r>
       <w:r>
         <w:t xml:space="preserve"> </w:t>
@@ -41387,7 +42639,7 @@
         <w:t xml:space="preserve"> </w:t>
       </w:r>
       <w:r>
-        <w:t xml:space="preserve">About one target in nine is out of reach of every similarity-based list we tried; lexical (BM25) and reranking baselines, slot-typed memories and a second pass over the store are the next candidates.</w:t>
+        <w:t xml:space="preserve">About one target in ten is out of reach of every list we tried, including keyword and fused rankings; a cross-encoder reranker (a script is provided with the harness), slot-typed memories and a second pass over the store are the next candidates.</w:t>
       </w:r>
       <w:r>
         <w:t xml:space="preserve"> </w:t>
@@ -41453,7 +42705,7 @@
         <w:pStyle w:val="FirstParagraph"/>
       </w:pPr>
       <w:r>
-        <w:t xml:space="preserve">A review gate on memory changes is effective against the errors it can see: in our experiments it removes almost all of the true facts that automatic application destroys. It cannot repair updates the extractor never proposes, and in a retrieval-based design these are governed by which memories reach the extractor’s prompt. We made this precise (an update can succeed only if its target is in the prompt, and the gate acts only after that), measured it, and identified what moves it: removing the minimum score and searching per sentence each raise reachability by about ten points, extra candidates on a change cue add little on their own, and an adaptive selection is matched by a plain larger list, which it beats only in prompt size. With two real Gemini extractors the adaptive selection removed all observed missing targets and the stale facts under the gate at about a third more prompt tokens, while about one target in nine remains out of reach of every list we tried. The practical lesson for user-controlled memories is to measure and report what the extractor can reach, and to compare any remedy against a plain larger list. Evaluating with real users, with an oracle-target condition, in other languages and with larger real samples is the next step; the code, both test-set generators and every raw result file are provided.</w:t>
+        <w:t xml:space="preserve">A review gate on memory changes is effective against the errors it can see: in our experiments it removes almost all of the true facts that automatic application destroys. It cannot repair updates the extractor never proposes, and in a retrieval-based design these are governed by which memories reach the extractor’s prompt. We made this precise (an update can succeed only if its target is in the prompt, and the gate acts only after that), measured it, and identified what moves it: removing the minimum score and searching per sentence each raise reachability by about ten points, extra candidates on a change cue add little on their own, and an adaptive selection is matched by a plain larger list, which it beats only in prompt size. With two real Gemini extractors, the adaptive selection (run together with the re-proposal rule) left no change target missing and no stale fact under the gate, at about a third more prompt tokens, while about one target in ten remains out of reach of every list we tried, keyword and fused rankings included. The practical lesson for user-controlled memories is to measure and report what the extractor can reach, and to compare any remedy against a plain larger list. Evaluating with real users, with an oracle-target condition, in other languages and with larger real samples is the next step; the code, both test-set generators and every raw result file are provided.</w:t>
       </w:r>
     </w:p>
     <w:bookmarkEnd w:id="80"/>
@@ -58604,145 +59856,161 @@
                 <w:rFonts w:ascii="Times New Roman" w:hAnsi="Times New Roman"/>
                 <w:sz w:val="12"/>
               </w:rPr>
-              <w:t xml:space="preserve">target in top 12, no floor</w:t>
-            </w:r>
-          </w:p>
-        </w:tc>
-        <w:tc>
-          <w:tcPr>
-            <w:tcMar>
-              <w:left w:w="40" w:type="dxa"/>
-              <w:right w:w="40" w:type="dxa"/>
-            </w:tcMar>
-          </w:tcPr>
-          <w:p>
-            <w:pPr>
-              <w:pStyle w:val="Compact"/>
-              <w:keepNext/>
-              <w:spacing w:after="0"/>
-              <w:jc w:val="left"/>
-            </w:pPr>
-            <w:r>
-              <w:rPr>
-                <w:rFonts w:ascii="Times New Roman" w:hAnsi="Times New Roman"/>
-                <w:sz w:val="12"/>
-              </w:rPr>
-              <w:t xml:space="preserve">1.000</w:t>
-            </w:r>
-          </w:p>
-        </w:tc>
-        <w:tc>
-          <w:tcPr>
-            <w:tcMar>
-              <w:left w:w="40" w:type="dxa"/>
-              <w:right w:w="40" w:type="dxa"/>
-            </w:tcMar>
-          </w:tcPr>
-          <w:p>
-            <w:pPr>
-              <w:pStyle w:val="Compact"/>
-              <w:keepNext/>
-              <w:spacing w:after="0"/>
-              <w:jc w:val="left"/>
-            </w:pPr>
-            <w:r>
-              <w:rPr>
-                <w:rFonts w:ascii="Times New Roman" w:hAnsi="Times New Roman"/>
-                <w:sz w:val="12"/>
-              </w:rPr>
-              <w:t xml:space="preserve">0.959</w:t>
-            </w:r>
-          </w:p>
-        </w:tc>
-        <w:tc>
-          <w:tcPr>
-            <w:tcMar>
-              <w:left w:w="40" w:type="dxa"/>
-              <w:right w:w="40" w:type="dxa"/>
-            </w:tcMar>
-          </w:tcPr>
-          <w:p>
-            <w:pPr>
-              <w:pStyle w:val="Compact"/>
-              <w:keepNext/>
-              <w:spacing w:after="0"/>
-              <w:jc w:val="left"/>
-            </w:pPr>
-            <w:r>
-              <w:rPr>
-                <w:rFonts w:ascii="Times New Roman" w:hAnsi="Times New Roman"/>
-                <w:sz w:val="12"/>
-              </w:rPr>
-              <w:t xml:space="preserve">0.925</w:t>
-            </w:r>
-          </w:p>
-        </w:tc>
-        <w:tc>
-          <w:tcPr>
-            <w:tcMar>
-              <w:left w:w="40" w:type="dxa"/>
-              <w:right w:w="40" w:type="dxa"/>
-            </w:tcMar>
-          </w:tcPr>
-          <w:p>
-            <w:pPr>
-              <w:pStyle w:val="Compact"/>
-              <w:keepNext/>
-              <w:spacing w:after="0"/>
-              <w:jc w:val="left"/>
-            </w:pPr>
-            <w:r>
-              <w:rPr>
-                <w:rFonts w:ascii="Times New Roman" w:hAnsi="Times New Roman"/>
-                <w:sz w:val="12"/>
-              </w:rPr>
-              <w:t xml:space="preserve">0.883</w:t>
-            </w:r>
-          </w:p>
-        </w:tc>
-        <w:tc>
-          <w:tcPr>
-            <w:tcMar>
-              <w:left w:w="40" w:type="dxa"/>
-              <w:right w:w="40" w:type="dxa"/>
-            </w:tcMar>
-          </w:tcPr>
-          <w:p>
-            <w:pPr>
-              <w:pStyle w:val="Compact"/>
-              <w:keepNext/>
-              <w:spacing w:after="0"/>
-              <w:jc w:val="left"/>
-            </w:pPr>
-            <w:r>
-              <w:rPr>
-                <w:rFonts w:ascii="Times New Roman" w:hAnsi="Times New Roman"/>
-                <w:sz w:val="12"/>
-              </w:rPr>
-              <w:t xml:space="preserve">0.830</w:t>
-            </w:r>
-          </w:p>
-        </w:tc>
-        <w:tc>
-          <w:tcPr>
-            <w:tcMar>
-              <w:left w:w="40" w:type="dxa"/>
-              <w:right w:w="40" w:type="dxa"/>
-            </w:tcMar>
-          </w:tcPr>
-          <w:p>
-            <w:pPr>
-              <w:pStyle w:val="Compact"/>
-              <w:keepNext/>
-              <w:spacing w:after="0"/>
-              <w:jc w:val="left"/>
-            </w:pPr>
-            <w:r>
-              <w:rPr>
-                <w:rFonts w:ascii="Times New Roman" w:hAnsi="Times New Roman"/>
-                <w:sz w:val="12"/>
-              </w:rPr>
-              <w:t xml:space="preserve">0.777</w:t>
+              <w:t xml:space="preserve">BM25,</w:t>
+            </w:r>
+            <w:r>
+              <w:rPr>
+                <w:rFonts w:ascii="Times New Roman" w:hAnsi="Times New Roman"/>
+                <w:sz w:val="12"/>
+              </w:rPr>
+              <w:t xml:space="preserve"> </w:t>
+            </w:r>
+            <w:r>
+              <w:rPr>
+                <w:iCs/>
+                <w:rFonts w:ascii="Times New Roman" w:hAnsi="Times New Roman"/>
+                <w:i/>
+                <w:sz w:val="12"/>
+              </w:rPr>
+              <w:t xml:space="preserve">k=12</w:t>
+            </w:r>
+          </w:p>
+        </w:tc>
+        <w:tc>
+          <w:tcPr>
+            <w:tcMar>
+              <w:left w:w="40" w:type="dxa"/>
+              <w:right w:w="40" w:type="dxa"/>
+            </w:tcMar>
+          </w:tcPr>
+          <w:p>
+            <w:pPr>
+              <w:pStyle w:val="Compact"/>
+              <w:keepNext/>
+              <w:spacing w:after="0"/>
+              <w:jc w:val="left"/>
+            </w:pPr>
+            <w:r>
+              <w:rPr>
+                <w:rFonts w:ascii="Times New Roman" w:hAnsi="Times New Roman"/>
+                <w:sz w:val="12"/>
+              </w:rPr>
+              <w:t xml:space="preserve">0.907</w:t>
+            </w:r>
+          </w:p>
+        </w:tc>
+        <w:tc>
+          <w:tcPr>
+            <w:tcMar>
+              <w:left w:w="40" w:type="dxa"/>
+              <w:right w:w="40" w:type="dxa"/>
+            </w:tcMar>
+          </w:tcPr>
+          <w:p>
+            <w:pPr>
+              <w:pStyle w:val="Compact"/>
+              <w:keepNext/>
+              <w:spacing w:after="0"/>
+              <w:jc w:val="left"/>
+            </w:pPr>
+            <w:r>
+              <w:rPr>
+                <w:rFonts w:ascii="Times New Roman" w:hAnsi="Times New Roman"/>
+                <w:sz w:val="12"/>
+              </w:rPr>
+              <w:t xml:space="preserve">0.728</w:t>
+            </w:r>
+          </w:p>
+        </w:tc>
+        <w:tc>
+          <w:tcPr>
+            <w:tcMar>
+              <w:left w:w="40" w:type="dxa"/>
+              <w:right w:w="40" w:type="dxa"/>
+            </w:tcMar>
+          </w:tcPr>
+          <w:p>
+            <w:pPr>
+              <w:pStyle w:val="Compact"/>
+              <w:keepNext/>
+              <w:spacing w:after="0"/>
+              <w:jc w:val="left"/>
+            </w:pPr>
+            <w:r>
+              <w:rPr>
+                <w:rFonts w:ascii="Times New Roman" w:hAnsi="Times New Roman"/>
+                <w:sz w:val="12"/>
+              </w:rPr>
+              <w:t xml:space="preserve">0.728</w:t>
+            </w:r>
+          </w:p>
+        </w:tc>
+        <w:tc>
+          <w:tcPr>
+            <w:tcMar>
+              <w:left w:w="40" w:type="dxa"/>
+              <w:right w:w="40" w:type="dxa"/>
+            </w:tcMar>
+          </w:tcPr>
+          <w:p>
+            <w:pPr>
+              <w:pStyle w:val="Compact"/>
+              <w:keepNext/>
+              <w:spacing w:after="0"/>
+              <w:jc w:val="left"/>
+            </w:pPr>
+            <w:r>
+              <w:rPr>
+                <w:rFonts w:ascii="Times New Roman" w:hAnsi="Times New Roman"/>
+                <w:sz w:val="12"/>
+              </w:rPr>
+              <w:t xml:space="preserve">0.728</w:t>
+            </w:r>
+          </w:p>
+        </w:tc>
+        <w:tc>
+          <w:tcPr>
+            <w:tcMar>
+              <w:left w:w="40" w:type="dxa"/>
+              <w:right w:w="40" w:type="dxa"/>
+            </w:tcMar>
+          </w:tcPr>
+          <w:p>
+            <w:pPr>
+              <w:pStyle w:val="Compact"/>
+              <w:keepNext/>
+              <w:spacing w:after="0"/>
+              <w:jc w:val="left"/>
+            </w:pPr>
+            <w:r>
+              <w:rPr>
+                <w:rFonts w:ascii="Times New Roman" w:hAnsi="Times New Roman"/>
+                <w:sz w:val="12"/>
+              </w:rPr>
+              <w:t xml:space="preserve">0.728</w:t>
+            </w:r>
+          </w:p>
+        </w:tc>
+        <w:tc>
+          <w:tcPr>
+            <w:tcMar>
+              <w:left w:w="40" w:type="dxa"/>
+              <w:right w:w="40" w:type="dxa"/>
+            </w:tcMar>
+          </w:tcPr>
+          <w:p>
+            <w:pPr>
+              <w:pStyle w:val="Compact"/>
+              <w:keepNext/>
+              <w:spacing w:after="0"/>
+              <w:jc w:val="left"/>
+            </w:pPr>
+            <w:r>
+              <w:rPr>
+                <w:rFonts w:ascii="Times New Roman" w:hAnsi="Times New Roman"/>
+                <w:sz w:val="12"/>
+              </w:rPr>
+              <w:t xml:space="preserve">0.726</w:t>
             </w:r>
           </w:p>
         </w:tc>
@@ -58767,145 +60035,161 @@
                 <w:rFonts w:ascii="Times New Roman" w:hAnsi="Times New Roman"/>
                 <w:sz w:val="12"/>
               </w:rPr>
-              <w:t xml:space="preserve">target in top 24, no floor</w:t>
-            </w:r>
-          </w:p>
-        </w:tc>
-        <w:tc>
-          <w:tcPr>
-            <w:tcMar>
-              <w:left w:w="40" w:type="dxa"/>
-              <w:right w:w="40" w:type="dxa"/>
-            </w:tcMar>
-          </w:tcPr>
-          <w:p>
-            <w:pPr>
-              <w:pStyle w:val="Compact"/>
-              <w:keepNext/>
-              <w:spacing w:after="0"/>
-              <w:jc w:val="left"/>
-            </w:pPr>
-            <w:r>
-              <w:rPr>
-                <w:rFonts w:ascii="Times New Roman" w:hAnsi="Times New Roman"/>
-                <w:sz w:val="12"/>
-              </w:rPr>
-              <w:t xml:space="preserve">1.000</w:t>
-            </w:r>
-          </w:p>
-        </w:tc>
-        <w:tc>
-          <w:tcPr>
-            <w:tcMar>
-              <w:left w:w="40" w:type="dxa"/>
-              <w:right w:w="40" w:type="dxa"/>
-            </w:tcMar>
-          </w:tcPr>
-          <w:p>
-            <w:pPr>
-              <w:pStyle w:val="Compact"/>
-              <w:keepNext/>
-              <w:spacing w:after="0"/>
-              <w:jc w:val="left"/>
-            </w:pPr>
-            <w:r>
-              <w:rPr>
-                <w:rFonts w:ascii="Times New Roman" w:hAnsi="Times New Roman"/>
-                <w:sz w:val="12"/>
-              </w:rPr>
-              <w:t xml:space="preserve">0.991</w:t>
-            </w:r>
-          </w:p>
-        </w:tc>
-        <w:tc>
-          <w:tcPr>
-            <w:tcMar>
-              <w:left w:w="40" w:type="dxa"/>
-              <w:right w:w="40" w:type="dxa"/>
-            </w:tcMar>
-          </w:tcPr>
-          <w:p>
-            <w:pPr>
-              <w:pStyle w:val="Compact"/>
-              <w:keepNext/>
-              <w:spacing w:after="0"/>
-              <w:jc w:val="left"/>
-            </w:pPr>
-            <w:r>
-              <w:rPr>
-                <w:rFonts w:ascii="Times New Roman" w:hAnsi="Times New Roman"/>
-                <w:sz w:val="12"/>
-              </w:rPr>
-              <w:t xml:space="preserve">0.969</w:t>
-            </w:r>
-          </w:p>
-        </w:tc>
-        <w:tc>
-          <w:tcPr>
-            <w:tcMar>
-              <w:left w:w="40" w:type="dxa"/>
-              <w:right w:w="40" w:type="dxa"/>
-            </w:tcMar>
-          </w:tcPr>
-          <w:p>
-            <w:pPr>
-              <w:pStyle w:val="Compact"/>
-              <w:keepNext/>
-              <w:spacing w:after="0"/>
-              <w:jc w:val="left"/>
-            </w:pPr>
-            <w:r>
-              <w:rPr>
-                <w:rFonts w:ascii="Times New Roman" w:hAnsi="Times New Roman"/>
-                <w:sz w:val="12"/>
-              </w:rPr>
-              <w:t xml:space="preserve">0.934</w:t>
-            </w:r>
-          </w:p>
-        </w:tc>
-        <w:tc>
-          <w:tcPr>
-            <w:tcMar>
-              <w:left w:w="40" w:type="dxa"/>
-              <w:right w:w="40" w:type="dxa"/>
-            </w:tcMar>
-          </w:tcPr>
-          <w:p>
-            <w:pPr>
-              <w:pStyle w:val="Compact"/>
-              <w:keepNext/>
-              <w:spacing w:after="0"/>
-              <w:jc w:val="left"/>
-            </w:pPr>
-            <w:r>
-              <w:rPr>
-                <w:rFonts w:ascii="Times New Roman" w:hAnsi="Times New Roman"/>
-                <w:sz w:val="12"/>
-              </w:rPr>
-              <w:t xml:space="preserve">0.888</w:t>
-            </w:r>
-          </w:p>
-        </w:tc>
-        <w:tc>
-          <w:tcPr>
-            <w:tcMar>
-              <w:left w:w="40" w:type="dxa"/>
-              <w:right w:w="40" w:type="dxa"/>
-            </w:tcMar>
-          </w:tcPr>
-          <w:p>
-            <w:pPr>
-              <w:pStyle w:val="Compact"/>
-              <w:keepNext/>
-              <w:spacing w:after="0"/>
-              <w:jc w:val="left"/>
-            </w:pPr>
-            <w:r>
-              <w:rPr>
-                <w:rFonts w:ascii="Times New Roman" w:hAnsi="Times New Roman"/>
-                <w:sz w:val="12"/>
-              </w:rPr>
-              <w:t xml:space="preserve">0.849</w:t>
+              <w:t xml:space="preserve">BM25,</w:t>
+            </w:r>
+            <w:r>
+              <w:rPr>
+                <w:rFonts w:ascii="Times New Roman" w:hAnsi="Times New Roman"/>
+                <w:sz w:val="12"/>
+              </w:rPr>
+              <w:t xml:space="preserve"> </w:t>
+            </w:r>
+            <w:r>
+              <w:rPr>
+                <w:iCs/>
+                <w:rFonts w:ascii="Times New Roman" w:hAnsi="Times New Roman"/>
+                <w:i/>
+                <w:sz w:val="12"/>
+              </w:rPr>
+              <w:t xml:space="preserve">k=24</w:t>
+            </w:r>
+          </w:p>
+        </w:tc>
+        <w:tc>
+          <w:tcPr>
+            <w:tcMar>
+              <w:left w:w="40" w:type="dxa"/>
+              <w:right w:w="40" w:type="dxa"/>
+            </w:tcMar>
+          </w:tcPr>
+          <w:p>
+            <w:pPr>
+              <w:pStyle w:val="Compact"/>
+              <w:keepNext/>
+              <w:spacing w:after="0"/>
+              <w:jc w:val="left"/>
+            </w:pPr>
+            <w:r>
+              <w:rPr>
+                <w:rFonts w:ascii="Times New Roman" w:hAnsi="Times New Roman"/>
+                <w:sz w:val="12"/>
+              </w:rPr>
+              <w:t xml:space="preserve">0.907</w:t>
+            </w:r>
+          </w:p>
+        </w:tc>
+        <w:tc>
+          <w:tcPr>
+            <w:tcMar>
+              <w:left w:w="40" w:type="dxa"/>
+              <w:right w:w="40" w:type="dxa"/>
+            </w:tcMar>
+          </w:tcPr>
+          <w:p>
+            <w:pPr>
+              <w:pStyle w:val="Compact"/>
+              <w:keepNext/>
+              <w:spacing w:after="0"/>
+              <w:jc w:val="left"/>
+            </w:pPr>
+            <w:r>
+              <w:rPr>
+                <w:rFonts w:ascii="Times New Roman" w:hAnsi="Times New Roman"/>
+                <w:sz w:val="12"/>
+              </w:rPr>
+              <w:t xml:space="preserve">0.728</w:t>
+            </w:r>
+          </w:p>
+        </w:tc>
+        <w:tc>
+          <w:tcPr>
+            <w:tcMar>
+              <w:left w:w="40" w:type="dxa"/>
+              <w:right w:w="40" w:type="dxa"/>
+            </w:tcMar>
+          </w:tcPr>
+          <w:p>
+            <w:pPr>
+              <w:pStyle w:val="Compact"/>
+              <w:keepNext/>
+              <w:spacing w:after="0"/>
+              <w:jc w:val="left"/>
+            </w:pPr>
+            <w:r>
+              <w:rPr>
+                <w:rFonts w:ascii="Times New Roman" w:hAnsi="Times New Roman"/>
+                <w:sz w:val="12"/>
+              </w:rPr>
+              <w:t xml:space="preserve">0.728</w:t>
+            </w:r>
+          </w:p>
+        </w:tc>
+        <w:tc>
+          <w:tcPr>
+            <w:tcMar>
+              <w:left w:w="40" w:type="dxa"/>
+              <w:right w:w="40" w:type="dxa"/>
+            </w:tcMar>
+          </w:tcPr>
+          <w:p>
+            <w:pPr>
+              <w:pStyle w:val="Compact"/>
+              <w:keepNext/>
+              <w:spacing w:after="0"/>
+              <w:jc w:val="left"/>
+            </w:pPr>
+            <w:r>
+              <w:rPr>
+                <w:rFonts w:ascii="Times New Roman" w:hAnsi="Times New Roman"/>
+                <w:sz w:val="12"/>
+              </w:rPr>
+              <w:t xml:space="preserve">0.728</w:t>
+            </w:r>
+          </w:p>
+        </w:tc>
+        <w:tc>
+          <w:tcPr>
+            <w:tcMar>
+              <w:left w:w="40" w:type="dxa"/>
+              <w:right w:w="40" w:type="dxa"/>
+            </w:tcMar>
+          </w:tcPr>
+          <w:p>
+            <w:pPr>
+              <w:pStyle w:val="Compact"/>
+              <w:keepNext/>
+              <w:spacing w:after="0"/>
+              <w:jc w:val="left"/>
+            </w:pPr>
+            <w:r>
+              <w:rPr>
+                <w:rFonts w:ascii="Times New Roman" w:hAnsi="Times New Roman"/>
+                <w:sz w:val="12"/>
+              </w:rPr>
+              <w:t xml:space="preserve">0.728</w:t>
+            </w:r>
+          </w:p>
+        </w:tc>
+        <w:tc>
+          <w:tcPr>
+            <w:tcMar>
+              <w:left w:w="40" w:type="dxa"/>
+              <w:right w:w="40" w:type="dxa"/>
+            </w:tcMar>
+          </w:tcPr>
+          <w:p>
+            <w:pPr>
+              <w:pStyle w:val="Compact"/>
+              <w:keepNext/>
+              <w:spacing w:after="0"/>
+              <w:jc w:val="left"/>
+            </w:pPr>
+            <w:r>
+              <w:rPr>
+                <w:rFonts w:ascii="Times New Roman" w:hAnsi="Times New Roman"/>
+                <w:sz w:val="12"/>
+              </w:rPr>
+              <w:t xml:space="preserve">0.728</w:t>
             </w:r>
           </w:p>
         </w:tc>
@@ -58930,145 +60214,161 @@
                 <w:rFonts w:ascii="Times New Roman" w:hAnsi="Times New Roman"/>
                 <w:sz w:val="12"/>
               </w:rPr>
-              <w:t xml:space="preserve">in top 12 but below 0.25</w:t>
-            </w:r>
-          </w:p>
-        </w:tc>
-        <w:tc>
-          <w:tcPr>
-            <w:tcMar>
-              <w:left w:w="40" w:type="dxa"/>
-              <w:right w:w="40" w:type="dxa"/>
-            </w:tcMar>
-          </w:tcPr>
-          <w:p>
-            <w:pPr>
-              <w:pStyle w:val="Compact"/>
-              <w:keepNext/>
-              <w:spacing w:after="0"/>
-              <w:jc w:val="left"/>
-            </w:pPr>
-            <w:r>
-              <w:rPr>
-                <w:rFonts w:ascii="Times New Roman" w:hAnsi="Times New Roman"/>
-                <w:sz w:val="12"/>
-              </w:rPr>
-              <w:t xml:space="preserve">0.318</w:t>
-            </w:r>
-          </w:p>
-        </w:tc>
-        <w:tc>
-          <w:tcPr>
-            <w:tcMar>
-              <w:left w:w="40" w:type="dxa"/>
-              <w:right w:w="40" w:type="dxa"/>
-            </w:tcMar>
-          </w:tcPr>
-          <w:p>
-            <w:pPr>
-              <w:pStyle w:val="Compact"/>
-              <w:keepNext/>
-              <w:spacing w:after="0"/>
-              <w:jc w:val="left"/>
-            </w:pPr>
-            <w:r>
-              <w:rPr>
-                <w:rFonts w:ascii="Times New Roman" w:hAnsi="Times New Roman"/>
-                <w:sz w:val="12"/>
-              </w:rPr>
-              <w:t xml:space="preserve">0.277</w:t>
-            </w:r>
-          </w:p>
-        </w:tc>
-        <w:tc>
-          <w:tcPr>
-            <w:tcMar>
-              <w:left w:w="40" w:type="dxa"/>
-              <w:right w:w="40" w:type="dxa"/>
-            </w:tcMar>
-          </w:tcPr>
-          <w:p>
-            <w:pPr>
-              <w:pStyle w:val="Compact"/>
-              <w:keepNext/>
-              <w:spacing w:after="0"/>
-              <w:jc w:val="left"/>
-            </w:pPr>
-            <w:r>
-              <w:rPr>
-                <w:rFonts w:ascii="Times New Roman" w:hAnsi="Times New Roman"/>
-                <w:sz w:val="12"/>
-              </w:rPr>
-              <w:t xml:space="preserve">0.243</w:t>
-            </w:r>
-          </w:p>
-        </w:tc>
-        <w:tc>
-          <w:tcPr>
-            <w:tcMar>
-              <w:left w:w="40" w:type="dxa"/>
-              <w:right w:w="40" w:type="dxa"/>
-            </w:tcMar>
-          </w:tcPr>
-          <w:p>
-            <w:pPr>
-              <w:pStyle w:val="Compact"/>
-              <w:keepNext/>
-              <w:spacing w:after="0"/>
-              <w:jc w:val="left"/>
-            </w:pPr>
-            <w:r>
-              <w:rPr>
-                <w:rFonts w:ascii="Times New Roman" w:hAnsi="Times New Roman"/>
-                <w:sz w:val="12"/>
-              </w:rPr>
-              <w:t xml:space="preserve">0.201</w:t>
-            </w:r>
-          </w:p>
-        </w:tc>
-        <w:tc>
-          <w:tcPr>
-            <w:tcMar>
-              <w:left w:w="40" w:type="dxa"/>
-              <w:right w:w="40" w:type="dxa"/>
-            </w:tcMar>
-          </w:tcPr>
-          <w:p>
-            <w:pPr>
-              <w:pStyle w:val="Compact"/>
-              <w:keepNext/>
-              <w:spacing w:after="0"/>
-              <w:jc w:val="left"/>
-            </w:pPr>
-            <w:r>
-              <w:rPr>
-                <w:rFonts w:ascii="Times New Roman" w:hAnsi="Times New Roman"/>
-                <w:sz w:val="12"/>
-              </w:rPr>
-              <w:t xml:space="preserve">0.150</w:t>
-            </w:r>
-          </w:p>
-        </w:tc>
-        <w:tc>
-          <w:tcPr>
-            <w:tcMar>
-              <w:left w:w="40" w:type="dxa"/>
-              <w:right w:w="40" w:type="dxa"/>
-            </w:tcMar>
-          </w:tcPr>
-          <w:p>
-            <w:pPr>
-              <w:pStyle w:val="Compact"/>
-              <w:keepNext/>
-              <w:spacing w:after="0"/>
-              <w:jc w:val="left"/>
-            </w:pPr>
-            <w:r>
-              <w:rPr>
-                <w:rFonts w:ascii="Times New Roman" w:hAnsi="Times New Roman"/>
-                <w:sz w:val="12"/>
-              </w:rPr>
-              <w:t xml:space="preserve">0.110</w:t>
+              <w:t xml:space="preserve">fusion (RRF),</w:t>
+            </w:r>
+            <w:r>
+              <w:rPr>
+                <w:rFonts w:ascii="Times New Roman" w:hAnsi="Times New Roman"/>
+                <w:sz w:val="12"/>
+              </w:rPr>
+              <w:t xml:space="preserve"> </w:t>
+            </w:r>
+            <w:r>
+              <w:rPr>
+                <w:iCs/>
+                <w:rFonts w:ascii="Times New Roman" w:hAnsi="Times New Roman"/>
+                <w:i/>
+                <w:sz w:val="12"/>
+              </w:rPr>
+              <w:t xml:space="preserve">k=24</w:t>
+            </w:r>
+          </w:p>
+        </w:tc>
+        <w:tc>
+          <w:tcPr>
+            <w:tcMar>
+              <w:left w:w="40" w:type="dxa"/>
+              <w:right w:w="40" w:type="dxa"/>
+            </w:tcMar>
+          </w:tcPr>
+          <w:p>
+            <w:pPr>
+              <w:pStyle w:val="Compact"/>
+              <w:keepNext/>
+              <w:spacing w:after="0"/>
+              <w:jc w:val="left"/>
+            </w:pPr>
+            <w:r>
+              <w:rPr>
+                <w:rFonts w:ascii="Times New Roman" w:hAnsi="Times New Roman"/>
+                <w:sz w:val="12"/>
+              </w:rPr>
+              <w:t xml:space="preserve">1.000</w:t>
+            </w:r>
+          </w:p>
+        </w:tc>
+        <w:tc>
+          <w:tcPr>
+            <w:tcMar>
+              <w:left w:w="40" w:type="dxa"/>
+              <w:right w:w="40" w:type="dxa"/>
+            </w:tcMar>
+          </w:tcPr>
+          <w:p>
+            <w:pPr>
+              <w:pStyle w:val="Compact"/>
+              <w:keepNext/>
+              <w:spacing w:after="0"/>
+              <w:jc w:val="left"/>
+            </w:pPr>
+            <w:r>
+              <w:rPr>
+                <w:rFonts w:ascii="Times New Roman" w:hAnsi="Times New Roman"/>
+                <w:sz w:val="12"/>
+              </w:rPr>
+              <w:t xml:space="preserve">0.991</w:t>
+            </w:r>
+          </w:p>
+        </w:tc>
+        <w:tc>
+          <w:tcPr>
+            <w:tcMar>
+              <w:left w:w="40" w:type="dxa"/>
+              <w:right w:w="40" w:type="dxa"/>
+            </w:tcMar>
+          </w:tcPr>
+          <w:p>
+            <w:pPr>
+              <w:pStyle w:val="Compact"/>
+              <w:keepNext/>
+              <w:spacing w:after="0"/>
+              <w:jc w:val="left"/>
+            </w:pPr>
+            <w:r>
+              <w:rPr>
+                <w:rFonts w:ascii="Times New Roman" w:hAnsi="Times New Roman"/>
+                <w:sz w:val="12"/>
+              </w:rPr>
+              <w:t xml:space="preserve">0.970</w:t>
+            </w:r>
+          </w:p>
+        </w:tc>
+        <w:tc>
+          <w:tcPr>
+            <w:tcMar>
+              <w:left w:w="40" w:type="dxa"/>
+              <w:right w:w="40" w:type="dxa"/>
+            </w:tcMar>
+          </w:tcPr>
+          <w:p>
+            <w:pPr>
+              <w:pStyle w:val="Compact"/>
+              <w:keepNext/>
+              <w:spacing w:after="0"/>
+              <w:jc w:val="left"/>
+            </w:pPr>
+            <w:r>
+              <w:rPr>
+                <w:rFonts w:ascii="Times New Roman" w:hAnsi="Times New Roman"/>
+                <w:sz w:val="12"/>
+              </w:rPr>
+              <w:t xml:space="preserve">0.936</w:t>
+            </w:r>
+          </w:p>
+        </w:tc>
+        <w:tc>
+          <w:tcPr>
+            <w:tcMar>
+              <w:left w:w="40" w:type="dxa"/>
+              <w:right w:w="40" w:type="dxa"/>
+            </w:tcMar>
+          </w:tcPr>
+          <w:p>
+            <w:pPr>
+              <w:pStyle w:val="Compact"/>
+              <w:keepNext/>
+              <w:spacing w:after="0"/>
+              <w:jc w:val="left"/>
+            </w:pPr>
+            <w:r>
+              <w:rPr>
+                <w:rFonts w:ascii="Times New Roman" w:hAnsi="Times New Roman"/>
+                <w:sz w:val="12"/>
+              </w:rPr>
+              <w:t xml:space="preserve">0.882</w:t>
+            </w:r>
+          </w:p>
+        </w:tc>
+        <w:tc>
+          <w:tcPr>
+            <w:tcMar>
+              <w:left w:w="40" w:type="dxa"/>
+              <w:right w:w="40" w:type="dxa"/>
+            </w:tcMar>
+          </w:tcPr>
+          <w:p>
+            <w:pPr>
+              <w:pStyle w:val="Compact"/>
+              <w:keepNext/>
+              <w:spacing w:after="0"/>
+              <w:jc w:val="left"/>
+            </w:pPr>
+            <w:r>
+              <w:rPr>
+                <w:rFonts w:ascii="Times New Roman" w:hAnsi="Times New Roman"/>
+                <w:sz w:val="12"/>
+              </w:rPr>
+              <w:t xml:space="preserve">0.843</w:t>
             </w:r>
           </w:p>
         </w:tc>
@@ -59084,6 +60384,674 @@
           <w:p>
             <w:pPr>
               <w:pStyle w:val="Compact"/>
+              <w:keepNext/>
+              <w:spacing w:after="0"/>
+              <w:jc w:val="left"/>
+            </w:pPr>
+            <w:r>
+              <w:rPr>
+                <w:rFonts w:ascii="Times New Roman" w:hAnsi="Times New Roman"/>
+                <w:sz w:val="12"/>
+              </w:rPr>
+              <w:t xml:space="preserve">per sentence + fusion,</w:t>
+            </w:r>
+            <w:r>
+              <w:rPr>
+                <w:rFonts w:ascii="Times New Roman" w:hAnsi="Times New Roman"/>
+                <w:sz w:val="12"/>
+              </w:rPr>
+              <w:t xml:space="preserve"> </w:t>
+            </w:r>
+            <w:r>
+              <w:rPr>
+                <w:iCs/>
+                <w:rFonts w:ascii="Times New Roman" w:hAnsi="Times New Roman"/>
+                <w:i/>
+                <w:sz w:val="12"/>
+              </w:rPr>
+              <w:t xml:space="preserve">k=24</w:t>
+            </w:r>
+          </w:p>
+        </w:tc>
+        <w:tc>
+          <w:tcPr>
+            <w:tcMar>
+              <w:left w:w="40" w:type="dxa"/>
+              <w:right w:w="40" w:type="dxa"/>
+            </w:tcMar>
+          </w:tcPr>
+          <w:p>
+            <w:pPr>
+              <w:pStyle w:val="Compact"/>
+              <w:keepNext/>
+              <w:spacing w:after="0"/>
+              <w:jc w:val="left"/>
+            </w:pPr>
+            <w:r>
+              <w:rPr>
+                <w:rFonts w:ascii="Times New Roman" w:hAnsi="Times New Roman"/>
+                <w:sz w:val="12"/>
+              </w:rPr>
+              <w:t xml:space="preserve">1.000</w:t>
+            </w:r>
+          </w:p>
+        </w:tc>
+        <w:tc>
+          <w:tcPr>
+            <w:tcMar>
+              <w:left w:w="40" w:type="dxa"/>
+              <w:right w:w="40" w:type="dxa"/>
+            </w:tcMar>
+          </w:tcPr>
+          <w:p>
+            <w:pPr>
+              <w:pStyle w:val="Compact"/>
+              <w:keepNext/>
+              <w:spacing w:after="0"/>
+              <w:jc w:val="left"/>
+            </w:pPr>
+            <w:r>
+              <w:rPr>
+                <w:rFonts w:ascii="Times New Roman" w:hAnsi="Times New Roman"/>
+                <w:sz w:val="12"/>
+              </w:rPr>
+              <w:t xml:space="preserve">0.992</w:t>
+            </w:r>
+          </w:p>
+        </w:tc>
+        <w:tc>
+          <w:tcPr>
+            <w:tcMar>
+              <w:left w:w="40" w:type="dxa"/>
+              <w:right w:w="40" w:type="dxa"/>
+            </w:tcMar>
+          </w:tcPr>
+          <w:p>
+            <w:pPr>
+              <w:pStyle w:val="Compact"/>
+              <w:keepNext/>
+              <w:spacing w:after="0"/>
+              <w:jc w:val="left"/>
+            </w:pPr>
+            <w:r>
+              <w:rPr>
+                <w:rFonts w:ascii="Times New Roman" w:hAnsi="Times New Roman"/>
+                <w:sz w:val="12"/>
+              </w:rPr>
+              <w:t xml:space="preserve">0.979</w:t>
+            </w:r>
+          </w:p>
+        </w:tc>
+        <w:tc>
+          <w:tcPr>
+            <w:tcMar>
+              <w:left w:w="40" w:type="dxa"/>
+              <w:right w:w="40" w:type="dxa"/>
+            </w:tcMar>
+          </w:tcPr>
+          <w:p>
+            <w:pPr>
+              <w:pStyle w:val="Compact"/>
+              <w:keepNext/>
+              <w:spacing w:after="0"/>
+              <w:jc w:val="left"/>
+            </w:pPr>
+            <w:r>
+              <w:rPr>
+                <w:rFonts w:ascii="Times New Roman" w:hAnsi="Times New Roman"/>
+                <w:sz w:val="12"/>
+              </w:rPr>
+              <w:t xml:space="preserve">0.950</w:t>
+            </w:r>
+          </w:p>
+        </w:tc>
+        <w:tc>
+          <w:tcPr>
+            <w:tcMar>
+              <w:left w:w="40" w:type="dxa"/>
+              <w:right w:w="40" w:type="dxa"/>
+            </w:tcMar>
+          </w:tcPr>
+          <w:p>
+            <w:pPr>
+              <w:pStyle w:val="Compact"/>
+              <w:keepNext/>
+              <w:spacing w:after="0"/>
+              <w:jc w:val="left"/>
+            </w:pPr>
+            <w:r>
+              <w:rPr>
+                <w:rFonts w:ascii="Times New Roman" w:hAnsi="Times New Roman"/>
+                <w:sz w:val="12"/>
+              </w:rPr>
+              <w:t xml:space="preserve">0.903</w:t>
+            </w:r>
+          </w:p>
+        </w:tc>
+        <w:tc>
+          <w:tcPr>
+            <w:tcMar>
+              <w:left w:w="40" w:type="dxa"/>
+              <w:right w:w="40" w:type="dxa"/>
+            </w:tcMar>
+          </w:tcPr>
+          <w:p>
+            <w:pPr>
+              <w:pStyle w:val="Compact"/>
+              <w:keepNext/>
+              <w:spacing w:after="0"/>
+              <w:jc w:val="left"/>
+            </w:pPr>
+            <w:r>
+              <w:rPr>
+                <w:rFonts w:ascii="Times New Roman" w:hAnsi="Times New Roman"/>
+                <w:sz w:val="12"/>
+              </w:rPr>
+              <w:t xml:space="preserve">0.861</w:t>
+            </w:r>
+          </w:p>
+        </w:tc>
+      </w:tr>
+      <w:tr>
+        <w:tc>
+          <w:tcPr>
+            <w:tcMar>
+              <w:left w:w="40" w:type="dxa"/>
+              <w:right w:w="40" w:type="dxa"/>
+            </w:tcMar>
+          </w:tcPr>
+          <w:p>
+            <w:pPr>
+              <w:pStyle w:val="Compact"/>
+              <w:keepNext/>
+              <w:spacing w:after="0"/>
+              <w:jc w:val="left"/>
+            </w:pPr>
+            <w:r>
+              <w:rPr>
+                <w:rFonts w:ascii="Times New Roman" w:hAnsi="Times New Roman"/>
+                <w:sz w:val="12"/>
+              </w:rPr>
+              <w:t xml:space="preserve">target in top 12, no floor</w:t>
+            </w:r>
+          </w:p>
+        </w:tc>
+        <w:tc>
+          <w:tcPr>
+            <w:tcMar>
+              <w:left w:w="40" w:type="dxa"/>
+              <w:right w:w="40" w:type="dxa"/>
+            </w:tcMar>
+          </w:tcPr>
+          <w:p>
+            <w:pPr>
+              <w:pStyle w:val="Compact"/>
+              <w:keepNext/>
+              <w:spacing w:after="0"/>
+              <w:jc w:val="left"/>
+            </w:pPr>
+            <w:r>
+              <w:rPr>
+                <w:rFonts w:ascii="Times New Roman" w:hAnsi="Times New Roman"/>
+                <w:sz w:val="12"/>
+              </w:rPr>
+              <w:t xml:space="preserve">1.000</w:t>
+            </w:r>
+          </w:p>
+        </w:tc>
+        <w:tc>
+          <w:tcPr>
+            <w:tcMar>
+              <w:left w:w="40" w:type="dxa"/>
+              <w:right w:w="40" w:type="dxa"/>
+            </w:tcMar>
+          </w:tcPr>
+          <w:p>
+            <w:pPr>
+              <w:pStyle w:val="Compact"/>
+              <w:keepNext/>
+              <w:spacing w:after="0"/>
+              <w:jc w:val="left"/>
+            </w:pPr>
+            <w:r>
+              <w:rPr>
+                <w:rFonts w:ascii="Times New Roman" w:hAnsi="Times New Roman"/>
+                <w:sz w:val="12"/>
+              </w:rPr>
+              <w:t xml:space="preserve">0.959</w:t>
+            </w:r>
+          </w:p>
+        </w:tc>
+        <w:tc>
+          <w:tcPr>
+            <w:tcMar>
+              <w:left w:w="40" w:type="dxa"/>
+              <w:right w:w="40" w:type="dxa"/>
+            </w:tcMar>
+          </w:tcPr>
+          <w:p>
+            <w:pPr>
+              <w:pStyle w:val="Compact"/>
+              <w:keepNext/>
+              <w:spacing w:after="0"/>
+              <w:jc w:val="left"/>
+            </w:pPr>
+            <w:r>
+              <w:rPr>
+                <w:rFonts w:ascii="Times New Roman" w:hAnsi="Times New Roman"/>
+                <w:sz w:val="12"/>
+              </w:rPr>
+              <w:t xml:space="preserve">0.925</w:t>
+            </w:r>
+          </w:p>
+        </w:tc>
+        <w:tc>
+          <w:tcPr>
+            <w:tcMar>
+              <w:left w:w="40" w:type="dxa"/>
+              <w:right w:w="40" w:type="dxa"/>
+            </w:tcMar>
+          </w:tcPr>
+          <w:p>
+            <w:pPr>
+              <w:pStyle w:val="Compact"/>
+              <w:keepNext/>
+              <w:spacing w:after="0"/>
+              <w:jc w:val="left"/>
+            </w:pPr>
+            <w:r>
+              <w:rPr>
+                <w:rFonts w:ascii="Times New Roman" w:hAnsi="Times New Roman"/>
+                <w:sz w:val="12"/>
+              </w:rPr>
+              <w:t xml:space="preserve">0.883</w:t>
+            </w:r>
+          </w:p>
+        </w:tc>
+        <w:tc>
+          <w:tcPr>
+            <w:tcMar>
+              <w:left w:w="40" w:type="dxa"/>
+              <w:right w:w="40" w:type="dxa"/>
+            </w:tcMar>
+          </w:tcPr>
+          <w:p>
+            <w:pPr>
+              <w:pStyle w:val="Compact"/>
+              <w:keepNext/>
+              <w:spacing w:after="0"/>
+              <w:jc w:val="left"/>
+            </w:pPr>
+            <w:r>
+              <w:rPr>
+                <w:rFonts w:ascii="Times New Roman" w:hAnsi="Times New Roman"/>
+                <w:sz w:val="12"/>
+              </w:rPr>
+              <w:t xml:space="preserve">0.830</w:t>
+            </w:r>
+          </w:p>
+        </w:tc>
+        <w:tc>
+          <w:tcPr>
+            <w:tcMar>
+              <w:left w:w="40" w:type="dxa"/>
+              <w:right w:w="40" w:type="dxa"/>
+            </w:tcMar>
+          </w:tcPr>
+          <w:p>
+            <w:pPr>
+              <w:pStyle w:val="Compact"/>
+              <w:keepNext/>
+              <w:spacing w:after="0"/>
+              <w:jc w:val="left"/>
+            </w:pPr>
+            <w:r>
+              <w:rPr>
+                <w:rFonts w:ascii="Times New Roman" w:hAnsi="Times New Roman"/>
+                <w:sz w:val="12"/>
+              </w:rPr>
+              <w:t xml:space="preserve">0.777</w:t>
+            </w:r>
+          </w:p>
+        </w:tc>
+      </w:tr>
+      <w:tr>
+        <w:tc>
+          <w:tcPr>
+            <w:tcMar>
+              <w:left w:w="40" w:type="dxa"/>
+              <w:right w:w="40" w:type="dxa"/>
+            </w:tcMar>
+          </w:tcPr>
+          <w:p>
+            <w:pPr>
+              <w:pStyle w:val="Compact"/>
+              <w:keepNext/>
+              <w:spacing w:after="0"/>
+              <w:jc w:val="left"/>
+            </w:pPr>
+            <w:r>
+              <w:rPr>
+                <w:rFonts w:ascii="Times New Roman" w:hAnsi="Times New Roman"/>
+                <w:sz w:val="12"/>
+              </w:rPr>
+              <w:t xml:space="preserve">target in top 24, no floor</w:t>
+            </w:r>
+          </w:p>
+        </w:tc>
+        <w:tc>
+          <w:tcPr>
+            <w:tcMar>
+              <w:left w:w="40" w:type="dxa"/>
+              <w:right w:w="40" w:type="dxa"/>
+            </w:tcMar>
+          </w:tcPr>
+          <w:p>
+            <w:pPr>
+              <w:pStyle w:val="Compact"/>
+              <w:keepNext/>
+              <w:spacing w:after="0"/>
+              <w:jc w:val="left"/>
+            </w:pPr>
+            <w:r>
+              <w:rPr>
+                <w:rFonts w:ascii="Times New Roman" w:hAnsi="Times New Roman"/>
+                <w:sz w:val="12"/>
+              </w:rPr>
+              <w:t xml:space="preserve">1.000</w:t>
+            </w:r>
+          </w:p>
+        </w:tc>
+        <w:tc>
+          <w:tcPr>
+            <w:tcMar>
+              <w:left w:w="40" w:type="dxa"/>
+              <w:right w:w="40" w:type="dxa"/>
+            </w:tcMar>
+          </w:tcPr>
+          <w:p>
+            <w:pPr>
+              <w:pStyle w:val="Compact"/>
+              <w:keepNext/>
+              <w:spacing w:after="0"/>
+              <w:jc w:val="left"/>
+            </w:pPr>
+            <w:r>
+              <w:rPr>
+                <w:rFonts w:ascii="Times New Roman" w:hAnsi="Times New Roman"/>
+                <w:sz w:val="12"/>
+              </w:rPr>
+              <w:t xml:space="preserve">0.991</w:t>
+            </w:r>
+          </w:p>
+        </w:tc>
+        <w:tc>
+          <w:tcPr>
+            <w:tcMar>
+              <w:left w:w="40" w:type="dxa"/>
+              <w:right w:w="40" w:type="dxa"/>
+            </w:tcMar>
+          </w:tcPr>
+          <w:p>
+            <w:pPr>
+              <w:pStyle w:val="Compact"/>
+              <w:keepNext/>
+              <w:spacing w:after="0"/>
+              <w:jc w:val="left"/>
+            </w:pPr>
+            <w:r>
+              <w:rPr>
+                <w:rFonts w:ascii="Times New Roman" w:hAnsi="Times New Roman"/>
+                <w:sz w:val="12"/>
+              </w:rPr>
+              <w:t xml:space="preserve">0.969</w:t>
+            </w:r>
+          </w:p>
+        </w:tc>
+        <w:tc>
+          <w:tcPr>
+            <w:tcMar>
+              <w:left w:w="40" w:type="dxa"/>
+              <w:right w:w="40" w:type="dxa"/>
+            </w:tcMar>
+          </w:tcPr>
+          <w:p>
+            <w:pPr>
+              <w:pStyle w:val="Compact"/>
+              <w:keepNext/>
+              <w:spacing w:after="0"/>
+              <w:jc w:val="left"/>
+            </w:pPr>
+            <w:r>
+              <w:rPr>
+                <w:rFonts w:ascii="Times New Roman" w:hAnsi="Times New Roman"/>
+                <w:sz w:val="12"/>
+              </w:rPr>
+              <w:t xml:space="preserve">0.934</w:t>
+            </w:r>
+          </w:p>
+        </w:tc>
+        <w:tc>
+          <w:tcPr>
+            <w:tcMar>
+              <w:left w:w="40" w:type="dxa"/>
+              <w:right w:w="40" w:type="dxa"/>
+            </w:tcMar>
+          </w:tcPr>
+          <w:p>
+            <w:pPr>
+              <w:pStyle w:val="Compact"/>
+              <w:keepNext/>
+              <w:spacing w:after="0"/>
+              <w:jc w:val="left"/>
+            </w:pPr>
+            <w:r>
+              <w:rPr>
+                <w:rFonts w:ascii="Times New Roman" w:hAnsi="Times New Roman"/>
+                <w:sz w:val="12"/>
+              </w:rPr>
+              <w:t xml:space="preserve">0.888</w:t>
+            </w:r>
+          </w:p>
+        </w:tc>
+        <w:tc>
+          <w:tcPr>
+            <w:tcMar>
+              <w:left w:w="40" w:type="dxa"/>
+              <w:right w:w="40" w:type="dxa"/>
+            </w:tcMar>
+          </w:tcPr>
+          <w:p>
+            <w:pPr>
+              <w:pStyle w:val="Compact"/>
+              <w:keepNext/>
+              <w:spacing w:after="0"/>
+              <w:jc w:val="left"/>
+            </w:pPr>
+            <w:r>
+              <w:rPr>
+                <w:rFonts w:ascii="Times New Roman" w:hAnsi="Times New Roman"/>
+                <w:sz w:val="12"/>
+              </w:rPr>
+              <w:t xml:space="preserve">0.849</w:t>
+            </w:r>
+          </w:p>
+        </w:tc>
+      </w:tr>
+      <w:tr>
+        <w:tc>
+          <w:tcPr>
+            <w:tcMar>
+              <w:left w:w="40" w:type="dxa"/>
+              <w:right w:w="40" w:type="dxa"/>
+            </w:tcMar>
+          </w:tcPr>
+          <w:p>
+            <w:pPr>
+              <w:pStyle w:val="Compact"/>
+              <w:keepNext/>
+              <w:spacing w:after="0"/>
+              <w:jc w:val="left"/>
+            </w:pPr>
+            <w:r>
+              <w:rPr>
+                <w:rFonts w:ascii="Times New Roman" w:hAnsi="Times New Roman"/>
+                <w:sz w:val="12"/>
+              </w:rPr>
+              <w:t xml:space="preserve">in top 12 but below 0.25</w:t>
+            </w:r>
+          </w:p>
+        </w:tc>
+        <w:tc>
+          <w:tcPr>
+            <w:tcMar>
+              <w:left w:w="40" w:type="dxa"/>
+              <w:right w:w="40" w:type="dxa"/>
+            </w:tcMar>
+          </w:tcPr>
+          <w:p>
+            <w:pPr>
+              <w:pStyle w:val="Compact"/>
+              <w:keepNext/>
+              <w:spacing w:after="0"/>
+              <w:jc w:val="left"/>
+            </w:pPr>
+            <w:r>
+              <w:rPr>
+                <w:rFonts w:ascii="Times New Roman" w:hAnsi="Times New Roman"/>
+                <w:sz w:val="12"/>
+              </w:rPr>
+              <w:t xml:space="preserve">0.318</w:t>
+            </w:r>
+          </w:p>
+        </w:tc>
+        <w:tc>
+          <w:tcPr>
+            <w:tcMar>
+              <w:left w:w="40" w:type="dxa"/>
+              <w:right w:w="40" w:type="dxa"/>
+            </w:tcMar>
+          </w:tcPr>
+          <w:p>
+            <w:pPr>
+              <w:pStyle w:val="Compact"/>
+              <w:keepNext/>
+              <w:spacing w:after="0"/>
+              <w:jc w:val="left"/>
+            </w:pPr>
+            <w:r>
+              <w:rPr>
+                <w:rFonts w:ascii="Times New Roman" w:hAnsi="Times New Roman"/>
+                <w:sz w:val="12"/>
+              </w:rPr>
+              <w:t xml:space="preserve">0.277</w:t>
+            </w:r>
+          </w:p>
+        </w:tc>
+        <w:tc>
+          <w:tcPr>
+            <w:tcMar>
+              <w:left w:w="40" w:type="dxa"/>
+              <w:right w:w="40" w:type="dxa"/>
+            </w:tcMar>
+          </w:tcPr>
+          <w:p>
+            <w:pPr>
+              <w:pStyle w:val="Compact"/>
+              <w:keepNext/>
+              <w:spacing w:after="0"/>
+              <w:jc w:val="left"/>
+            </w:pPr>
+            <w:r>
+              <w:rPr>
+                <w:rFonts w:ascii="Times New Roman" w:hAnsi="Times New Roman"/>
+                <w:sz w:val="12"/>
+              </w:rPr>
+              <w:t xml:space="preserve">0.243</w:t>
+            </w:r>
+          </w:p>
+        </w:tc>
+        <w:tc>
+          <w:tcPr>
+            <w:tcMar>
+              <w:left w:w="40" w:type="dxa"/>
+              <w:right w:w="40" w:type="dxa"/>
+            </w:tcMar>
+          </w:tcPr>
+          <w:p>
+            <w:pPr>
+              <w:pStyle w:val="Compact"/>
+              <w:keepNext/>
+              <w:spacing w:after="0"/>
+              <w:jc w:val="left"/>
+            </w:pPr>
+            <w:r>
+              <w:rPr>
+                <w:rFonts w:ascii="Times New Roman" w:hAnsi="Times New Roman"/>
+                <w:sz w:val="12"/>
+              </w:rPr>
+              <w:t xml:space="preserve">0.201</w:t>
+            </w:r>
+          </w:p>
+        </w:tc>
+        <w:tc>
+          <w:tcPr>
+            <w:tcMar>
+              <w:left w:w="40" w:type="dxa"/>
+              <w:right w:w="40" w:type="dxa"/>
+            </w:tcMar>
+          </w:tcPr>
+          <w:p>
+            <w:pPr>
+              <w:pStyle w:val="Compact"/>
+              <w:keepNext/>
+              <w:spacing w:after="0"/>
+              <w:jc w:val="left"/>
+            </w:pPr>
+            <w:r>
+              <w:rPr>
+                <w:rFonts w:ascii="Times New Roman" w:hAnsi="Times New Roman"/>
+                <w:sz w:val="12"/>
+              </w:rPr>
+              <w:t xml:space="preserve">0.150</w:t>
+            </w:r>
+          </w:p>
+        </w:tc>
+        <w:tc>
+          <w:tcPr>
+            <w:tcMar>
+              <w:left w:w="40" w:type="dxa"/>
+              <w:right w:w="40" w:type="dxa"/>
+            </w:tcMar>
+          </w:tcPr>
+          <w:p>
+            <w:pPr>
+              <w:pStyle w:val="Compact"/>
+              <w:keepNext/>
+              <w:spacing w:after="0"/>
+              <w:jc w:val="left"/>
+            </w:pPr>
+            <w:r>
+              <w:rPr>
+                <w:rFonts w:ascii="Times New Roman" w:hAnsi="Times New Roman"/>
+                <w:sz w:val="12"/>
+              </w:rPr>
+              <w:t xml:space="preserve">0.110</w:t>
+            </w:r>
+          </w:p>
+        </w:tc>
+      </w:tr>
+      <w:tr>
+        <w:tc>
+          <w:tcPr>
+            <w:tcMar>
+              <w:left w:w="40" w:type="dxa"/>
+              <w:right w:w="40" w:type="dxa"/>
+            </w:tcMar>
+          </w:tcPr>
+          <w:p>
+            <w:pPr>
+              <w:pStyle w:val="Compact"/>
               <w:spacing w:after="0"/>
               <w:jc w:val="left"/>
             </w:pPr>
@@ -59158,73 +61126,73 @@
                 <w:rFonts w:ascii="Times New Roman" w:hAnsi="Times New Roman"/>
                 <w:sz w:val="12"/>
               </w:rPr>
-              <w:t xml:space="preserve">0.017</w:t>
-            </w:r>
-          </w:p>
-        </w:tc>
-        <w:tc>
-          <w:tcPr>
-            <w:tcMar>
-              <w:left w:w="40" w:type="dxa"/>
-              <w:right w:w="40" w:type="dxa"/>
-            </w:tcMar>
-          </w:tcPr>
-          <w:p>
-            <w:pPr>
-              <w:pStyle w:val="Compact"/>
-              <w:spacing w:after="0"/>
-              <w:jc w:val="left"/>
-            </w:pPr>
-            <w:r>
-              <w:rPr>
-                <w:rFonts w:ascii="Times New Roman" w:hAnsi="Times New Roman"/>
-                <w:sz w:val="12"/>
-              </w:rPr>
-              <w:t xml:space="preserve">0.040</w:t>
-            </w:r>
-          </w:p>
-        </w:tc>
-        <w:tc>
-          <w:tcPr>
-            <w:tcMar>
-              <w:left w:w="40" w:type="dxa"/>
-              <w:right w:w="40" w:type="dxa"/>
-            </w:tcMar>
-          </w:tcPr>
-          <w:p>
-            <w:pPr>
-              <w:pStyle w:val="Compact"/>
-              <w:spacing w:after="0"/>
-              <w:jc w:val="left"/>
-            </w:pPr>
-            <w:r>
-              <w:rPr>
-                <w:rFonts w:ascii="Times New Roman" w:hAnsi="Times New Roman"/>
-                <w:sz w:val="12"/>
-              </w:rPr>
-              <w:t xml:space="preserve">0.082</w:t>
-            </w:r>
-          </w:p>
-        </w:tc>
-        <w:tc>
-          <w:tcPr>
-            <w:tcMar>
-              <w:left w:w="40" w:type="dxa"/>
-              <w:right w:w="40" w:type="dxa"/>
-            </w:tcMar>
-          </w:tcPr>
-          <w:p>
-            <w:pPr>
-              <w:pStyle w:val="Compact"/>
-              <w:spacing w:after="0"/>
-              <w:jc w:val="left"/>
-            </w:pPr>
-            <w:r>
-              <w:rPr>
-                <w:rFonts w:ascii="Times New Roman" w:hAnsi="Times New Roman"/>
-                <w:sz w:val="12"/>
-              </w:rPr>
-              <w:t xml:space="preserve">0.115</w:t>
+              <w:t xml:space="preserve">0.014</w:t>
+            </w:r>
+          </w:p>
+        </w:tc>
+        <w:tc>
+          <w:tcPr>
+            <w:tcMar>
+              <w:left w:w="40" w:type="dxa"/>
+              <w:right w:w="40" w:type="dxa"/>
+            </w:tcMar>
+          </w:tcPr>
+          <w:p>
+            <w:pPr>
+              <w:pStyle w:val="Compact"/>
+              <w:spacing w:after="0"/>
+              <w:jc w:val="left"/>
+            </w:pPr>
+            <w:r>
+              <w:rPr>
+                <w:rFonts w:ascii="Times New Roman" w:hAnsi="Times New Roman"/>
+                <w:sz w:val="12"/>
+              </w:rPr>
+              <w:t xml:space="preserve">0.036</w:t>
+            </w:r>
+          </w:p>
+        </w:tc>
+        <w:tc>
+          <w:tcPr>
+            <w:tcMar>
+              <w:left w:w="40" w:type="dxa"/>
+              <w:right w:w="40" w:type="dxa"/>
+            </w:tcMar>
+          </w:tcPr>
+          <w:p>
+            <w:pPr>
+              <w:pStyle w:val="Compact"/>
+              <w:spacing w:after="0"/>
+              <w:jc w:val="left"/>
+            </w:pPr>
+            <w:r>
+              <w:rPr>
+                <w:rFonts w:ascii="Times New Roman" w:hAnsi="Times New Roman"/>
+                <w:sz w:val="12"/>
+              </w:rPr>
+              <w:t xml:space="preserve">0.073</w:t>
+            </w:r>
+          </w:p>
+        </w:tc>
+        <w:tc>
+          <w:tcPr>
+            <w:tcMar>
+              <w:left w:w="40" w:type="dxa"/>
+              <w:right w:w="40" w:type="dxa"/>
+            </w:tcMar>
+          </w:tcPr>
+          <w:p>
+            <w:pPr>
+              <w:pStyle w:val="Compact"/>
+              <w:spacing w:after="0"/>
+              <w:jc w:val="left"/>
+            </w:pPr>
+            <w:r>
+              <w:rPr>
+                <w:rFonts w:ascii="Times New Roman" w:hAnsi="Times New Roman"/>
+                <w:sz w:val="12"/>
+              </w:rPr>
+              <w:t xml:space="preserve">0.100</w:t>
             </w:r>
           </w:p>
         </w:tc>

</xml_diff>

<commit_message>
Selection study: cross-encoder reranker results; safe cleanup of temporary folders on Windows
- rerank (run on the Windows machine): 0.887 at N=350 with 31.5 candidates,
  +0.038 over the plain 24-match list; added as a separate Holm family
- run-reach/run-rerank/e2e: close the database and tolerate a locked temp folder
- paper: reranker paragraph, table row, updated abstract, discussion, conclusion

Co-Authored-By: Claude Opus 5.5 <noreply@anthropic.com>
Claude-Session: https://claude.ai/code/session_0199uMN2tRAqpJR3sfk69y1g
</commit_message>
<xml_diff>
--- a/paper/aura-paper.docx
+++ b/paper/aura-paper.docx
@@ -3915,21 +3915,7 @@
           <w:b/>
           <w:sz w:val="18"/>
         </w:rPr>
-        <w:t xml:space="preserve">variants,</w:t>
-      </w:r>
-      <w:r>
-        <w:rPr>
-          <w:b/>
-          <w:sz w:val="18"/>
-        </w:rPr>
-        <w:t xml:space="preserve"> </w:t>
-      </w:r>
-      <w:r>
-        <w:rPr>
-          <w:b/>
-          <w:sz w:val="18"/>
-        </w:rPr>
-        <w:t xml:space="preserve">including</w:t>
+        <w:t xml:space="preserve">variants;</w:t>
       </w:r>
       <w:r>
         <w:rPr>
@@ -3999,21 +3985,7 @@
           <w:b/>
           <w:sz w:val="18"/>
         </w:rPr>
-        <w:t xml:space="preserve">rankings,</w:t>
-      </w:r>
-      <w:r>
-        <w:rPr>
-          <w:b/>
-          <w:sz w:val="18"/>
-        </w:rPr>
-        <w:t xml:space="preserve"> </w:t>
-      </w:r>
-      <w:r>
-        <w:rPr>
-          <w:b/>
-          <w:sz w:val="18"/>
-        </w:rPr>
-        <w:t xml:space="preserve">which</w:t>
+        <w:t xml:space="preserve">rankings</w:t>
       </w:r>
       <w:r>
         <w:rPr>
@@ -4111,7 +4083,385 @@
           <w:b/>
           <w:sz w:val="18"/>
         </w:rPr>
-        <w:t xml:space="preserve">list.</w:t>
+        <w:t xml:space="preserve">list,</w:t>
+      </w:r>
+      <w:r>
+        <w:rPr>
+          <w:b/>
+          <w:sz w:val="18"/>
+        </w:rPr>
+        <w:t xml:space="preserve"> </w:t>
+      </w:r>
+      <w:r>
+        <w:rPr>
+          <w:b/>
+          <w:sz w:val="18"/>
+        </w:rPr>
+        <w:t xml:space="preserve">while</w:t>
+      </w:r>
+      <w:r>
+        <w:rPr>
+          <w:b/>
+          <w:sz w:val="18"/>
+        </w:rPr>
+        <w:t xml:space="preserve"> </w:t>
+      </w:r>
+      <w:r>
+        <w:rPr>
+          <w:b/>
+          <w:sz w:val="18"/>
+        </w:rPr>
+        <w:t xml:space="preserve">reranking</w:t>
+      </w:r>
+      <w:r>
+        <w:rPr>
+          <w:b/>
+          <w:sz w:val="18"/>
+        </w:rPr>
+        <w:t xml:space="preserve"> </w:t>
+      </w:r>
+      <w:r>
+        <w:rPr>
+          <w:b/>
+          <w:sz w:val="18"/>
+        </w:rPr>
+        <w:t xml:space="preserve">its</w:t>
+      </w:r>
+      <w:r>
+        <w:rPr>
+          <w:b/>
+          <w:sz w:val="18"/>
+        </w:rPr>
+        <w:t xml:space="preserve"> </w:t>
+      </w:r>
+      <w:r>
+        <w:rPr>
+          <w:b/>
+          <w:sz w:val="18"/>
+        </w:rPr>
+        <w:t xml:space="preserve">50</w:t>
+      </w:r>
+      <w:r>
+        <w:rPr>
+          <w:b/>
+          <w:sz w:val="18"/>
+        </w:rPr>
+        <w:t xml:space="preserve"> </w:t>
+      </w:r>
+      <w:r>
+        <w:rPr>
+          <w:b/>
+          <w:sz w:val="18"/>
+        </w:rPr>
+        <w:t xml:space="preserve">best</w:t>
+      </w:r>
+      <w:r>
+        <w:rPr>
+          <w:b/>
+          <w:sz w:val="18"/>
+        </w:rPr>
+        <w:t xml:space="preserve"> </w:t>
+      </w:r>
+      <w:r>
+        <w:rPr>
+          <w:b/>
+          <w:sz w:val="18"/>
+        </w:rPr>
+        <w:t xml:space="preserve">matches</w:t>
+      </w:r>
+      <w:r>
+        <w:rPr>
+          <w:b/>
+          <w:sz w:val="18"/>
+        </w:rPr>
+        <w:t xml:space="preserve"> </w:t>
+      </w:r>
+      <w:r>
+        <w:rPr>
+          <w:b/>
+          <w:sz w:val="18"/>
+        </w:rPr>
+        <w:t xml:space="preserve">with</w:t>
+      </w:r>
+      <w:r>
+        <w:rPr>
+          <w:b/>
+          <w:sz w:val="18"/>
+        </w:rPr>
+        <w:t xml:space="preserve"> </w:t>
+      </w:r>
+      <w:r>
+        <w:rPr>
+          <w:b/>
+          <w:sz w:val="18"/>
+        </w:rPr>
+        <w:t xml:space="preserve">a</w:t>
+      </w:r>
+      <w:r>
+        <w:rPr>
+          <w:b/>
+          <w:sz w:val="18"/>
+        </w:rPr>
+        <w:t xml:space="preserve"> </w:t>
+      </w:r>
+      <w:r>
+        <w:rPr>
+          <w:b/>
+          <w:sz w:val="18"/>
+        </w:rPr>
+        <w:t xml:space="preserve">cross-encoder</w:t>
+      </w:r>
+      <w:r>
+        <w:rPr>
+          <w:b/>
+          <w:sz w:val="18"/>
+        </w:rPr>
+        <w:t xml:space="preserve"> </w:t>
+      </w:r>
+      <w:r>
+        <w:rPr>
+          <w:b/>
+          <w:sz w:val="18"/>
+        </w:rPr>
+        <w:t xml:space="preserve">reaches</w:t>
+      </w:r>
+      <w:r>
+        <w:rPr>
+          <w:b/>
+          <w:sz w:val="18"/>
+        </w:rPr>
+        <w:t xml:space="preserve"> </w:t>
+      </w:r>
+      <w:r>
+        <w:rPr>
+          <w:b/>
+          <w:sz w:val="18"/>
+        </w:rPr>
+        <w:t xml:space="preserve">0.887 at</w:t>
+      </w:r>
+      <w:r>
+        <w:rPr>
+          <w:b/>
+          <w:sz w:val="18"/>
+        </w:rPr>
+        <w:t xml:space="preserve"> </w:t>
+      </w:r>
+      <w:r>
+        <w:rPr>
+          <w:b/>
+          <w:sz w:val="18"/>
+        </w:rPr>
+        <w:t xml:space="preserve">the</w:t>
+      </w:r>
+      <w:r>
+        <w:rPr>
+          <w:b/>
+          <w:sz w:val="18"/>
+        </w:rPr>
+        <w:t xml:space="preserve"> </w:t>
+      </w:r>
+      <w:r>
+        <w:rPr>
+          <w:b/>
+          <w:sz w:val="18"/>
+        </w:rPr>
+        <w:t xml:space="preserve">same</w:t>
+      </w:r>
+      <w:r>
+        <w:rPr>
+          <w:b/>
+          <w:sz w:val="18"/>
+        </w:rPr>
+        <w:t xml:space="preserve"> </w:t>
+      </w:r>
+      <w:r>
+        <w:rPr>
+          <w:b/>
+          <w:sz w:val="18"/>
+        </w:rPr>
+        <w:t xml:space="preserve">list</w:t>
+      </w:r>
+      <w:r>
+        <w:rPr>
+          <w:b/>
+          <w:sz w:val="18"/>
+        </w:rPr>
+        <w:t xml:space="preserve"> </w:t>
+      </w:r>
+      <w:r>
+        <w:rPr>
+          <w:b/>
+          <w:sz w:val="18"/>
+        </w:rPr>
+        <w:t xml:space="preserve">size</w:t>
+      </w:r>
+      <w:r>
+        <w:rPr>
+          <w:b/>
+          <w:sz w:val="18"/>
+        </w:rPr>
+        <w:t xml:space="preserve"> </w:t>
+      </w:r>
+      <w:r>
+        <w:rPr>
+          <w:b/>
+          <w:sz w:val="18"/>
+        </w:rPr>
+        <w:t xml:space="preserve">(+0.038),</w:t>
+      </w:r>
+      <w:r>
+        <w:rPr>
+          <w:b/>
+          <w:sz w:val="18"/>
+        </w:rPr>
+        <w:t xml:space="preserve"> </w:t>
+      </w:r>
+      <w:r>
+        <w:rPr>
+          <w:b/>
+          <w:sz w:val="18"/>
+        </w:rPr>
+        <w:t xml:space="preserve">leaving</w:t>
+      </w:r>
+      <w:r>
+        <w:rPr>
+          <w:b/>
+          <w:sz w:val="18"/>
+        </w:rPr>
+        <w:t xml:space="preserve"> </w:t>
+      </w:r>
+      <w:r>
+        <w:rPr>
+          <w:b/>
+          <w:sz w:val="18"/>
+        </w:rPr>
+        <w:t xml:space="preserve">7.7%</w:t>
+      </w:r>
+      <w:r>
+        <w:rPr>
+          <w:b/>
+          <w:sz w:val="18"/>
+        </w:rPr>
+        <w:t xml:space="preserve"> </w:t>
+      </w:r>
+      <w:r>
+        <w:rPr>
+          <w:b/>
+          <w:sz w:val="18"/>
+        </w:rPr>
+        <w:t xml:space="preserve">of</w:t>
+      </w:r>
+      <w:r>
+        <w:rPr>
+          <w:b/>
+          <w:sz w:val="18"/>
+        </w:rPr>
+        <w:t xml:space="preserve"> </w:t>
+      </w:r>
+      <w:r>
+        <w:rPr>
+          <w:b/>
+          <w:sz w:val="18"/>
+        </w:rPr>
+        <w:t xml:space="preserve">targets</w:t>
+      </w:r>
+      <w:r>
+        <w:rPr>
+          <w:b/>
+          <w:sz w:val="18"/>
+        </w:rPr>
+        <w:t xml:space="preserve"> </w:t>
+      </w:r>
+      <w:r>
+        <w:rPr>
+          <w:b/>
+          <w:sz w:val="18"/>
+        </w:rPr>
+        <w:t xml:space="preserve">out</w:t>
+      </w:r>
+      <w:r>
+        <w:rPr>
+          <w:b/>
+          <w:sz w:val="18"/>
+        </w:rPr>
+        <w:t xml:space="preserve"> </w:t>
+      </w:r>
+      <w:r>
+        <w:rPr>
+          <w:b/>
+          <w:sz w:val="18"/>
+        </w:rPr>
+        <w:t xml:space="preserve">of</w:t>
+      </w:r>
+      <w:r>
+        <w:rPr>
+          <w:b/>
+          <w:sz w:val="18"/>
+        </w:rPr>
+        <w:t xml:space="preserve"> </w:t>
+      </w:r>
+      <w:r>
+        <w:rPr>
+          <w:b/>
+          <w:sz w:val="18"/>
+        </w:rPr>
+        <w:t xml:space="preserve">reach</w:t>
+      </w:r>
+      <w:r>
+        <w:rPr>
+          <w:b/>
+          <w:sz w:val="18"/>
+        </w:rPr>
+        <w:t xml:space="preserve"> </w:t>
+      </w:r>
+      <w:r>
+        <w:rPr>
+          <w:b/>
+          <w:sz w:val="18"/>
+        </w:rPr>
+        <w:t xml:space="preserve">of</w:t>
+      </w:r>
+      <w:r>
+        <w:rPr>
+          <w:b/>
+          <w:sz w:val="18"/>
+        </w:rPr>
+        <w:t xml:space="preserve"> </w:t>
+      </w:r>
+      <w:r>
+        <w:rPr>
+          <w:b/>
+          <w:sz w:val="18"/>
+        </w:rPr>
+        <w:t xml:space="preserve">every</w:t>
+      </w:r>
+      <w:r>
+        <w:rPr>
+          <w:b/>
+          <w:sz w:val="18"/>
+        </w:rPr>
+        <w:t xml:space="preserve"> </w:t>
+      </w:r>
+      <w:r>
+        <w:rPr>
+          <w:b/>
+          <w:sz w:val="18"/>
+        </w:rPr>
+        <w:t xml:space="preserve">method</w:t>
+      </w:r>
+      <w:r>
+        <w:rPr>
+          <w:b/>
+          <w:sz w:val="18"/>
+        </w:rPr>
+        <w:t xml:space="preserve"> </w:t>
+      </w:r>
+      <w:r>
+        <w:rPr>
+          <w:b/>
+          <w:sz w:val="18"/>
+        </w:rPr>
+        <w:t xml:space="preserve">tested.</w:t>
       </w:r>
       <w:r>
         <w:rPr>
@@ -5685,7 +6035,7 @@
         <w:t xml:space="preserve"> </w:t>
       </w:r>
       <w:r>
-        <w:t xml:space="preserve">We define reachability on the final extractor prompt for known change events, distinguish it from retrieval recall, and measure it over store sizes, message forms and kinds of change on two test sets (Sec. VIII). A controlled study on a new test set of 40 personas with 15 selection variants, including same-size, keyword (BM25) and fused baselines and change messages held out from the selection’s cue words, shows that removing the minimum score and searching per sentence each add about 0.1, that more candidates on a change cue add almost nothing on their own, that the adaptive selection reaches the same share as a plain larger list while showing 19% fewer candidates, that keyword and fused rankings do no better than the plain list, and that about one target in ten stays out of reach of every variant (Sec. IX).</w:t>
+        <w:t xml:space="preserve">We define reachability on the final extractor prompt for known change events, distinguish it from retrieval recall, and measure it over store sizes, message forms and kinds of change on two test sets (Sec. VIII). A controlled study on a new test set of 40 personas with 15 selection variants, including same-size, keyword (BM25) and fused baselines and change messages held out from the selection’s cue words, shows that removing the minimum score and searching per sentence each add about 0.1, that more candidates on a change cue add almost nothing on their own, that the adaptive selection reaches the same share as a plain larger list while showing 19% fewer candidates, that keyword and fused rankings do no better than the plain list, that a cross-encoder reranker does better at the same list size, and that about one target in thirteen stays out of reach of every method tested (Sec. IX).</w:t>
       </w:r>
     </w:p>
     <w:p>
@@ -26811,6 +27161,7 @@
           <w:p>
             <w:pPr>
               <w:pStyle w:val="Compact"/>
+              <w:keepNext/>
               <w:spacing w:after="0"/>
               <w:jc w:val="left"/>
             </w:pPr>
@@ -26849,6 +27200,7 @@
           <w:p>
             <w:pPr>
               <w:pStyle w:val="Compact"/>
+              <w:keepNext/>
               <w:spacing w:after="0"/>
               <w:jc w:val="left"/>
             </w:pPr>
@@ -26871,6 +27223,7 @@
           <w:p>
             <w:pPr>
               <w:pStyle w:val="Compact"/>
+              <w:keepNext/>
               <w:spacing w:after="0"/>
               <w:jc w:val="left"/>
             </w:pPr>
@@ -26893,6 +27246,7 @@
           <w:p>
             <w:pPr>
               <w:pStyle w:val="Compact"/>
+              <w:keepNext/>
               <w:spacing w:after="0"/>
               <w:jc w:val="left"/>
             </w:pPr>
@@ -26915,6 +27269,7 @@
           <w:p>
             <w:pPr>
               <w:pStyle w:val="Compact"/>
+              <w:keepNext/>
               <w:spacing w:after="0"/>
               <w:jc w:val="left"/>
             </w:pPr>
@@ -26937,6 +27292,7 @@
           <w:p>
             <w:pPr>
               <w:pStyle w:val="Compact"/>
+              <w:keepNext/>
               <w:spacing w:after="0"/>
               <w:jc w:val="left"/>
             </w:pPr>
@@ -26959,6 +27315,7 @@
           <w:p>
             <w:pPr>
               <w:pStyle w:val="Compact"/>
+              <w:keepNext/>
               <w:spacing w:after="0"/>
               <w:jc w:val="left"/>
             </w:pPr>
@@ -26981,6 +27338,7 @@
           <w:p>
             <w:pPr>
               <w:pStyle w:val="Compact"/>
+              <w:keepNext/>
               <w:spacing w:after="0"/>
               <w:jc w:val="left"/>
             </w:pPr>
@@ -26990,6 +27348,200 @@
                 <w:sz w:val="16"/>
               </w:rPr>
               <w:t xml:space="preserve">0.899 / 0.823 / 0.835</w:t>
+            </w:r>
+          </w:p>
+        </w:tc>
+      </w:tr>
+      <w:tr>
+        <w:tc>
+          <w:tcPr>
+            <w:tcMar>
+              <w:left w:w="40" w:type="dxa"/>
+              <w:right w:w="40" w:type="dxa"/>
+            </w:tcMar>
+          </w:tcPr>
+          <w:p>
+            <w:pPr>
+              <w:pStyle w:val="Compact"/>
+              <w:spacing w:after="0"/>
+              <w:jc w:val="left"/>
+            </w:pPr>
+            <w:r>
+              <w:rPr>
+                <w:rFonts w:ascii="Times New Roman" w:hAnsi="Times New Roman"/>
+                <w:sz w:val="16"/>
+              </w:rPr>
+              <w:t xml:space="preserve">cross-encoder rerank of top 50,</w:t>
+            </w:r>
+            <w:r>
+              <w:rPr>
+                <w:rFonts w:ascii="Times New Roman" w:hAnsi="Times New Roman"/>
+                <w:sz w:val="16"/>
+              </w:rPr>
+              <w:t xml:space="preserve"> </w:t>
+            </w:r>
+            <w:r>
+              <w:rPr>
+                <w:iCs/>
+                <w:rFonts w:ascii="Times New Roman" w:hAnsi="Times New Roman"/>
+                <w:i/>
+                <w:sz w:val="16"/>
+              </w:rPr>
+              <w:t xml:space="preserve">k=24</w:t>
+            </w:r>
+          </w:p>
+        </w:tc>
+        <w:tc>
+          <w:tcPr>
+            <w:tcMar>
+              <w:left w:w="40" w:type="dxa"/>
+              <w:right w:w="40" w:type="dxa"/>
+            </w:tcMar>
+          </w:tcPr>
+          <w:p>
+            <w:pPr>
+              <w:pStyle w:val="Compact"/>
+              <w:spacing w:after="0"/>
+              <w:jc w:val="left"/>
+            </w:pPr>
+            <w:r>
+              <w:rPr>
+                <w:rFonts w:ascii="Times New Roman" w:hAnsi="Times New Roman"/>
+                <w:sz w:val="16"/>
+              </w:rPr>
+              <w:t xml:space="preserve">reranker</w:t>
+            </w:r>
+          </w:p>
+        </w:tc>
+        <w:tc>
+          <w:tcPr>
+            <w:tcMar>
+              <w:left w:w="40" w:type="dxa"/>
+              <w:right w:w="40" w:type="dxa"/>
+            </w:tcMar>
+          </w:tcPr>
+          <w:p>
+            <w:pPr>
+              <w:pStyle w:val="Compact"/>
+              <w:spacing w:after="0"/>
+              <w:jc w:val="left"/>
+            </w:pPr>
+            <w:r>
+              <w:rPr>
+                <w:rFonts w:ascii="Times New Roman" w:hAnsi="Times New Roman"/>
+                <w:sz w:val="16"/>
+              </w:rPr>
+              <w:t xml:space="preserve">no</w:t>
+            </w:r>
+          </w:p>
+        </w:tc>
+        <w:tc>
+          <w:tcPr>
+            <w:tcMar>
+              <w:left w:w="40" w:type="dxa"/>
+              <w:right w:w="40" w:type="dxa"/>
+            </w:tcMar>
+          </w:tcPr>
+          <w:p>
+            <w:pPr>
+              <w:pStyle w:val="Compact"/>
+              <w:spacing w:after="0"/>
+              <w:jc w:val="left"/>
+            </w:pPr>
+            <w:r>
+              <w:rPr>
+                <w:rFonts w:ascii="Times New Roman" w:hAnsi="Times New Roman"/>
+                <w:sz w:val="16"/>
+              </w:rPr>
+              <w:t xml:space="preserve">–</w:t>
+            </w:r>
+          </w:p>
+        </w:tc>
+        <w:tc>
+          <w:tcPr>
+            <w:tcMar>
+              <w:left w:w="40" w:type="dxa"/>
+              <w:right w:w="40" w:type="dxa"/>
+            </w:tcMar>
+          </w:tcPr>
+          <w:p>
+            <w:pPr>
+              <w:pStyle w:val="Compact"/>
+              <w:spacing w:after="0"/>
+              <w:jc w:val="left"/>
+            </w:pPr>
+            <w:r>
+              <w:rPr>
+                <w:rFonts w:ascii="Times New Roman" w:hAnsi="Times New Roman"/>
+                <w:sz w:val="16"/>
+              </w:rPr>
+              <w:t xml:space="preserve">24</w:t>
+            </w:r>
+          </w:p>
+        </w:tc>
+        <w:tc>
+          <w:tcPr>
+            <w:tcMar>
+              <w:left w:w="40" w:type="dxa"/>
+              <w:right w:w="40" w:type="dxa"/>
+            </w:tcMar>
+          </w:tcPr>
+          <w:p>
+            <w:pPr>
+              <w:pStyle w:val="Compact"/>
+              <w:spacing w:after="0"/>
+              <w:jc w:val="left"/>
+            </w:pPr>
+            <w:r>
+              <w:rPr>
+                <w:rFonts w:ascii="Times New Roman" w:hAnsi="Times New Roman"/>
+                <w:sz w:val="16"/>
+              </w:rPr>
+              <w:t xml:space="preserve">0.887 [0.876, 0.898]</w:t>
+            </w:r>
+          </w:p>
+        </w:tc>
+        <w:tc>
+          <w:tcPr>
+            <w:tcMar>
+              <w:left w:w="40" w:type="dxa"/>
+              <w:right w:w="40" w:type="dxa"/>
+            </w:tcMar>
+          </w:tcPr>
+          <w:p>
+            <w:pPr>
+              <w:pStyle w:val="Compact"/>
+              <w:spacing w:after="0"/>
+              <w:jc w:val="left"/>
+            </w:pPr>
+            <w:r>
+              <w:rPr>
+                <w:rFonts w:ascii="Times New Roman" w:hAnsi="Times New Roman"/>
+                <w:sz w:val="16"/>
+              </w:rPr>
+              <w:t xml:space="preserve">31.5</w:t>
+            </w:r>
+          </w:p>
+        </w:tc>
+        <w:tc>
+          <w:tcPr>
+            <w:tcMar>
+              <w:left w:w="40" w:type="dxa"/>
+              <w:right w:w="40" w:type="dxa"/>
+            </w:tcMar>
+          </w:tcPr>
+          <w:p>
+            <w:pPr>
+              <w:pStyle w:val="Compact"/>
+              <w:spacing w:after="0"/>
+              <w:jc w:val="left"/>
+            </w:pPr>
+            <w:r>
+              <w:rPr>
+                <w:rFonts w:ascii="Times New Roman" w:hAnsi="Times New Roman"/>
+                <w:sz w:val="16"/>
+              </w:rPr>
+              <w:t xml:space="preserve">0.939 / 0.834 / 0.878</w:t>
             </w:r>
           </w:p>
         </w:tc>
@@ -28400,13 +28952,22 @@
           <w:bCs/>
           <w:b/>
         </w:rPr>
-        <w:t xml:space="preserve">What no variant fixes.</w:t>
-      </w:r>
-      <w:r>
-        <w:t xml:space="preserve"> </w:t>
-      </w:r>
-      <w:r>
-        <w:t xml:space="preserve">At</w:t>
+        <w:t xml:space="preserve">A cross-encoder reranker.</w:t>
+      </w:r>
+      <w:r>
+        <w:t xml:space="preserve"> </w:t>
+      </w:r>
+      <w:r>
+        <w:t xml:space="preserve">As a stronger retrieval baseline we reranked the 50 best whole-message matches of AURA’s search (no minimum score) with a cross-encoder (</w:t>
+      </w:r>
+      <w:r>
+        <w:rPr>
+          <w:rStyle w:val="VerbatimChar"/>
+        </w:rPr>
+        <w:t xml:space="preserve">ms-marco-MiniLM-L-6-v2</w:t>
+      </w:r>
+      <w:r>
+        <w:t xml:space="preserve">, quantised, run locally) and showed the top 24 plus the recent memories, on the same events and stores at</w:t>
       </w:r>
       <w:r>
         <w:t xml:space="preserve"> </w:t>
@@ -28419,7 +28980,64 @@
         <w:t xml:space="preserve">N=350</w:t>
       </w:r>
       <w:r>
-        <w:t xml:space="preserve">, 10.0% of change events are reached by none of the 15 conditions, and only 0.849 of targets are among the 24 best matches for the whole message even without a minimum score. These are messages that name the new value but share little with the stored sentence, for example a car model mentioned without the word</w:t>
+        <w:t xml:space="preserve">. The reranker reaches 0.887 [0.876, 0.898] with 31.5 candidates, the same number as the plain list: +0.038 over the plain list (36 personas better, 1 worse, Holm</w:t>
+      </w:r>
+      <w:r>
+        <w:t xml:space="preserve"> </w:t>
+      </w:r>
+      <w:r>
+        <w:rPr>
+          <w:iCs/>
+          <w:i/>
+        </w:rPr>
+        <w:t xml:space="preserve">p&lt;0.001</w:t>
+      </w:r>
+      <w:r>
+        <w:t xml:space="preserve">), +0.042 over the adaptive mode, and +0.017 over per-sentence search with 24 matches (Holm</w:t>
+      </w:r>
+      <w:r>
+        <w:t xml:space="preserve"> </w:t>
+      </w:r>
+      <w:r>
+        <w:rPr>
+          <w:iCs/>
+          <w:i/>
+        </w:rPr>
+        <w:t xml:space="preserve">p=0.050</w:t>
+      </w:r>
+      <w:r>
+        <w:t xml:space="preserve">, not significant). Its ceiling is the pool: the target is among the 50 candidates in 0.903 of events. It is weakest on mixed turns (0.834), where per-sentence search helps the other selections; reranking per sentence was not tried. The five reranker comparisons form a third Holm family, added after the pre-registered design; the reranker was run on the authors’ machine because its download is blocked in the environment used for the other runs (Table XIV, last row; Fig. 6 does not include it).</w:t>
+      </w:r>
+    </w:p>
+    <w:p>
+      <w:pPr>
+        <w:pStyle w:val="BodyText"/>
+      </w:pPr>
+      <w:r>
+        <w:rPr>
+          <w:bCs/>
+          <w:b/>
+        </w:rPr>
+        <w:t xml:space="preserve">What no variant fixes.</w:t>
+      </w:r>
+      <w:r>
+        <w:t xml:space="preserve"> </w:t>
+      </w:r>
+      <w:r>
+        <w:t xml:space="preserve">At</w:t>
+      </w:r>
+      <w:r>
+        <w:t xml:space="preserve"> </w:t>
+      </w:r>
+      <w:r>
+        <w:rPr>
+          <w:iCs/>
+          <w:i/>
+        </w:rPr>
+        <w:t xml:space="preserve">N=350</w:t>
+      </w:r>
+      <w:r>
+        <w:t xml:space="preserve">, 10.0% of change events are reached by none of the 15 conditions (7.7% also not by the reranker), and only 0.849 of targets are among the 24 best matches for the whole message even without a minimum score. These are messages that name the new value but share little with the stored sentence, for example a car model mentioned without the word</w:t>
       </w:r>
       <w:r>
         <w:t xml:space="preserve"> </w:t>
@@ -42307,7 +42925,7 @@
         <w:t xml:space="preserve"> </w:t>
       </w:r>
       <w:r>
-        <w:t xml:space="preserve">is the wrong default for choosing what an update may touch. (iii) Search per sentence when messages are mixed. (iv) Do not rely on cue words: in our second test set they added almost nothing on their own and made the adaptive mode weaker on messages phrased without them; a plain larger list did as well at a somewhat larger prompt. (v) Budget for more prompt tokens (about 35% with F2 in the real runs) and slightly more review cards.</w:t>
+        <w:t xml:space="preserve">is the wrong default for choosing what an update may touch. (iii) Search per sentence when messages are mixed. (iv) Do not rely on cue words: in our second test set they added almost nothing on their own and made the adaptive mode weaker on messages phrased without them; a plain larger list did as well at a somewhat larger prompt, and reranking that list with a cross-encoder did better. (v) Budget for more prompt tokens (about 35% with F2 in the real runs) and slightly more review cards.</w:t>
       </w:r>
     </w:p>
     <w:p>
@@ -42361,7 +42979,7 @@
         <w:t xml:space="preserve"> </w:t>
       </w:r>
       <w:r>
-        <w:t xml:space="preserve">F2 enlarges the prompt by about a third, and in the selection study a plain list of the same size reached as many targets. Keyword and fused rankings did no better, and about one target in ten at</w:t>
+        <w:t xml:space="preserve">F2 enlarges the prompt by about a third, and in the selection study a plain list of the same size reached as many targets. Keyword and fused rankings did no better; a cross-encoder reranker over the 50 best matches did, by about four points at the same list size, at the cost of one reranking pass per message. About one target in thirteen at</w:t>
       </w:r>
       <w:r>
         <w:t xml:space="preserve"> </w:t>
@@ -42377,7 +42995,7 @@
         <w:t xml:space="preserve"> </w:t>
       </w:r>
       <w:r>
-        <w:t xml:space="preserve">was out of reach of every list we tried. Closing that gap needs a different mechanism: a stronger retriever or reranker for the update query, a second extraction pass over the whole store when a change is suspected, or a structured memory with typed slots in which an update names its slot. A learned admission gate</w:t>
+        <w:t xml:space="preserve">was out of reach of every method we tried. Closing that gap needs a different mechanism: a second extraction pass over the whole store when a change is suspected, or a structured memory with typed slots in which an update names its slot. A learned admission gate</w:t>
       </w:r>
       <w:r>
         <w:t xml:space="preserve"> </w:t>
@@ -42639,7 +43257,7 @@
         <w:t xml:space="preserve"> </w:t>
       </w:r>
       <w:r>
-        <w:t xml:space="preserve">About one target in ten is out of reach of every list we tried, including keyword and fused rankings; a cross-encoder reranker (a script is provided with the harness), slot-typed memories and a second pass over the store are the next candidates.</w:t>
+        <w:t xml:space="preserve">About one target in thirteen is out of reach of every method we tried, a cross-encoder reranker included; per-sentence reranking, slot-typed memories and a second pass over the store are the next candidates.</w:t>
       </w:r>
       <w:r>
         <w:t xml:space="preserve"> </w:t>
@@ -42705,7 +43323,7 @@
         <w:pStyle w:val="FirstParagraph"/>
       </w:pPr>
       <w:r>
-        <w:t xml:space="preserve">A review gate on memory changes is effective against the errors it can see: in our experiments it removes almost all of the true facts that automatic application destroys. It cannot repair updates the extractor never proposes, and in a retrieval-based design these are governed by which memories reach the extractor’s prompt. We made this precise (an update can succeed only if its target is in the prompt, and the gate acts only after that), measured it, and identified what moves it: removing the minimum score and searching per sentence each raise reachability by about ten points, extra candidates on a change cue add little on their own, and an adaptive selection is matched by a plain larger list, which it beats only in prompt size. With two real Gemini extractors, the adaptive selection (run together with the re-proposal rule) left no change target missing and no stale fact under the gate, at about a third more prompt tokens, while about one target in ten remains out of reach of every list we tried, keyword and fused rankings included. The practical lesson for user-controlled memories is to measure and report what the extractor can reach, and to compare any remedy against a plain larger list. Evaluating with real users, with an oracle-target condition, in other languages and with larger real samples is the next step; the code, both test-set generators and every raw result file are provided.</w:t>
+        <w:t xml:space="preserve">A review gate on memory changes is effective against the errors it can see: in our experiments it removes almost all of the true facts that automatic application destroys. It cannot repair updates the extractor never proposes, and in a retrieval-based design these are governed by which memories reach the extractor’s prompt. We made this precise (an update can succeed only if its target is in the prompt, and the gate acts only after that), measured it, and identified what moves it: removing the minimum score and searching per sentence each raise reachability by about ten points, extra candidates on a change cue add little on their own, and an adaptive selection is matched by a plain larger list, which it beats only in prompt size. With two real Gemini extractors, the adaptive selection (run together with the re-proposal rule) left no change target missing and no stale fact under the gate, at about a third more prompt tokens, while keyword and fused rankings did no better than a plain larger list, a cross-encoder reranker did better at the same list size, and about one target in thirteen remains out of reach of every method tried. The practical lesson for user-controlled memories is to measure and report what the extractor can reach, and to compare any remedy against a plain larger list. Evaluating with real users, with an oracle-target condition, in other languages and with larger real samples is the next step; the code, both test-set generators and every raw result file are provided.</w:t>
       </w:r>
     </w:p>
     <w:bookmarkEnd w:id="80"/>

</xml_diff>

<commit_message>
Paper: real-model pilot (oracle target, same-size list) on 6 clean personas; keep pilot results and note on quota failures
Co-Authored-By: Claude Sonnet 5.5 <noreply@anthropic.com>
Claude-Session: https://claude.ai/code/session_0199uMN2tRAqpJR3sfk69y1g
</commit_message>
<xml_diff>
--- a/paper/aura-paper.docx
+++ b/paper/aura-paper.docx
@@ -23850,7 +23850,7 @@
       <w:r/>
     </w:p>
     <w:bookmarkEnd w:id="54"/>
-    <w:bookmarkStart w:id="58" w:name="sec:selection"/>
+    <w:bookmarkStart w:id="59" w:name="sec:selection"/>
     <w:p>
       <w:pPr>
         <w:pStyle w:val="Heading1"/>
@@ -29089,23 +29089,13 @@
         <w:t xml:space="preserve">a conversation distribution; comparisons between selections on the same events are the robust result.</w:t>
       </w:r>
     </w:p>
-    <w:bookmarkEnd w:id="58"/>
-    <w:bookmarkStart w:id="63" w:name="sec:ablation"/>
-    <w:p>
-      <w:pPr>
-        <w:pStyle w:val="Heading1"/>
-      </w:pPr>
-      <w:r>
-        <w:t>X. Results: Ablation of the Two Switches</w:t>
-      </w:r>
-    </w:p>
-    <w:bookmarkStart w:id="62" w:name="simulated"/>
+    <w:bookmarkStart w:id="58" w:name="sec:pilot"/>
     <w:p>
       <w:pPr>
         <w:pStyle w:val="Heading2"/>
       </w:pPr>
       <w:r>
-        <w:t>A. Simulated</w:t>
+        <w:t>A. Real-model pilot: oracle target and same-size list</w:t>
       </w:r>
     </w:p>
     <w:p>
@@ -29113,7 +29103,932 @@
         <w:pStyle w:val="FirstParagraph"/>
       </w:pPr>
       <w:r>
-        <w:t xml:space="preserve">Table XVI and Fig. 7 give the paired ablation under the gate (error sweep,</w:t>
+        <w:t xml:space="preserve">The selection study measures reachability only. To see whether reachability turns into correct updates with a real extractor, we ran a pilot with Gemini (</w:t>
+      </w:r>
+      <w:r>
+        <w:rPr>
+          <w:rStyle w:val="VerbatimChar"/>
+        </w:rPr>
+        <w:t xml:space="preserve">gemini-3.5-flash-lite</w:t>
+      </w:r>
+      <w:r>
+        <w:t xml:space="preserve">), the review gate and an oracle reviewer, on the personas of the new test set: 18 turns per persona (12 change turns, the others new facts and unrelated chatter), 100 unrelated memories, four selections. Besides the default, the adaptive selection and a plain list of 24 matches without minimum score, an</w:t>
+      </w:r>
+      <w:r>
+        <w:t xml:space="preserve"> </w:t>
+      </w:r>
+      <w:r>
+        <w:rPr>
+          <w:iCs/>
+          <w:i/>
+        </w:rPr>
+        <w:t xml:space="preserve">oracle-target</w:t>
+      </w:r>
+      <w:r>
+        <w:t xml:space="preserve"> </w:t>
+      </w:r>
+      <w:r>
+        <w:t xml:space="preserve">condition adds the true target to the default candidates; it is a diagnostic upper bound on what better selection could give, not a method. Eight personas were planned. Two (p07 and p08) failed because the API quota was exhausted (HTTP 429 on all their turns in seven of eight runs); we excluded them, and report the six personas whose four runs completed without any error (72 change turns per selection). The result is a pilot: six personas, one seed, one model, and persona-clustered intervals that are wide.</w:t>
+      </w:r>
+    </w:p>
+    <w:p>
+      <w:pPr>
+        <w:pStyle w:val="BodyText"/>
+        <w:keepNext/>
+        <w:spacing w:after="60"/>
+        <w:jc w:val="center"/>
+      </w:pPr>
+      <w:r>
+        <w:rPr>
+          <w:bCs/>
+          <w:b/>
+          <w:smallCaps w:val="0"/>
+          <w:sz w:val="16"/>
+        </w:rPr>
+        <w:t xml:space="preserve">TABLE XVI</w:t>
+      </w:r>
+      <w:r>
+        <w:rPr>
+          <w:smallCaps w:val="0"/>
+          <w:sz w:val="16"/>
+        </w:rPr>
+        <w:br/>
+      </w:r>
+      <w:r>
+        <w:rPr>
+          <w:smallCaps w:val="0"/>
+          <w:sz w:val="16"/>
+        </w:rPr>
+        <w:t xml:space="preserve">Real-model pilot (6 personas, 72 change turns per row, gate with oracle reviewer). Reach: target in the prompt; right op. given reach: correct update among turns where the target was in the prompt; success: correct update accepted; stale: facts still outdated at the end (per persona).</w:t>
+      </w:r>
+    </w:p>
+    <w:tbl>
+      <w:tblPr>
+        <w:tblStyle w:val="Table"/>
+        <w:jc w:val="center"/>
+        <w:tblLook w:firstRow="1" w:lastRow="0" w:firstColumn="0" w:lastColumn="0" w:noHBand="0" w:noVBand="0" w:val="0020"/>
+        <w:tblBorders>
+          <w:top w:val="single" w:sz="8" w:color="000000"/>
+          <w:bottom w:val="single" w:sz="8" w:color="000000"/>
+        </w:tblBorders>
+        <w:tblW w:w="5000" w:type="pct"/>
+        <w:tblLayout w:type="autofit"/>
+      </w:tblPr>
+      <w:tblGrid>
+        <w:gridCol w:w="1131"/>
+        <w:gridCol w:w="1131"/>
+        <w:gridCol w:w="1131"/>
+        <w:gridCol w:w="1131"/>
+        <w:gridCol w:w="1131"/>
+        <w:gridCol w:w="1131"/>
+        <w:gridCol w:w="1131"/>
+      </w:tblGrid>
+      <w:tr>
+        <w:trPr>
+          <w:tblHeader w:val="true"/>
+        </w:trPr>
+        <w:tc>
+          <w:tcPr>
+            <w:tcMar>
+              <w:left w:w="40" w:type="dxa"/>
+              <w:right w:w="40" w:type="dxa"/>
+            </w:tcMar>
+          </w:tcPr>
+          <w:p>
+            <w:pPr>
+              <w:pStyle w:val="Compact"/>
+              <w:keepNext/>
+              <w:spacing w:after="0"/>
+              <w:jc w:val="left"/>
+            </w:pPr>
+            <w:r>
+              <w:rPr>
+                <w:rFonts w:ascii="Times New Roman" w:hAnsi="Times New Roman"/>
+                <w:sz w:val="12"/>
+              </w:rPr>
+              <w:t xml:space="preserve">Selection</w:t>
+            </w:r>
+          </w:p>
+        </w:tc>
+        <w:tc>
+          <w:tcPr>
+            <w:tcMar>
+              <w:left w:w="40" w:type="dxa"/>
+              <w:right w:w="40" w:type="dxa"/>
+            </w:tcMar>
+          </w:tcPr>
+          <w:p>
+            <w:pPr>
+              <w:pStyle w:val="Compact"/>
+              <w:keepNext/>
+              <w:spacing w:after="0"/>
+              <w:jc w:val="left"/>
+            </w:pPr>
+            <w:r>
+              <w:rPr>
+                <w:rFonts w:ascii="Times New Roman" w:hAnsi="Times New Roman"/>
+                <w:sz w:val="12"/>
+              </w:rPr>
+              <w:t xml:space="preserve">Cand.</w:t>
+            </w:r>
+          </w:p>
+        </w:tc>
+        <w:tc>
+          <w:tcPr>
+            <w:tcMar>
+              <w:left w:w="40" w:type="dxa"/>
+              <w:right w:w="40" w:type="dxa"/>
+            </w:tcMar>
+          </w:tcPr>
+          <w:p>
+            <w:pPr>
+              <w:pStyle w:val="Compact"/>
+              <w:keepNext/>
+              <w:spacing w:after="0"/>
+              <w:jc w:val="left"/>
+            </w:pPr>
+            <w:r>
+              <w:rPr>
+                <w:rFonts w:ascii="Times New Roman" w:hAnsi="Times New Roman"/>
+                <w:sz w:val="12"/>
+              </w:rPr>
+              <w:t xml:space="preserve">Reach</w:t>
+            </w:r>
+          </w:p>
+        </w:tc>
+        <w:tc>
+          <w:tcPr>
+            <w:tcMar>
+              <w:left w:w="40" w:type="dxa"/>
+              <w:right w:w="40" w:type="dxa"/>
+            </w:tcMar>
+          </w:tcPr>
+          <w:p>
+            <w:pPr>
+              <w:pStyle w:val="Compact"/>
+              <w:keepNext/>
+              <w:spacing w:after="0"/>
+              <w:jc w:val="left"/>
+            </w:pPr>
+            <w:r>
+              <w:rPr>
+                <w:rFonts w:ascii="Times New Roman" w:hAnsi="Times New Roman"/>
+                <w:sz w:val="12"/>
+              </w:rPr>
+              <w:t xml:space="preserve">Right op. given reach</w:t>
+            </w:r>
+          </w:p>
+        </w:tc>
+        <w:tc>
+          <w:tcPr>
+            <w:tcMar>
+              <w:left w:w="40" w:type="dxa"/>
+              <w:right w:w="40" w:type="dxa"/>
+            </w:tcMar>
+          </w:tcPr>
+          <w:p>
+            <w:pPr>
+              <w:pStyle w:val="Compact"/>
+              <w:keepNext/>
+              <w:spacing w:after="0"/>
+              <w:jc w:val="left"/>
+            </w:pPr>
+            <w:r>
+              <w:rPr>
+                <w:rFonts w:ascii="Times New Roman" w:hAnsi="Times New Roman"/>
+                <w:sz w:val="12"/>
+              </w:rPr>
+              <w:t xml:space="preserve">Success (95% CI)</w:t>
+            </w:r>
+          </w:p>
+        </w:tc>
+        <w:tc>
+          <w:tcPr>
+            <w:tcMar>
+              <w:left w:w="40" w:type="dxa"/>
+              <w:right w:w="40" w:type="dxa"/>
+            </w:tcMar>
+          </w:tcPr>
+          <w:p>
+            <w:pPr>
+              <w:pStyle w:val="Compact"/>
+              <w:keepNext/>
+              <w:spacing w:after="0"/>
+              <w:jc w:val="left"/>
+            </w:pPr>
+            <w:r>
+              <w:rPr>
+                <w:rFonts w:ascii="Times New Roman" w:hAnsi="Times New Roman"/>
+                <w:sz w:val="12"/>
+              </w:rPr>
+              <w:t xml:space="preserve">Stale at end</w:t>
+            </w:r>
+          </w:p>
+        </w:tc>
+        <w:tc>
+          <w:tcPr>
+            <w:tcMar>
+              <w:left w:w="40" w:type="dxa"/>
+              <w:right w:w="40" w:type="dxa"/>
+            </w:tcMar>
+          </w:tcPr>
+          <w:p>
+            <w:pPr>
+              <w:pStyle w:val="Compact"/>
+              <w:keepNext/>
+              <w:spacing w:after="0"/>
+              <w:jc w:val="left"/>
+            </w:pPr>
+            <w:r>
+              <w:rPr>
+                <w:rFonts w:ascii="Times New Roman" w:hAnsi="Times New Roman"/>
+                <w:sz w:val="12"/>
+              </w:rPr>
+              <w:t xml:space="preserve">Tokens/call</w:t>
+            </w:r>
+          </w:p>
+        </w:tc>
+      </w:tr>
+      <w:tr>
+        <w:tc>
+          <w:tcPr>
+            <w:tcMar>
+              <w:left w:w="40" w:type="dxa"/>
+              <w:right w:w="40" w:type="dxa"/>
+            </w:tcMar>
+          </w:tcPr>
+          <w:p>
+            <w:pPr>
+              <w:pStyle w:val="Compact"/>
+              <w:keepNext/>
+              <w:spacing w:after="0"/>
+              <w:jc w:val="left"/>
+            </w:pPr>
+            <w:r>
+              <w:rPr>
+                <w:rFonts w:ascii="Times New Roman" w:hAnsi="Times New Roman"/>
+                <w:sz w:val="12"/>
+              </w:rPr>
+              <w:t xml:space="preserve">Default (12 matches, min. score)</w:t>
+            </w:r>
+          </w:p>
+        </w:tc>
+        <w:tc>
+          <w:tcPr>
+            <w:tcMar>
+              <w:left w:w="40" w:type="dxa"/>
+              <w:right w:w="40" w:type="dxa"/>
+            </w:tcMar>
+          </w:tcPr>
+          <w:p>
+            <w:pPr>
+              <w:pStyle w:val="Compact"/>
+              <w:keepNext/>
+              <w:spacing w:after="0"/>
+              <w:jc w:val="left"/>
+            </w:pPr>
+            <w:r>
+              <w:rPr>
+                <w:rFonts w:ascii="Times New Roman" w:hAnsi="Times New Roman"/>
+                <w:sz w:val="12"/>
+              </w:rPr>
+              <w:t xml:space="preserve">10.4</w:t>
+            </w:r>
+          </w:p>
+        </w:tc>
+        <w:tc>
+          <w:tcPr>
+            <w:tcMar>
+              <w:left w:w="40" w:type="dxa"/>
+              <w:right w:w="40" w:type="dxa"/>
+            </w:tcMar>
+          </w:tcPr>
+          <w:p>
+            <w:pPr>
+              <w:pStyle w:val="Compact"/>
+              <w:keepNext/>
+              <w:spacing w:after="0"/>
+              <w:jc w:val="left"/>
+            </w:pPr>
+            <w:r>
+              <w:rPr>
+                <w:rFonts w:ascii="Times New Roman" w:hAnsi="Times New Roman"/>
+                <w:sz w:val="12"/>
+              </w:rPr>
+              <w:t xml:space="preserve">0.67</w:t>
+            </w:r>
+          </w:p>
+        </w:tc>
+        <w:tc>
+          <w:tcPr>
+            <w:tcMar>
+              <w:left w:w="40" w:type="dxa"/>
+              <w:right w:w="40" w:type="dxa"/>
+            </w:tcMar>
+          </w:tcPr>
+          <w:p>
+            <w:pPr>
+              <w:pStyle w:val="Compact"/>
+              <w:keepNext/>
+              <w:spacing w:after="0"/>
+              <w:jc w:val="left"/>
+            </w:pPr>
+            <w:r>
+              <w:rPr>
+                <w:rFonts w:ascii="Times New Roman" w:hAnsi="Times New Roman"/>
+                <w:sz w:val="12"/>
+              </w:rPr>
+              <w:t xml:space="preserve">0.91</w:t>
+            </w:r>
+          </w:p>
+        </w:tc>
+        <w:tc>
+          <w:tcPr>
+            <w:tcMar>
+              <w:left w:w="40" w:type="dxa"/>
+              <w:right w:w="40" w:type="dxa"/>
+            </w:tcMar>
+          </w:tcPr>
+          <w:p>
+            <w:pPr>
+              <w:pStyle w:val="Compact"/>
+              <w:keepNext/>
+              <w:spacing w:after="0"/>
+              <w:jc w:val="left"/>
+            </w:pPr>
+            <w:r>
+              <w:rPr>
+                <w:rFonts w:ascii="Times New Roman" w:hAnsi="Times New Roman"/>
+                <w:sz w:val="12"/>
+              </w:rPr>
+              <w:t xml:space="preserve">0.61 (0.51–0.69)</w:t>
+            </w:r>
+          </w:p>
+        </w:tc>
+        <w:tc>
+          <w:tcPr>
+            <w:tcMar>
+              <w:left w:w="40" w:type="dxa"/>
+              <w:right w:w="40" w:type="dxa"/>
+            </w:tcMar>
+          </w:tcPr>
+          <w:p>
+            <w:pPr>
+              <w:pStyle w:val="Compact"/>
+              <w:keepNext/>
+              <w:spacing w:after="0"/>
+              <w:jc w:val="left"/>
+            </w:pPr>
+            <w:r>
+              <w:rPr>
+                <w:rFonts w:ascii="Times New Roman" w:hAnsi="Times New Roman"/>
+                <w:sz w:val="12"/>
+              </w:rPr>
+              <w:t xml:space="preserve">4.7</w:t>
+            </w:r>
+          </w:p>
+        </w:tc>
+        <w:tc>
+          <w:tcPr>
+            <w:tcMar>
+              <w:left w:w="40" w:type="dxa"/>
+              <w:right w:w="40" w:type="dxa"/>
+            </w:tcMar>
+          </w:tcPr>
+          <w:p>
+            <w:pPr>
+              <w:pStyle w:val="Compact"/>
+              <w:keepNext/>
+              <w:spacing w:after="0"/>
+              <w:jc w:val="left"/>
+            </w:pPr>
+            <w:r>
+              <w:rPr>
+                <w:rFonts w:ascii="Times New Roman" w:hAnsi="Times New Roman"/>
+                <w:sz w:val="12"/>
+              </w:rPr>
+              <w:t xml:space="preserve">645</w:t>
+            </w:r>
+          </w:p>
+        </w:tc>
+      </w:tr>
+      <w:tr>
+        <w:tc>
+          <w:tcPr>
+            <w:tcMar>
+              <w:left w:w="40" w:type="dxa"/>
+              <w:right w:w="40" w:type="dxa"/>
+            </w:tcMar>
+          </w:tcPr>
+          <w:p>
+            <w:pPr>
+              <w:pStyle w:val="Compact"/>
+              <w:keepNext/>
+              <w:spacing w:after="0"/>
+              <w:jc w:val="left"/>
+            </w:pPr>
+            <w:r>
+              <w:rPr>
+                <w:rFonts w:ascii="Times New Roman" w:hAnsi="Times New Roman"/>
+                <w:sz w:val="12"/>
+              </w:rPr>
+              <w:t xml:space="preserve">Adaptive (F2)</w:t>
+            </w:r>
+          </w:p>
+        </w:tc>
+        <w:tc>
+          <w:tcPr>
+            <w:tcMar>
+              <w:left w:w="40" w:type="dxa"/>
+              <w:right w:w="40" w:type="dxa"/>
+            </w:tcMar>
+          </w:tcPr>
+          <w:p>
+            <w:pPr>
+              <w:pStyle w:val="Compact"/>
+              <w:keepNext/>
+              <w:spacing w:after="0"/>
+              <w:jc w:val="left"/>
+            </w:pPr>
+            <w:r>
+              <w:rPr>
+                <w:rFonts w:ascii="Times New Roman" w:hAnsi="Times New Roman"/>
+                <w:sz w:val="12"/>
+              </w:rPr>
+              <w:t xml:space="preserve">23.0</w:t>
+            </w:r>
+          </w:p>
+        </w:tc>
+        <w:tc>
+          <w:tcPr>
+            <w:tcMar>
+              <w:left w:w="40" w:type="dxa"/>
+              <w:right w:w="40" w:type="dxa"/>
+            </w:tcMar>
+          </w:tcPr>
+          <w:p>
+            <w:pPr>
+              <w:pStyle w:val="Compact"/>
+              <w:keepNext/>
+              <w:spacing w:after="0"/>
+              <w:jc w:val="left"/>
+            </w:pPr>
+            <w:r>
+              <w:rPr>
+                <w:rFonts w:ascii="Times New Roman" w:hAnsi="Times New Roman"/>
+                <w:sz w:val="12"/>
+              </w:rPr>
+              <w:t xml:space="preserve">0.93</w:t>
+            </w:r>
+          </w:p>
+        </w:tc>
+        <w:tc>
+          <w:tcPr>
+            <w:tcMar>
+              <w:left w:w="40" w:type="dxa"/>
+              <w:right w:w="40" w:type="dxa"/>
+            </w:tcMar>
+          </w:tcPr>
+          <w:p>
+            <w:pPr>
+              <w:pStyle w:val="Compact"/>
+              <w:keepNext/>
+              <w:spacing w:after="0"/>
+              <w:jc w:val="left"/>
+            </w:pPr>
+            <w:r>
+              <w:rPr>
+                <w:rFonts w:ascii="Times New Roman" w:hAnsi="Times New Roman"/>
+                <w:sz w:val="12"/>
+              </w:rPr>
+              <w:t xml:space="preserve">0.91</w:t>
+            </w:r>
+          </w:p>
+        </w:tc>
+        <w:tc>
+          <w:tcPr>
+            <w:tcMar>
+              <w:left w:w="40" w:type="dxa"/>
+              <w:right w:w="40" w:type="dxa"/>
+            </w:tcMar>
+          </w:tcPr>
+          <w:p>
+            <w:pPr>
+              <w:pStyle w:val="Compact"/>
+              <w:keepNext/>
+              <w:spacing w:after="0"/>
+              <w:jc w:val="left"/>
+            </w:pPr>
+            <w:r>
+              <w:rPr>
+                <w:rFonts w:ascii="Times New Roman" w:hAnsi="Times New Roman"/>
+                <w:sz w:val="12"/>
+              </w:rPr>
+              <w:t xml:space="preserve">0.85 (0.81–0.89)</w:t>
+            </w:r>
+          </w:p>
+        </w:tc>
+        <w:tc>
+          <w:tcPr>
+            <w:tcMar>
+              <w:left w:w="40" w:type="dxa"/>
+              <w:right w:w="40" w:type="dxa"/>
+            </w:tcMar>
+          </w:tcPr>
+          <w:p>
+            <w:pPr>
+              <w:pStyle w:val="Compact"/>
+              <w:keepNext/>
+              <w:spacing w:after="0"/>
+              <w:jc w:val="left"/>
+            </w:pPr>
+            <w:r>
+              <w:rPr>
+                <w:rFonts w:ascii="Times New Roman" w:hAnsi="Times New Roman"/>
+                <w:sz w:val="12"/>
+              </w:rPr>
+              <w:t xml:space="preserve">1.8</w:t>
+            </w:r>
+          </w:p>
+        </w:tc>
+        <w:tc>
+          <w:tcPr>
+            <w:tcMar>
+              <w:left w:w="40" w:type="dxa"/>
+              <w:right w:w="40" w:type="dxa"/>
+            </w:tcMar>
+          </w:tcPr>
+          <w:p>
+            <w:pPr>
+              <w:pStyle w:val="Compact"/>
+              <w:keepNext/>
+              <w:spacing w:after="0"/>
+              <w:jc w:val="left"/>
+            </w:pPr>
+            <w:r>
+              <w:rPr>
+                <w:rFonts w:ascii="Times New Roman" w:hAnsi="Times New Roman"/>
+                <w:sz w:val="12"/>
+              </w:rPr>
+              <w:t xml:space="preserve">890</w:t>
+            </w:r>
+          </w:p>
+        </w:tc>
+      </w:tr>
+      <w:tr>
+        <w:tc>
+          <w:tcPr>
+            <w:tcMar>
+              <w:left w:w="40" w:type="dxa"/>
+              <w:right w:w="40" w:type="dxa"/>
+            </w:tcMar>
+          </w:tcPr>
+          <w:p>
+            <w:pPr>
+              <w:pStyle w:val="Compact"/>
+              <w:keepNext/>
+              <w:spacing w:after="0"/>
+              <w:jc w:val="left"/>
+            </w:pPr>
+            <w:r>
+              <w:rPr>
+                <w:rFonts w:ascii="Times New Roman" w:hAnsi="Times New Roman"/>
+                <w:sz w:val="12"/>
+              </w:rPr>
+              <w:t xml:space="preserve">Plain list of 24, no min. score</w:t>
+            </w:r>
+          </w:p>
+        </w:tc>
+        <w:tc>
+          <w:tcPr>
+            <w:tcMar>
+              <w:left w:w="40" w:type="dxa"/>
+              <w:right w:w="40" w:type="dxa"/>
+            </w:tcMar>
+          </w:tcPr>
+          <w:p>
+            <w:pPr>
+              <w:pStyle w:val="Compact"/>
+              <w:keepNext/>
+              <w:spacing w:after="0"/>
+              <w:jc w:val="left"/>
+            </w:pPr>
+            <w:r>
+              <w:rPr>
+                <w:rFonts w:ascii="Times New Roman" w:hAnsi="Times New Roman"/>
+                <w:sz w:val="12"/>
+              </w:rPr>
+              <w:t xml:space="preserve">30.2</w:t>
+            </w:r>
+          </w:p>
+        </w:tc>
+        <w:tc>
+          <w:tcPr>
+            <w:tcMar>
+              <w:left w:w="40" w:type="dxa"/>
+              <w:right w:w="40" w:type="dxa"/>
+            </w:tcMar>
+          </w:tcPr>
+          <w:p>
+            <w:pPr>
+              <w:pStyle w:val="Compact"/>
+              <w:keepNext/>
+              <w:spacing w:after="0"/>
+              <w:jc w:val="left"/>
+            </w:pPr>
+            <w:r>
+              <w:rPr>
+                <w:rFonts w:ascii="Times New Roman" w:hAnsi="Times New Roman"/>
+                <w:sz w:val="12"/>
+              </w:rPr>
+              <w:t xml:space="preserve">0.97</w:t>
+            </w:r>
+          </w:p>
+        </w:tc>
+        <w:tc>
+          <w:tcPr>
+            <w:tcMar>
+              <w:left w:w="40" w:type="dxa"/>
+              <w:right w:w="40" w:type="dxa"/>
+            </w:tcMar>
+          </w:tcPr>
+          <w:p>
+            <w:pPr>
+              <w:pStyle w:val="Compact"/>
+              <w:keepNext/>
+              <w:spacing w:after="0"/>
+              <w:jc w:val="left"/>
+            </w:pPr>
+            <w:r>
+              <w:rPr>
+                <w:rFonts w:ascii="Times New Roman" w:hAnsi="Times New Roman"/>
+                <w:sz w:val="12"/>
+              </w:rPr>
+              <w:t xml:space="preserve">0.90</w:t>
+            </w:r>
+          </w:p>
+        </w:tc>
+        <w:tc>
+          <w:tcPr>
+            <w:tcMar>
+              <w:left w:w="40" w:type="dxa"/>
+              <w:right w:w="40" w:type="dxa"/>
+            </w:tcMar>
+          </w:tcPr>
+          <w:p>
+            <w:pPr>
+              <w:pStyle w:val="Compact"/>
+              <w:keepNext/>
+              <w:spacing w:after="0"/>
+              <w:jc w:val="left"/>
+            </w:pPr>
+            <w:r>
+              <w:rPr>
+                <w:rFonts w:ascii="Times New Roman" w:hAnsi="Times New Roman"/>
+                <w:sz w:val="12"/>
+              </w:rPr>
+              <w:t xml:space="preserve">0.88 (0.78–0.96)</w:t>
+            </w:r>
+          </w:p>
+        </w:tc>
+        <w:tc>
+          <w:tcPr>
+            <w:tcMar>
+              <w:left w:w="40" w:type="dxa"/>
+              <w:right w:w="40" w:type="dxa"/>
+            </w:tcMar>
+          </w:tcPr>
+          <w:p>
+            <w:pPr>
+              <w:pStyle w:val="Compact"/>
+              <w:keepNext/>
+              <w:spacing w:after="0"/>
+              <w:jc w:val="left"/>
+            </w:pPr>
+            <w:r>
+              <w:rPr>
+                <w:rFonts w:ascii="Times New Roman" w:hAnsi="Times New Roman"/>
+                <w:sz w:val="12"/>
+              </w:rPr>
+              <w:t xml:space="preserve">1.5</w:t>
+            </w:r>
+          </w:p>
+        </w:tc>
+        <w:tc>
+          <w:tcPr>
+            <w:tcMar>
+              <w:left w:w="40" w:type="dxa"/>
+              <w:right w:w="40" w:type="dxa"/>
+            </w:tcMar>
+          </w:tcPr>
+          <w:p>
+            <w:pPr>
+              <w:pStyle w:val="Compact"/>
+              <w:keepNext/>
+              <w:spacing w:after="0"/>
+              <w:jc w:val="left"/>
+            </w:pPr>
+            <w:r>
+              <w:rPr>
+                <w:rFonts w:ascii="Times New Roman" w:hAnsi="Times New Roman"/>
+                <w:sz w:val="12"/>
+              </w:rPr>
+              <w:t xml:space="preserve">1033</w:t>
+            </w:r>
+          </w:p>
+        </w:tc>
+      </w:tr>
+      <w:tr>
+        <w:tc>
+          <w:tcPr>
+            <w:tcMar>
+              <w:left w:w="40" w:type="dxa"/>
+              <w:right w:w="40" w:type="dxa"/>
+            </w:tcMar>
+          </w:tcPr>
+          <w:p>
+            <w:pPr>
+              <w:pStyle w:val="Compact"/>
+              <w:spacing w:after="0"/>
+              <w:jc w:val="left"/>
+            </w:pPr>
+            <w:r>
+              <w:rPr>
+                <w:rFonts w:ascii="Times New Roman" w:hAnsi="Times New Roman"/>
+                <w:sz w:val="12"/>
+              </w:rPr>
+              <w:t xml:space="preserve">Default + true target (oracle)</w:t>
+            </w:r>
+          </w:p>
+        </w:tc>
+        <w:tc>
+          <w:tcPr>
+            <w:tcMar>
+              <w:left w:w="40" w:type="dxa"/>
+              <w:right w:w="40" w:type="dxa"/>
+            </w:tcMar>
+          </w:tcPr>
+          <w:p>
+            <w:pPr>
+              <w:pStyle w:val="Compact"/>
+              <w:spacing w:after="0"/>
+              <w:jc w:val="left"/>
+            </w:pPr>
+            <w:r>
+              <w:rPr>
+                <w:rFonts w:ascii="Times New Roman" w:hAnsi="Times New Roman"/>
+                <w:sz w:val="12"/>
+              </w:rPr>
+              <w:t xml:space="preserve">10.7</w:t>
+            </w:r>
+          </w:p>
+        </w:tc>
+        <w:tc>
+          <w:tcPr>
+            <w:tcMar>
+              <w:left w:w="40" w:type="dxa"/>
+              <w:right w:w="40" w:type="dxa"/>
+            </w:tcMar>
+          </w:tcPr>
+          <w:p>
+            <w:pPr>
+              <w:pStyle w:val="Compact"/>
+              <w:spacing w:after="0"/>
+              <w:jc w:val="left"/>
+            </w:pPr>
+            <w:r>
+              <w:rPr>
+                <w:rFonts w:ascii="Times New Roman" w:hAnsi="Times New Roman"/>
+                <w:sz w:val="12"/>
+              </w:rPr>
+              <w:t xml:space="preserve">1.00</w:t>
+            </w:r>
+          </w:p>
+        </w:tc>
+        <w:tc>
+          <w:tcPr>
+            <w:tcMar>
+              <w:left w:w="40" w:type="dxa"/>
+              <w:right w:w="40" w:type="dxa"/>
+            </w:tcMar>
+          </w:tcPr>
+          <w:p>
+            <w:pPr>
+              <w:pStyle w:val="Compact"/>
+              <w:spacing w:after="0"/>
+              <w:jc w:val="left"/>
+            </w:pPr>
+            <w:r>
+              <w:rPr>
+                <w:rFonts w:ascii="Times New Roman" w:hAnsi="Times New Roman"/>
+                <w:sz w:val="12"/>
+              </w:rPr>
+              <w:t xml:space="preserve">0.90</w:t>
+            </w:r>
+          </w:p>
+        </w:tc>
+        <w:tc>
+          <w:tcPr>
+            <w:tcMar>
+              <w:left w:w="40" w:type="dxa"/>
+              <w:right w:w="40" w:type="dxa"/>
+            </w:tcMar>
+          </w:tcPr>
+          <w:p>
+            <w:pPr>
+              <w:pStyle w:val="Compact"/>
+              <w:spacing w:after="0"/>
+              <w:jc w:val="left"/>
+            </w:pPr>
+            <w:r>
+              <w:rPr>
+                <w:rFonts w:ascii="Times New Roman" w:hAnsi="Times New Roman"/>
+                <w:sz w:val="12"/>
+              </w:rPr>
+              <w:t xml:space="preserve">0.90 (0.85–0.96)</w:t>
+            </w:r>
+          </w:p>
+        </w:tc>
+        <w:tc>
+          <w:tcPr>
+            <w:tcMar>
+              <w:left w:w="40" w:type="dxa"/>
+              <w:right w:w="40" w:type="dxa"/>
+            </w:tcMar>
+          </w:tcPr>
+          <w:p>
+            <w:pPr>
+              <w:pStyle w:val="Compact"/>
+              <w:spacing w:after="0"/>
+              <w:jc w:val="left"/>
+            </w:pPr>
+            <w:r>
+              <w:rPr>
+                <w:rFonts w:ascii="Times New Roman" w:hAnsi="Times New Roman"/>
+                <w:sz w:val="12"/>
+              </w:rPr>
+              <w:t xml:space="preserve">1.2</w:t>
+            </w:r>
+          </w:p>
+        </w:tc>
+        <w:tc>
+          <w:tcPr>
+            <w:tcMar>
+              <w:left w:w="40" w:type="dxa"/>
+              <w:right w:w="40" w:type="dxa"/>
+            </w:tcMar>
+          </w:tcPr>
+          <w:p>
+            <w:pPr>
+              <w:pStyle w:val="Compact"/>
+              <w:spacing w:after="0"/>
+              <w:jc w:val="left"/>
+            </w:pPr>
+            <w:r>
+              <w:rPr>
+                <w:rFonts w:ascii="Times New Roman" w:hAnsi="Times New Roman"/>
+                <w:sz w:val="12"/>
+              </w:rPr>
+              <w:t xml:space="preserve">650</w:t>
+            </w:r>
+          </w:p>
+        </w:tc>
+      </w:tr>
+    </w:tbl>
+    <w:p>
+      <w:pPr>
+        <w:pStyle w:val="BodyText"/>
+      </w:pPr>
+      <w:r>
+        <w:t xml:space="preserve">Table XVI shows three things. First, reachability carries through: success rose from 0.61 under the default to 0.85 (adaptive) and 0.88 (plain list of 24), and the number of outdated facts left at the end fell from 4.7 to 1.8 and 1.5 per persona. Second, once the target is in the prompt the model gets the update right about nine times in ten in every condition (0.91 to 0.91), and adding the true target to the default prompt gave 0.90 success; the remaining error, about one change turn in ten, is therefore not a selection problem in this setting. Third, the plain list of 24 was as good as the adaptive selection (0.88 against 0.85, with overlapping intervals) at about 1033 against 890 prompt tokens per call; with six personas we cannot say that either is better, and this agrees with the selection study, where the two were equal in reachability. The intervals of the adaptive, plain-list and oracle rows overlap; only the default differs clearly from the others.</w:t>
+      </w:r>
+    </w:p>
+    <w:bookmarkEnd w:id="58"/>
+    <w:bookmarkEnd w:id="59"/>
+    <w:bookmarkStart w:id="64" w:name="sec:ablation"/>
+    <w:p>
+      <w:pPr>
+        <w:pStyle w:val="Heading1"/>
+      </w:pPr>
+      <w:r>
+        <w:t>X. Results: Ablation of the Two Switches</w:t>
+      </w:r>
+    </w:p>
+    <w:bookmarkStart w:id="63" w:name="simulated"/>
+    <w:p>
+      <w:pPr>
+        <w:pStyle w:val="Heading2"/>
+      </w:pPr>
+      <w:r>
+        <w:t>A. Simulated</w:t>
+      </w:r>
+    </w:p>
+    <w:p>
+      <w:pPr>
+        <w:pStyle w:val="FirstParagraph"/>
+      </w:pPr>
+      <w:r>
+        <w:t xml:space="preserve">Table XVII and Fig. 7 give the paired ablation under the gate (error sweep,</w:t>
       </w:r>
       <w:r>
         <w:t xml:space="preserve"> </w:t>
@@ -29266,7 +30181,7 @@
           <w:smallCaps w:val="0"/>
           <w:sz w:val="16"/>
         </w:rPr>
-        <w:t xml:space="preserve">TABLE XVI</w:t>
+        <w:t xml:space="preserve">TABLE XVII</w:t>
       </w:r>
       <w:r>
         <w:rPr>
@@ -31278,18 +32193,18 @@
           <wp:inline>
             <wp:extent cx="6400800" cy="2491095"/>
             <wp:effectExtent b="0" l="0" r="0" t="0"/>
-            <wp:docPr descr="image" title="" id="60" name="Picture"/>
+            <wp:docPr descr="image" title="" id="61" name="Picture"/>
             <a:graphic>
               <a:graphicData uri="http://schemas.openxmlformats.org/drawingml/2006/picture">
                 <pic:pic>
                   <pic:nvPicPr>
-                    <pic:cNvPr descr="figures/fig5_ablation.png" id="61" name="Picture"/>
+                    <pic:cNvPr descr="figures/fig5_ablation.png" id="62" name="Picture"/>
                     <pic:cNvPicPr>
                       <a:picLocks noChangeArrowheads="1" noChangeAspect="1"/>
                     </pic:cNvPicPr>
                   </pic:nvPicPr>
                   <pic:blipFill>
-                    <a:blip r:embed="rId59"/>
+                    <a:blip r:embed="rId60"/>
                     <a:stretch>
                       <a:fillRect/>
                     </a:stretch>
@@ -31356,9 +32271,9 @@
       </w:pPr>
       <w:r/>
     </w:p>
-    <w:bookmarkEnd w:id="62"/>
     <w:bookmarkEnd w:id="63"/>
-    <w:bookmarkStart w:id="72" w:name="sec:real"/>
+    <w:bookmarkEnd w:id="64"/>
+    <w:bookmarkStart w:id="73" w:name="sec:real"/>
     <w:p>
       <w:pPr>
         <w:pStyle w:val="Heading1"/>
@@ -31372,7 +32287,7 @@
         <w:pStyle w:val="FirstParagraph"/>
       </w:pPr>
       <w:r>
-        <w:t xml:space="preserve">Table XVII and Fig. 8 give the same ablation with a real extractor (12 personas, one seed, oracle user). Table XVIII repeats baseline and F1+F2 with a second model.</w:t>
+        <w:t xml:space="preserve">Table XVIII and Fig. 8 give the same ablation with a real extractor (12 personas, one seed, oracle user). Table XIX repeats baseline and F1+F2 with a second model.</w:t>
       </w:r>
     </w:p>
     <w:p>
@@ -31402,7 +32317,7 @@
           <w:smallCaps w:val="0"/>
           <w:sz w:val="16"/>
         </w:rPr>
-        <w:t xml:space="preserve">TABLE XVII</w:t>
+        <w:t xml:space="preserve">TABLE XVIII</w:t>
       </w:r>
       <w:r>
         <w:rPr>
@@ -33059,7 +33974,7 @@
           <w:smallCaps w:val="0"/>
           <w:sz w:val="16"/>
         </w:rPr>
-        <w:t xml:space="preserve">TABLE XVIII</w:t>
+        <w:t xml:space="preserve">TABLE XIX</w:t>
       </w:r>
       <w:r>
         <w:rPr>
@@ -34023,18 +34938,18 @@
           <wp:inline>
             <wp:extent cx="6400800" cy="2122606"/>
             <wp:effectExtent b="0" l="0" r="0" t="0"/>
-            <wp:docPr descr="image" title="" id="65" name="Picture"/>
+            <wp:docPr descr="image" title="" id="66" name="Picture"/>
             <a:graphic>
               <a:graphicData uri="http://schemas.openxmlformats.org/drawingml/2006/picture">
                 <pic:pic>
                   <pic:nvPicPr>
-                    <pic:cNvPr descr="figures/fig6_real.png" id="66" name="Picture"/>
+                    <pic:cNvPr descr="figures/fig6_real.png" id="67" name="Picture"/>
                     <pic:cNvPicPr>
                       <a:picLocks noChangeArrowheads="1" noChangeAspect="1"/>
                     </pic:cNvPicPr>
                   </pic:nvPicPr>
                   <pic:blipFill>
-                    <a:blip r:embed="rId64"/>
+                    <a:blip r:embed="rId65"/>
                     <a:stretch>
                       <a:fillRect/>
                     </a:stretch>
@@ -34116,7 +35031,7 @@
         <w:t xml:space="preserve"> </w:t>
       </w:r>
       <w:r>
-        <w:t xml:space="preserve">With the baseline selection, the target memory was missing from the prompt on 25 of 136 change turns (first model; both policies together) and 22 of 136 (second model). With F1+F2 it was missing on 0 and 0. This is the mechanism of Sec. VIII observed with real conversations. The real runs compared the default with F2 only; the same-budget list that matched F2 in Sec. IX was not run with a real model, so we cannot say whether it would give the same end-to-end result.</w:t>
+        <w:t xml:space="preserve">With the baseline selection, the target memory was missing from the prompt on 25 of 136 change turns (first model; both policies together) and 22 of 136 (second model). With F1+F2 it was missing on 0 and 0. This is the mechanism of Sec. VIII observed with real conversations. The 12-persona real runs compared the default with F2 only; the same-budget list and an oracle-target condition were run later in a six-persona pilot (Sec. IX-A), in which the plain list matched F2 end to end.</w:t>
       </w:r>
     </w:p>
     <w:p>
@@ -34309,8 +35224,8 @@
       <w:r>
         <w:t xml:space="preserve">), not significant. Of the change prompts, 68 of 69 (first model) and 68 of 72 (second) in the F1+F2 runs were correct changes that the user accepted, against 56 of 65 and 55 of 68 for the baselines; this is consistent with the added prompts being updates that the baseline missed.</w:t>
       </w:r>
-      <w:bookmarkStart w:id="67" w:name="sec:cost"/>
-      <w:bookmarkEnd w:id="67"/>
+      <w:bookmarkStart w:id="68" w:name="sec:cost"/>
+      <w:bookmarkEnd w:id="68"/>
     </w:p>
     <w:p>
       <w:pPr>
@@ -34330,7 +35245,7 @@
         <w:t xml:space="preserve">Under auto-apply the F2-only variant stored 3 false facts across 12 personas where the baseline stored none, and F1+F2 stored none again; with these counts we cannot say whether this is an effect of F2 or noise.</w:t>
       </w:r>
     </w:p>
-    <w:bookmarkStart w:id="68" w:name="per-persona-results"/>
+    <w:bookmarkStart w:id="69" w:name="per-persona-results"/>
     <w:p>
       <w:pPr>
         <w:pStyle w:val="Heading2"/>
@@ -34344,7 +35259,7 @@
         <w:pStyle w:val="FirstParagraph"/>
       </w:pPr>
       <w:r>
-        <w:t xml:space="preserve">Table XIX lists every persona of the first model under the gate. With the baseline selection, 10 of 12 personas ended with at least one stale fact and 10 had at least one change target missing from the prompt; with F1+F2 none did. Persona 9 has the same F1 under both settings. Persona 3 has a lower F1 under F1+F2 because the model stored one more hypothetical sentence (</w:t>
+        <w:t xml:space="preserve">Table XX lists every persona of the first model under the gate. With the baseline selection, 10 of 12 personas ended with at least one stale fact and 10 had at least one change target missing from the prompt; with F1+F2 none did. Persona 9 has the same F1 under both settings. Persona 3 has a lower F1 under F1+F2 because the model stored one more hypothetical sentence (</w:t>
       </w:r>
       <w:r>
         <w:t xml:space="preserve">“</w:t>
@@ -34386,7 +35301,7 @@
           <w:smallCaps w:val="0"/>
           <w:sz w:val="16"/>
         </w:rPr>
-        <w:t xml:space="preserve">TABLE XIX</w:t>
+        <w:t xml:space="preserve">TABLE XX</w:t>
       </w:r>
       <w:r>
         <w:rPr>
@@ -36826,8 +37741,8 @@
       </w:pPr>
       <w:r/>
     </w:p>
-    <w:bookmarkEnd w:id="68"/>
-    <w:bookmarkStart w:id="69" w:name="sec:example"/>
+    <w:bookmarkEnd w:id="69"/>
+    <w:bookmarkStart w:id="70" w:name="sec:example"/>
     <w:p>
       <w:pPr>
         <w:pStyle w:val="Heading2"/>
@@ -36841,7 +37756,7 @@
         <w:pStyle w:val="FirstParagraph"/>
       </w:pPr>
       <w:r>
-        <w:t xml:space="preserve">Persona 1 (Table IV) is a typical case. Table XX shows the proposals made under the baseline, Table XXI the final memories, and Tables XXII and XXIII the same under F1+F2. Under the baseline the extractor updated the gym time, the city (twice) and forgot the birthday, but it never proposed to replace</w:t>
+        <w:t xml:space="preserve">Persona 1 (Table IV) is a typical case. Table XXI shows the proposals made under the baseline, Table XXII the final memories, and Tables XXIII and XXIV the same under F1+F2. Under the baseline the extractor updated the gym time, the city (twice) and forgot the birthday, but it never proposed to replace</w:t>
       </w:r>
       <w:r>
         <w:t xml:space="preserve"> </w:t>
@@ -36944,7 +37859,7 @@
           <w:smallCaps w:val="0"/>
           <w:sz w:val="16"/>
         </w:rPr>
-        <w:t xml:space="preserve">TABLE XX</w:t>
+        <w:t xml:space="preserve">TABLE XXI</w:t>
       </w:r>
       <w:r>
         <w:rPr>
@@ -37707,7 +38622,7 @@
           <w:smallCaps w:val="0"/>
           <w:sz w:val="16"/>
         </w:rPr>
-        <w:t xml:space="preserve">TABLE XXI</w:t>
+        <w:t xml:space="preserve">TABLE XXII</w:t>
       </w:r>
       <w:r>
         <w:rPr>
@@ -38608,7 +39523,7 @@
           <w:smallCaps w:val="0"/>
           <w:sz w:val="16"/>
         </w:rPr>
-        <w:t xml:space="preserve">TABLE XXII</w:t>
+        <w:t xml:space="preserve">TABLE XXIII</w:t>
       </w:r>
       <w:r>
         <w:rPr>
@@ -39495,7 +40410,7 @@
           <w:smallCaps w:val="0"/>
           <w:sz w:val="16"/>
         </w:rPr>
-        <w:t xml:space="preserve">TABLE XXIII</w:t>
+        <w:t xml:space="preserve">TABLE XXIV</w:t>
       </w:r>
       <w:r>
         <w:rPr>
@@ -40453,8 +41368,8 @@
         </w:tc>
       </w:tr>
     </w:tbl>
-    <w:bookmarkEnd w:id="69"/>
-    <w:bookmarkStart w:id="70" w:name="cost-in-requests-tokens-and-time"/>
+    <w:bookmarkEnd w:id="70"/>
+    <w:bookmarkStart w:id="71" w:name="cost-in-requests-tokens-and-time"/>
     <w:p>
       <w:pPr>
         <w:pStyle w:val="Heading2"/>
@@ -40468,7 +41383,7 @@
         <w:pStyle w:val="FirstParagraph"/>
       </w:pPr>
       <w:r>
-        <w:t xml:space="preserve">Table XXIV gives the cost per persona. The number of requests is the same (one extraction per user turn); prompt tokens grow by about 35% because more candidates are listed; output tokens are unchanged. Measured time per request is not a reliable cost measure here: it changed from 5.61 s to 9.39 s with the first model but from 6.15 s to 5.74 s with the second, which indicates that API load during the runs, not the prompt size, dominated.</w:t>
+        <w:t xml:space="preserve">Table XXV gives the cost per persona. The number of requests is the same (one extraction per user turn); prompt tokens grow by about 35% because more candidates are listed; output tokens are unchanged. Measured time per request is not a reliable cost measure here: it changed from 5.61 s to 9.39 s with the first model but from 6.15 s to 5.74 s with the second, which indicates that API load during the runs, not the prompt size, dominated.</w:t>
       </w:r>
     </w:p>
     <w:p>
@@ -40498,7 +41413,7 @@
           <w:smallCaps w:val="0"/>
           <w:sz w:val="16"/>
         </w:rPr>
-        <w:t xml:space="preserve">TABLE XXIV</w:t>
+        <w:t xml:space="preserve">TABLE XXV</w:t>
       </w:r>
       <w:r>
         <w:rPr>
@@ -41234,8 +42149,8 @@
       </w:pPr>
       <w:r/>
     </w:p>
-    <w:bookmarkEnd w:id="70"/>
-    <w:bookmarkStart w:id="71" w:name="scorer-validity"/>
+    <w:bookmarkEnd w:id="71"/>
+    <w:bookmarkStart w:id="72" w:name="scorer-validity"/>
     <w:p>
       <w:pPr>
         <w:pStyle w:val="Heading2"/>
@@ -41249,7 +42164,7 @@
         <w:pStyle w:val="FirstParagraph"/>
       </w:pPr>
       <w:r>
-        <w:t xml:space="preserve">Table XXV shows the agreement of the automatic labels with the author’s hand labels. Three of 195 + 175 memories differ; in all three the automatic scorer labelled a correct statement of unemployment or finished project as</w:t>
+        <w:t xml:space="preserve">Table XXVI shows the agreement of the automatic labels with the author’s hand labels. Three of 195 + 175 memories differ; in all three the automatic scorer labelled a correct statement of unemployment or finished project as</w:t>
       </w:r>
       <w:r>
         <w:t xml:space="preserve"> </w:t>
@@ -41302,7 +42217,7 @@
           <w:smallCaps w:val="0"/>
           <w:sz w:val="16"/>
         </w:rPr>
-        <w:t xml:space="preserve">TABLE XXV</w:t>
+        <w:t xml:space="preserve">TABLE XXVI</w:t>
       </w:r>
       <w:r>
         <w:rPr>
@@ -41704,9 +42619,9 @@
         </w:tc>
       </w:tr>
     </w:tbl>
-    <w:bookmarkEnd w:id="71"/>
     <w:bookmarkEnd w:id="72"/>
-    <w:bookmarkStart w:id="76" w:name="sec:lme"/>
+    <w:bookmarkEnd w:id="73"/>
+    <w:bookmarkStart w:id="77" w:name="sec:lme"/>
     <w:p>
       <w:pPr>
         <w:pStyle w:val="Heading1"/>
@@ -41776,7 +42691,7 @@
           <w:smallCaps w:val="0"/>
           <w:sz w:val="16"/>
         </w:rPr>
-        <w:t xml:space="preserve">TABLE XXVI</w:t>
+        <w:t xml:space="preserve">TABLE XXVII</w:t>
       </w:r>
       <w:r>
         <w:rPr>
@@ -42728,18 +43643,18 @@
           <wp:inline>
             <wp:extent cx="3108960" cy="2032665"/>
             <wp:effectExtent b="0" l="0" r="0" t="0"/>
-            <wp:docPr descr="image" title="" id="74" name="Picture"/>
+            <wp:docPr descr="image" title="" id="75" name="Picture"/>
             <a:graphic>
               <a:graphicData uri="http://schemas.openxmlformats.org/drawingml/2006/picture">
                 <pic:pic>
                   <pic:nvPicPr>
-                    <pic:cNvPr descr="figures/fig7_lme.png" id="75" name="Picture"/>
+                    <pic:cNvPr descr="figures/fig7_lme.png" id="76" name="Picture"/>
                     <pic:cNvPicPr>
                       <a:picLocks noChangeArrowheads="1" noChangeAspect="1"/>
                     </pic:cNvPicPr>
                   </pic:nvPicPr>
                   <pic:blipFill>
-                    <a:blip r:embed="rId73"/>
+                    <a:blip r:embed="rId74"/>
                     <a:stretch>
                       <a:fillRect/>
                     </a:stretch>
@@ -42798,7 +43713,7 @@
         <w:pStyle w:val="BodyText"/>
       </w:pPr>
       <w:r>
-        <w:t xml:space="preserve">Table XXVI and Fig. 9 show that the gate system improves from 0.267 to 0.433 (0 questions worse, 5 better,</w:t>
+        <w:t xml:space="preserve">Table XXVII and Fig. 9 show that the gate system improves from 0.267 to 0.433 (0 questions worse, 5 better,</w:t>
       </w:r>
       <w:r>
         <w:t xml:space="preserve"> </w:t>
@@ -42840,8 +43755,8 @@
         <w:t xml:space="preserve">): a memory system trades accuracy for the properties it provides, such as small prompts, forgetting and user control. A run on all 78 knowledge-update questions would be needed for a firm statement.</w:t>
       </w:r>
     </w:p>
-    <w:bookmarkEnd w:id="76"/>
-    <w:bookmarkStart w:id="77" w:name="sec:discussion"/>
+    <w:bookmarkEnd w:id="77"/>
+    <w:bookmarkStart w:id="78" w:name="sec:discussion"/>
     <w:p>
       <w:pPr>
         <w:pStyle w:val="Heading1"/>
@@ -43028,8 +43943,8 @@
         <w:t xml:space="preserve">Letting a rejected change return only after new user input is cheap and conceptually neat, but we found no benefit with real models (the oracle user rejected no correct change in these runs), and only small, uncorrected-significance effects in simulation. Its value would have to be shown with real users who slip.</w:t>
       </w:r>
     </w:p>
-    <w:bookmarkEnd w:id="77"/>
-    <w:bookmarkStart w:id="78" w:name="sec:threats"/>
+    <w:bookmarkEnd w:id="78"/>
+    <w:bookmarkStart w:id="79" w:name="sec:threats"/>
     <w:p>
       <w:pPr>
         <w:pStyle w:val="Heading1"/>
@@ -43069,7 +43984,7 @@
         <w:t xml:space="preserve"> </w:t>
       </w:r>
       <w:r>
-        <w:t xml:space="preserve">12 personas, one seed per cell and two models of the same family; exact sign tests with 12 pairs cannot resolve small effects, and several F1 results are inconclusive rather than null.</w:t>
+        <w:t xml:space="preserve">The oracle-target and same-size-list pilot has six personas, one model and one seed, after two planned personas were lost to an API quota error. 12 personas, one seed per cell and two models of the same family; exact sign tests with 12 pairs cannot resolve small effects, and several F1 results are inconclusive rather than null.</w:t>
       </w:r>
       <w:r>
         <w:t xml:space="preserve"> </w:t>
@@ -43168,8 +44083,8 @@
         <w:t xml:space="preserve">Six of the closest works were read in full, the others at abstract level; the search was targeted, not systematic.</w:t>
       </w:r>
     </w:p>
-    <w:bookmarkEnd w:id="78"/>
-    <w:bookmarkStart w:id="79" w:name="sec:future"/>
+    <w:bookmarkEnd w:id="79"/>
+    <w:bookmarkStart w:id="80" w:name="sec:future"/>
     <w:p>
       <w:pPr>
         <w:pStyle w:val="Heading1"/>
@@ -43209,39 +44124,7 @@
         <w:t xml:space="preserve"> </w:t>
       </w:r>
       <w:r>
-        <w:t xml:space="preserve">An</w:t>
-      </w:r>
-      <w:r>
-        <w:t xml:space="preserve"> </w:t>
-      </w:r>
-      <w:r>
-        <w:rPr>
-          <w:iCs/>
-          <w:i/>
-        </w:rPr>
-        <w:t xml:space="preserve">oracle-target</w:t>
-      </w:r>
-      <w:r>
-        <w:t xml:space="preserve"> </w:t>
-      </w:r>
-      <w:r>
-        <w:t xml:space="preserve">run, in which the true target is always added to the prompt, would measure</w:t>
-      </w:r>
-      <w:r>
-        <w:t xml:space="preserve"> </w:t>
-      </w:r>
-      <w:r>
-        <w:rPr>
-          <w:iCs/>
-          <w:i/>
-        </w:rPr>
-        <w:t xml:space="preserve">P(Omid R)</w:t>
-      </w:r>
-      <w:r>
-        <w:t xml:space="preserve"> </w:t>
-      </w:r>
-      <w:r>
-        <w:t xml:space="preserve">directly and show how much error remains once reachability is fixed; a real-model run of the same-budget list would show whether its equal reachability gives equal end-to-end results.</w:t>
+        <w:t xml:space="preserve">The pilot of Sec. IX-A used six personas and one model; repeating it with all planned personas, several seeds and a second model family, with the failed runs re-done, would turn its suggestive result into a finding.</w:t>
       </w:r>
       <w:r>
         <w:t xml:space="preserve"> </w:t>
@@ -43308,8 +44191,8 @@
         <w:t xml:space="preserve">AURA also contains an optional layer that asks the user whether a stored fact is still true, sends reminders and prepares briefings; its checks use the same proposal path as the gate. We did not evaluate it and make no claim about it here.</w:t>
       </w:r>
     </w:p>
-    <w:bookmarkEnd w:id="79"/>
-    <w:bookmarkStart w:id="80" w:name="conclusion"/>
+    <w:bookmarkEnd w:id="80"/>
+    <w:bookmarkStart w:id="81" w:name="conclusion"/>
     <w:p>
       <w:pPr>
         <w:pStyle w:val="Heading1"/>
@@ -43326,8 +44209,8 @@
         <w:t xml:space="preserve">A review gate on memory changes is effective against the errors it can see: in our experiments it removes almost all of the true facts that automatic application destroys. It cannot repair updates the extractor never proposes, and in a retrieval-based design these are governed by which memories reach the extractor’s prompt. We made this precise (an update can succeed only if its target is in the prompt, and the gate acts only after that), measured it, and identified what moves it: removing the minimum score and searching per sentence each raise reachability by about ten points, extra candidates on a change cue add little on their own, and an adaptive selection is matched by a plain larger list, which it beats only in prompt size. With two real Gemini extractors, the adaptive selection (run together with the re-proposal rule) left no change target missing and no stale fact under the gate, at about a third more prompt tokens, while keyword and fused rankings did no better than a plain larger list, a cross-encoder reranker did better at the same list size, and about one target in thirteen remains out of reach of every method tried. The practical lesson for user-controlled memories is to measure and report what the extractor can reach, and to compare any remedy against a plain larger list. Evaluating with real users, with an oracle-target condition, in other languages and with larger real samples is the next step; the code, both test-set generators and every raw result file are provided.</w:t>
       </w:r>
     </w:p>
-    <w:bookmarkEnd w:id="80"/>
-    <w:bookmarkStart w:id="81" w:name="data-and-code-availability"/>
+    <w:bookmarkEnd w:id="81"/>
+    <w:bookmarkStart w:id="82" w:name="data-and-code-availability"/>
     <w:p>
       <w:pPr>
         <w:pStyle w:val="Heading1"/>
@@ -43377,8 +44260,8 @@
         <w:t xml:space="preserve">) are in the AURA project repository. Numbers in the text are generated from the result folders.</w:t>
       </w:r>
     </w:p>
-    <w:bookmarkEnd w:id="81"/>
-    <w:bookmarkStart w:id="82" w:name="app:scoring"/>
+    <w:bookmarkEnd w:id="82"/>
+    <w:bookmarkStart w:id="83" w:name="app:scoring"/>
     <w:p>
       <w:pPr>
         <w:pStyle w:val="Heading1"/>
@@ -43874,11 +44757,11 @@
         <w:t xml:space="preserve"> </w:t>
       </w:r>
       <w:r>
-        <w:t xml:space="preserve">For every memory in the baseline and F1+F2 real runs the annotator saw the persona’s sessions, the true final state and the memory text, and wrote one of seven labels (true, ended, stale, false, hypothetical, third-party, other), looking at the automatic label only afterwards where possible. The automatic and the hand label were then compared (Table XXV).</w:t>
+        <w:t xml:space="preserve">For every memory in the baseline and F1+F2 real runs the annotator saw the persona’s sessions, the true final state and the memory text, and wrote one of seven labels (true, ended, stale, false, hypothetical, third-party, other), looking at the automatic label only afterwards where possible. The automatic and the hand label were then compared (Table XXVI).</w:t>
       </w:r>
     </w:p>
-    <w:bookmarkEnd w:id="82"/>
-    <w:bookmarkStart w:id="83" w:name="complete-policy-results"/>
+    <w:bookmarkEnd w:id="83"/>
+    <w:bookmarkStart w:id="84" w:name="complete-policy-results"/>
     <w:p>
       <w:pPr>
         <w:pStyle w:val="Heading1"/>
@@ -43894,7 +44777,7 @@
         <w:pStyle w:val="FirstParagraph"/>
       </w:pPr>
       <w:r>
-        <w:t xml:space="preserve">Table XXVII gives all metrics of the policy comparison for all error rates.</w:t>
+        <w:t xml:space="preserve">Table XXVIII gives all metrics of the policy comparison for all error rates.</w:t>
       </w:r>
     </w:p>
     <w:p>
@@ -43911,7 +44794,7 @@
           <w:smallCaps w:val="0"/>
           <w:sz w:val="16"/>
         </w:rPr>
-        <w:t xml:space="preserve">TABLE XXVII</w:t>
+        <w:t xml:space="preserve">TABLE XXVIII</w:t>
       </w:r>
       <w:r>
         <w:rPr>
@@ -48510,8 +49393,8 @@
         </w:tc>
       </w:tr>
     </w:tbl>
-    <w:bookmarkEnd w:id="83"/>
-    <w:bookmarkStart w:id="84" w:name="complete-ablation-results"/>
+    <w:bookmarkEnd w:id="84"/>
+    <w:bookmarkStart w:id="85" w:name="complete-ablation-results"/>
     <w:p>
       <w:pPr>
         <w:pStyle w:val="Heading1"/>
@@ -48527,7 +49410,7 @@
         <w:pStyle w:val="FirstParagraph"/>
       </w:pPr>
       <w:r>
-        <w:t xml:space="preserve">Tables XXVIII and XXIX give every cell of the simulated ablation. An asterisk marks a sign-test</w:t>
+        <w:t xml:space="preserve">Tables XXIX and XXX give every cell of the simulated ablation. An asterisk marks a sign-test</w:t>
       </w:r>
       <w:r>
         <w:t xml:space="preserve"> </w:t>
@@ -48580,7 +49463,7 @@
           <w:smallCaps w:val="0"/>
           <w:sz w:val="16"/>
         </w:rPr>
-        <w:t xml:space="preserve">TABLE XXVIII</w:t>
+        <w:t xml:space="preserve">TABLE XXIX</w:t>
       </w:r>
       <w:r>
         <w:rPr>
@@ -53954,7 +54837,7 @@
           <w:smallCaps w:val="0"/>
           <w:sz w:val="16"/>
         </w:rPr>
-        <w:t xml:space="preserve">TABLE XXIX</w:t>
+        <w:t xml:space="preserve">TABLE XXX</w:t>
       </w:r>
       <w:r>
         <w:rPr>
@@ -56406,8 +57289,8 @@
         </w:tc>
       </w:tr>
     </w:tbl>
-    <w:bookmarkEnd w:id="84"/>
-    <w:bookmarkStart w:id="85" w:name="reachability-for-all-store-sizes"/>
+    <w:bookmarkEnd w:id="85"/>
+    <w:bookmarkStart w:id="86" w:name="reachability-for-all-store-sizes"/>
     <w:p>
       <w:pPr>
         <w:pStyle w:val="Heading1"/>
@@ -56423,7 +57306,7 @@
         <w:pStyle w:val="FirstParagraph"/>
       </w:pPr>
       <w:r>
-        <w:t xml:space="preserve">Table XXX gives reachability and mean candidate count for all selection modes, store sizes and turn types.</w:t>
+        <w:t xml:space="preserve">Table XXXI gives reachability and mean candidate count for all selection modes, store sizes and turn types.</w:t>
       </w:r>
     </w:p>
     <w:p>
@@ -56440,7 +57323,7 @@
           <w:smallCaps w:val="0"/>
           <w:sz w:val="16"/>
         </w:rPr>
-        <w:t xml:space="preserve">TABLE XXX</w:t>
+        <w:t xml:space="preserve">TABLE XXXI</w:t>
       </w:r>
       <w:r>
         <w:rPr>
@@ -58250,8 +59133,8 @@
         </w:tc>
       </w:tr>
     </w:tbl>
-    <w:bookmarkEnd w:id="85"/>
-    <w:bookmarkStart w:id="86" w:name="selection-study-for-all-store-sizes"/>
+    <w:bookmarkEnd w:id="86"/>
+    <w:bookmarkStart w:id="87" w:name="selection-study-for-all-store-sizes"/>
     <w:p>
       <w:pPr>
         <w:pStyle w:val="Heading1"/>
@@ -58267,7 +59150,7 @@
         <w:pStyle w:val="FirstParagraph"/>
       </w:pPr>
       <w:r>
-        <w:t xml:space="preserve">Table XXXI gives reachability for every condition of the selection study and every store size, with the retrieval diagnostics of Sec. IX.</w:t>
+        <w:t xml:space="preserve">Table XXXII gives reachability for every condition of the selection study and every store size, with the retrieval diagnostics of Sec. IX.</w:t>
       </w:r>
     </w:p>
     <w:p>
@@ -58284,7 +59167,7 @@
           <w:smallCaps w:val="0"/>
           <w:sz w:val="16"/>
         </w:rPr>
-        <w:t xml:space="preserve">TABLE XXXI</w:t>
+        <w:t xml:space="preserve">TABLE XXXII</w:t>
       </w:r>
       <w:r>
         <w:rPr>
@@ -61816,8 +62699,8 @@
         </w:tc>
       </w:tr>
     </w:tbl>
-    <w:bookmarkEnd w:id="86"/>
-    <w:bookmarkStart w:id="104" w:name="reproducing-the-results"/>
+    <w:bookmarkEnd w:id="87"/>
+    <w:bookmarkStart w:id="105" w:name="reproducing-the-results"/>
     <w:p>
       <w:pPr>
         <w:pStyle w:val="Heading1"/>
@@ -62055,8 +62938,8 @@
         <w:t xml:space="preserve">: every other table, number macro and the real-run and LongMemEval figures of this paper.</w:t>
       </w:r>
     </w:p>
-    <w:bookmarkStart w:id="103" w:name="refs"/>
-    <w:bookmarkStart w:id="87" w:name="ref-lam2026ssgm"/>
+    <w:bookmarkStart w:id="104" w:name="refs"/>
+    <w:bookmarkStart w:id="88" w:name="ref-lam2026ssgm"/>
     <w:p>
       <w:pPr>
         <w:pStyle w:val="Bibliography"/>
@@ -62111,8 +62994,8 @@
         <w:t xml:space="preserve">, 2026.</w:t>
       </w:r>
     </w:p>
-    <w:bookmarkEnd w:id="87"/>
-    <w:bookmarkStart w:id="88" w:name="ref-maharana2024locomo"/>
+    <w:bookmarkEnd w:id="88"/>
+    <w:bookmarkStart w:id="89" w:name="ref-maharana2024locomo"/>
     <w:p>
       <w:pPr>
         <w:pStyle w:val="Bibliography"/>
@@ -62161,8 +63044,8 @@
         <w:t xml:space="preserve">, 2024.</w:t>
       </w:r>
     </w:p>
-    <w:bookmarkEnd w:id="88"/>
-    <w:bookmarkStart w:id="89" w:name="ref-wu2024longmemeval"/>
+    <w:bookmarkEnd w:id="89"/>
+    <w:bookmarkStart w:id="90" w:name="ref-wu2024longmemeval"/>
     <w:p>
       <w:pPr>
         <w:pStyle w:val="Bibliography"/>
@@ -62205,8 +63088,8 @@
         <w:t xml:space="preserve">, 2024.</w:t>
       </w:r>
     </w:p>
-    <w:bookmarkEnd w:id="89"/>
-    <w:bookmarkStart w:id="90" w:name="ref-chhikara2025mem0"/>
+    <w:bookmarkEnd w:id="90"/>
+    <w:bookmarkStart w:id="91" w:name="ref-chhikara2025mem0"/>
     <w:p>
       <w:pPr>
         <w:pStyle w:val="Bibliography"/>
@@ -62261,8 +63144,8 @@
         <w:t xml:space="preserve">, 2025.</w:t>
       </w:r>
     </w:p>
-    <w:bookmarkEnd w:id="90"/>
-    <w:bookmarkStart w:id="91" w:name="ref-yang2026trustmem"/>
+    <w:bookmarkEnd w:id="91"/>
+    <w:bookmarkStart w:id="92" w:name="ref-yang2026trustmem"/>
     <w:p>
       <w:pPr>
         <w:pStyle w:val="Bibliography"/>
@@ -62317,8 +63200,8 @@
         <w:t xml:space="preserve">, 2026.</w:t>
       </w:r>
     </w:p>
-    <w:bookmarkEnd w:id="91"/>
-    <w:bookmarkStart w:id="92" w:name="ref-yu2026agemem"/>
+    <w:bookmarkEnd w:id="92"/>
+    <w:bookmarkStart w:id="93" w:name="ref-yu2026agemem"/>
     <w:p>
       <w:pPr>
         <w:pStyle w:val="Bibliography"/>
@@ -62374,8 +63257,8 @@
         <w:t xml:space="preserve">, 2026, pp. 21457–21483.</w:t>
       </w:r>
     </w:p>
-    <w:bookmarkEnd w:id="92"/>
-    <w:bookmarkStart w:id="93" w:name="ref-patel2026supersede"/>
+    <w:bookmarkEnd w:id="93"/>
+    <w:bookmarkStart w:id="94" w:name="ref-patel2026supersede"/>
     <w:p>
       <w:pPr>
         <w:pStyle w:val="Bibliography"/>
@@ -62424,8 +63307,8 @@
         <w:t xml:space="preserve">, 2026.</w:t>
       </w:r>
     </w:p>
-    <w:bookmarkEnd w:id="93"/>
-    <w:bookmarkStart w:id="94" w:name="ref-sun2026pamu"/>
+    <w:bookmarkEnd w:id="94"/>
+    <w:bookmarkStart w:id="95" w:name="ref-sun2026pamu"/>
     <w:p>
       <w:pPr>
         <w:pStyle w:val="Bibliography"/>
@@ -62480,8 +63363,8 @@
         <w:t xml:space="preserve">, 2026, pp. 783–793.</w:t>
       </w:r>
     </w:p>
-    <w:bookmarkEnd w:id="94"/>
-    <w:bookmarkStart w:id="95" w:name="ref-song2026realm"/>
+    <w:bookmarkEnd w:id="95"/>
+    <w:bookmarkStart w:id="96" w:name="ref-song2026realm"/>
     <w:p>
       <w:pPr>
         <w:pStyle w:val="Bibliography"/>
@@ -62543,8 +63426,8 @@
         <w:t xml:space="preserve">, 2026.</w:t>
       </w:r>
     </w:p>
-    <w:bookmarkEnd w:id="95"/>
-    <w:bookmarkStart w:id="96" w:name="ref-zhang2026memgate"/>
+    <w:bookmarkEnd w:id="96"/>
+    <w:bookmarkStart w:id="97" w:name="ref-zhang2026memgate"/>
     <w:p>
       <w:pPr>
         <w:pStyle w:val="Bibliography"/>
@@ -62606,8 +63489,8 @@
         <w:t xml:space="preserve">, 2026.</w:t>
       </w:r>
     </w:p>
-    <w:bookmarkEnd w:id="96"/>
-    <w:bookmarkStart w:id="97" w:name="ref-xiong2025memory"/>
+    <w:bookmarkEnd w:id="97"/>
+    <w:bookmarkStart w:id="98" w:name="ref-xiong2025memory"/>
     <w:p>
       <w:pPr>
         <w:pStyle w:val="Bibliography"/>
@@ -62669,8 +63552,8 @@
         <w:t xml:space="preserve">, 2025.</w:t>
       </w:r>
     </w:p>
-    <w:bookmarkEnd w:id="97"/>
-    <w:bookmarkStart w:id="98" w:name="ref-xiao2026errors"/>
+    <w:bookmarkEnd w:id="98"/>
+    <w:bookmarkStart w:id="99" w:name="ref-xiao2026errors"/>
     <w:p>
       <w:pPr>
         <w:pStyle w:val="Bibliography"/>
@@ -62729,8 +63612,8 @@
         <w:t xml:space="preserve">, 2026.</w:t>
       </w:r>
     </w:p>
-    <w:bookmarkEnd w:id="98"/>
-    <w:bookmarkStart w:id="99" w:name="ref-chu2026survey"/>
+    <w:bookmarkEnd w:id="99"/>
+    <w:bookmarkStart w:id="100" w:name="ref-chu2026survey"/>
     <w:p>
       <w:pPr>
         <w:pStyle w:val="Bibliography"/>
@@ -62788,8 +63671,8 @@
         <w:t xml:space="preserve">, 2026.</w:t>
       </w:r>
     </w:p>
-    <w:bookmarkEnd w:id="99"/>
-    <w:bookmarkStart w:id="100" w:name="ref-wang2020minilm"/>
+    <w:bookmarkEnd w:id="100"/>
+    <w:bookmarkStart w:id="101" w:name="ref-wang2020minilm"/>
     <w:p>
       <w:pPr>
         <w:pStyle w:val="Bibliography"/>
@@ -62832,8 +63715,8 @@
         <w:t xml:space="preserve">, 2020.</w:t>
       </w:r>
     </w:p>
-    <w:bookmarkEnd w:id="100"/>
-    <w:bookmarkStart w:id="101" w:name="ref-wilson1927"/>
+    <w:bookmarkEnd w:id="101"/>
+    <w:bookmarkStart w:id="102" w:name="ref-wilson1927"/>
     <w:p>
       <w:pPr>
         <w:pStyle w:val="Bibliography"/>
@@ -62870,8 +63753,8 @@
         <w:t xml:space="preserve">, vol. 22, no. 158, pp. 209–212, 1927.</w:t>
       </w:r>
     </w:p>
-    <w:bookmarkEnd w:id="101"/>
-    <w:bookmarkStart w:id="102" w:name="ref-cohen1960"/>
+    <w:bookmarkEnd w:id="102"/>
+    <w:bookmarkStart w:id="103" w:name="ref-cohen1960"/>
     <w:p>
       <w:pPr>
         <w:pStyle w:val="Bibliography"/>
@@ -62908,9 +63791,9 @@
         <w:t xml:space="preserve">, vol. 20, no. 1, pp. 37–46, 1960.</w:t>
       </w:r>
     </w:p>
-    <w:bookmarkEnd w:id="102"/>
     <w:bookmarkEnd w:id="103"/>
     <w:bookmarkEnd w:id="104"/>
+    <w:bookmarkEnd w:id="105"/>
     <w:sectPr>
       <w:type w:val="continuous"/>
       <w:pgSz w:w="12240" w:h="15840"/>

</xml_diff>

<commit_message>
Paper: title with the candidate-selection part first and the review-gate statement after the colon
Co-Authored-By: Claude Sonnet 5.5 <noreply@anthropic.com>
Claude-Session: https://claude.ai/code/session_0199uMN2tRAqpJR3sfk69y1g
</commit_message>
<xml_diff>
--- a/paper/aura-paper.docx
+++ b/paper/aura-paper.docx
@@ -7,6 +7,60 @@
         <w:pStyle w:val="Title"/>
       </w:pPr>
       <w:r>
+        <w:t xml:space="preserve">Candidate</w:t>
+      </w:r>
+      <w:r>
+        <w:t xml:space="preserve"> </w:t>
+      </w:r>
+      <w:r>
+        <w:t xml:space="preserve">Selection</w:t>
+      </w:r>
+      <w:r>
+        <w:t xml:space="preserve"> </w:t>
+      </w:r>
+      <w:r>
+        <w:t xml:space="preserve">in</w:t>
+      </w:r>
+      <w:r>
+        <w:t xml:space="preserve"> </w:t>
+      </w:r>
+      <w:r>
+        <w:t xml:space="preserve">User-Controlled</w:t>
+      </w:r>
+      <w:r>
+        <w:t xml:space="preserve"> </w:t>
+      </w:r>
+      <w:r>
+        <w:t xml:space="preserve">Long-Term</w:t>
+      </w:r>
+      <w:r>
+        <w:t xml:space="preserve"> </w:t>
+      </w:r>
+      <w:r>
+        <w:t xml:space="preserve">Memory</w:t>
+      </w:r>
+      <w:r>
+        <w:t xml:space="preserve"> </w:t>
+      </w:r>
+      <w:r>
+        <w:t xml:space="preserve">for</w:t>
+      </w:r>
+      <w:r>
+        <w:t xml:space="preserve"> </w:t>
+      </w:r>
+      <w:r>
+        <w:t xml:space="preserve">LLM</w:t>
+      </w:r>
+      <w:r>
+        <w:t xml:space="preserve"> </w:t>
+      </w:r>
+      <w:r>
+        <w:t xml:space="preserve">Assistants:</w:t>
+      </w:r>
+      <w:r>
+        <w:t xml:space="preserve"> </w:t>
+      </w:r>
+      <w:r>
         <w:t xml:space="preserve">A</w:t>
       </w:r>
       <w:r>
@@ -67,61 +121,7 @@
         <w:t xml:space="preserve"> </w:t>
       </w:r>
       <w:r>
-        <w:t xml:space="preserve">Updates:</w:t>
-      </w:r>
-      <w:r>
-        <w:t xml:space="preserve"> </w:t>
-      </w:r>
-      <w:r>
-        <w:t xml:space="preserve">Candidate</w:t>
-      </w:r>
-      <w:r>
-        <w:t xml:space="preserve"> </w:t>
-      </w:r>
-      <w:r>
-        <w:t xml:space="preserve">Selection</w:t>
-      </w:r>
-      <w:r>
-        <w:t xml:space="preserve"> </w:t>
-      </w:r>
-      <w:r>
-        <w:t xml:space="preserve">in</w:t>
-      </w:r>
-      <w:r>
-        <w:t xml:space="preserve"> </w:t>
-      </w:r>
-      <w:r>
-        <w:t xml:space="preserve">User-Controlled</w:t>
-      </w:r>
-      <w:r>
-        <w:t xml:space="preserve"> </w:t>
-      </w:r>
-      <w:r>
-        <w:t xml:space="preserve">Long-Term</w:t>
-      </w:r>
-      <w:r>
-        <w:t xml:space="preserve"> </w:t>
-      </w:r>
-      <w:r>
-        <w:t xml:space="preserve">Memory</w:t>
-      </w:r>
-      <w:r>
-        <w:t xml:space="preserve"> </w:t>
-      </w:r>
-      <w:r>
-        <w:t xml:space="preserve">for</w:t>
-      </w:r>
-      <w:r>
-        <w:t xml:space="preserve"> </w:t>
-      </w:r>
-      <w:r>
-        <w:t xml:space="preserve">LLM</w:t>
-      </w:r>
-      <w:r>
-        <w:t xml:space="preserve"> </w:t>
-      </w:r>
-      <w:r>
-        <w:t xml:space="preserve">Assistants</w:t>
+        <w:t xml:space="preserve">Updates</w:t>
       </w:r>
     </w:p>
     <w:tbl>

</xml_diff>

<commit_message>
Paper: single shorter title (candidate selection and review gates for wrong writes and missed updates)
Co-Authored-By: Claude Sonnet 5.5 <noreply@anthropic.com>
Claude-Session: https://claude.ai/code/session_0199uMN2tRAqpJR3sfk69y1g
</commit_message>
<xml_diff>
--- a/paper/aura-paper.docx
+++ b/paper/aura-paper.docx
@@ -19,6 +19,60 @@
         <w:t xml:space="preserve"> </w:t>
       </w:r>
       <w:r>
+        <w:t xml:space="preserve">and</w:t>
+      </w:r>
+      <w:r>
+        <w:t xml:space="preserve"> </w:t>
+      </w:r>
+      <w:r>
+        <w:t xml:space="preserve">Review</w:t>
+      </w:r>
+      <w:r>
+        <w:t xml:space="preserve"> </w:t>
+      </w:r>
+      <w:r>
+        <w:t xml:space="preserve">Gates</w:t>
+      </w:r>
+      <w:r>
+        <w:t xml:space="preserve"> </w:t>
+      </w:r>
+      <w:r>
+        <w:t xml:space="preserve">for</w:t>
+      </w:r>
+      <w:r>
+        <w:t xml:space="preserve"> </w:t>
+      </w:r>
+      <w:r>
+        <w:t xml:space="preserve">Wrong</w:t>
+      </w:r>
+      <w:r>
+        <w:t xml:space="preserve"> </w:t>
+      </w:r>
+      <w:r>
+        <w:t xml:space="preserve">Writes</w:t>
+      </w:r>
+      <w:r>
+        <w:t xml:space="preserve"> </w:t>
+      </w:r>
+      <w:r>
+        <w:t xml:space="preserve">and</w:t>
+      </w:r>
+      <w:r>
+        <w:t xml:space="preserve"> </w:t>
+      </w:r>
+      <w:r>
+        <w:t xml:space="preserve">Missed</w:t>
+      </w:r>
+      <w:r>
+        <w:t xml:space="preserve"> </w:t>
+      </w:r>
+      <w:r>
+        <w:t xml:space="preserve">Updates</w:t>
+      </w:r>
+      <w:r>
+        <w:t xml:space="preserve"> </w:t>
+      </w:r>
+      <w:r>
         <w:t xml:space="preserve">in</w:t>
       </w:r>
       <w:r>
@@ -31,97 +85,13 @@
         <w:t xml:space="preserve"> </w:t>
       </w:r>
       <w:r>
-        <w:t xml:space="preserve">Long-Term</w:t>
+        <w:t xml:space="preserve">LLM</w:t>
       </w:r>
       <w:r>
         <w:t xml:space="preserve"> </w:t>
       </w:r>
       <w:r>
         <w:t xml:space="preserve">Memory</w:t>
-      </w:r>
-      <w:r>
-        <w:t xml:space="preserve"> </w:t>
-      </w:r>
-      <w:r>
-        <w:t xml:space="preserve">for</w:t>
-      </w:r>
-      <w:r>
-        <w:t xml:space="preserve"> </w:t>
-      </w:r>
-      <w:r>
-        <w:t xml:space="preserve">LLM</w:t>
-      </w:r>
-      <w:r>
-        <w:t xml:space="preserve"> </w:t>
-      </w:r>
-      <w:r>
-        <w:t xml:space="preserve">Assistants:</w:t>
-      </w:r>
-      <w:r>
-        <w:t xml:space="preserve"> </w:t>
-      </w:r>
-      <w:r>
-        <w:t xml:space="preserve">A</w:t>
-      </w:r>
-      <w:r>
-        <w:t xml:space="preserve"> </w:t>
-      </w:r>
-      <w:r>
-        <w:t xml:space="preserve">Review</w:t>
-      </w:r>
-      <w:r>
-        <w:t xml:space="preserve"> </w:t>
-      </w:r>
-      <w:r>
-        <w:t xml:space="preserve">Gate</w:t>
-      </w:r>
-      <w:r>
-        <w:t xml:space="preserve"> </w:t>
-      </w:r>
-      <w:r>
-        <w:t xml:space="preserve">Stops</w:t>
-      </w:r>
-      <w:r>
-        <w:t xml:space="preserve"> </w:t>
-      </w:r>
-      <w:r>
-        <w:t xml:space="preserve">Wrong</w:t>
-      </w:r>
-      <w:r>
-        <w:t xml:space="preserve"> </w:t>
-      </w:r>
-      <w:r>
-        <w:t xml:space="preserve">Memory</w:t>
-      </w:r>
-      <w:r>
-        <w:t xml:space="preserve"> </w:t>
-      </w:r>
-      <w:r>
-        <w:t xml:space="preserve">Writes</w:t>
-      </w:r>
-      <w:r>
-        <w:t xml:space="preserve"> </w:t>
-      </w:r>
-      <w:r>
-        <w:t xml:space="preserve">but</w:t>
-      </w:r>
-      <w:r>
-        <w:t xml:space="preserve"> </w:t>
-      </w:r>
-      <w:r>
-        <w:t xml:space="preserve">Not</w:t>
-      </w:r>
-      <w:r>
-        <w:t xml:space="preserve"> </w:t>
-      </w:r>
-      <w:r>
-        <w:t xml:space="preserve">Missed</w:t>
-      </w:r>
-      <w:r>
-        <w:t xml:space="preserve"> </w:t>
-      </w:r>
-      <w:r>
-        <w:t xml:space="preserve">Updates</w:t>
       </w:r>
     </w:p>
     <w:tbl>

</xml_diff>

<commit_message>
Paper: fewer float barriers and a single-column cost table, so pages are filled and tables stay near their text
Co-Authored-By: Claude Sonnet 5.5 <noreply@anthropic.com>
Claude-Session: https://claude.ai/code/session_0199uMN2tRAqpJR3sfk69y1g
</commit_message>
<xml_diff>
--- a/paper/aura-paper.docx
+++ b/paper/aura-paper.docx
@@ -39385,19 +39385,6 @@
     <w:p>
       <w:pPr>
         <w:pStyle w:val="BodyText"/>
-        <w:spacing w:after="0" w:before="0"/>
-        <w:sectPr>
-          <w:type w:val="continuous"/>
-          <w:pgSz w:w="12240" w:h="15840"/>
-          <w:pgMar w:left="900" w:right="900" w:top="1080" w:bottom="1440"/>
-          <w:cols w:num="2" w:space="360"/>
-        </w:sectPr>
-      </w:pPr>
-      <w:r/>
-    </w:p>
-    <w:p>
-      <w:pPr>
-        <w:pStyle w:val="BodyText"/>
         <w:keepNext/>
         <w:spacing w:after="60"/>
         <w:jc w:val="center"/>
@@ -39467,7 +39454,7 @@
             <w:r>
               <w:rPr>
                 <w:rFonts w:ascii="Times New Roman" w:hAnsi="Times New Roman"/>
-                <w:sz w:val="16"/>
+                <w:sz w:val="14"/>
               </w:rPr>
               <w:t xml:space="preserve">model</w:t>
             </w:r>
@@ -39490,7 +39477,7 @@
             <w:r>
               <w:rPr>
                 <w:rFonts w:ascii="Times New Roman" w:hAnsi="Times New Roman"/>
-                <w:sz w:val="16"/>
+                <w:sz w:val="14"/>
               </w:rPr>
               <w:t xml:space="preserve">variant</w:t>
             </w:r>
@@ -39513,7 +39500,7 @@
             <w:r>
               <w:rPr>
                 <w:rFonts w:ascii="Times New Roman" w:hAnsi="Times New Roman"/>
-                <w:sz w:val="16"/>
+                <w:sz w:val="14"/>
               </w:rPr>
               <w:t xml:space="preserve">requests</w:t>
             </w:r>
@@ -39536,7 +39523,7 @@
             <w:r>
               <w:rPr>
                 <w:rFonts w:ascii="Times New Roman" w:hAnsi="Times New Roman"/>
-                <w:sz w:val="16"/>
+                <w:sz w:val="14"/>
               </w:rPr>
               <w:t xml:space="preserve">prompt tokens</w:t>
             </w:r>
@@ -39559,7 +39546,7 @@
             <w:r>
               <w:rPr>
                 <w:rFonts w:ascii="Times New Roman" w:hAnsi="Times New Roman"/>
-                <w:sz w:val="16"/>
+                <w:sz w:val="14"/>
               </w:rPr>
               <w:t xml:space="preserve">output tokens</w:t>
             </w:r>
@@ -39582,7 +39569,7 @@
             <w:r>
               <w:rPr>
                 <w:rFonts w:ascii="Times New Roman" w:hAnsi="Times New Roman"/>
-                <w:sz w:val="16"/>
+                <w:sz w:val="14"/>
               </w:rPr>
               <w:t xml:space="preserve">latency / request (s)</w:t>
             </w:r>
@@ -39608,7 +39595,7 @@
               <w:rPr>
                 <w:rStyle w:val="VerbatimChar"/>
                 <w:rFonts w:ascii="Times New Roman" w:hAnsi="Times New Roman"/>
-                <w:sz w:val="16"/>
+                <w:sz w:val="14"/>
               </w:rPr>
               <w:t xml:space="preserve">gemini-3.5-flash-lite</w:t>
             </w:r>
@@ -39631,7 +39618,7 @@
             <w:r>
               <w:rPr>
                 <w:rFonts w:ascii="Times New Roman" w:hAnsi="Times New Roman"/>
-                <w:sz w:val="16"/>
+                <w:sz w:val="14"/>
               </w:rPr>
               <w:t xml:space="preserve">baseline</w:t>
             </w:r>
@@ -39654,7 +39641,7 @@
             <w:r>
               <w:rPr>
                 <w:rFonts w:ascii="Times New Roman" w:hAnsi="Times New Roman"/>
-                <w:sz w:val="16"/>
+                <w:sz w:val="14"/>
               </w:rPr>
               <w:t xml:space="preserve">23.1</w:t>
             </w:r>
@@ -39677,7 +39664,7 @@
             <w:r>
               <w:rPr>
                 <w:rFonts w:ascii="Times New Roman" w:hAnsi="Times New Roman"/>
-                <w:sz w:val="16"/>
+                <w:sz w:val="14"/>
               </w:rPr>
               <w:t xml:space="preserve">13 376</w:t>
             </w:r>
@@ -39700,7 +39687,7 @@
             <w:r>
               <w:rPr>
                 <w:rFonts w:ascii="Times New Roman" w:hAnsi="Times New Roman"/>
-                <w:sz w:val="16"/>
+                <w:sz w:val="14"/>
               </w:rPr>
               <w:t xml:space="preserve">833</w:t>
             </w:r>
@@ -39723,7 +39710,7 @@
             <w:r>
               <w:rPr>
                 <w:rFonts w:ascii="Times New Roman" w:hAnsi="Times New Roman"/>
-                <w:sz w:val="16"/>
+                <w:sz w:val="14"/>
               </w:rPr>
               <w:t xml:space="preserve">5.61</w:t>
             </w:r>
@@ -39764,7 +39751,7 @@
             <w:r>
               <w:rPr>
                 <w:rFonts w:ascii="Times New Roman" w:hAnsi="Times New Roman"/>
-                <w:sz w:val="16"/>
+                <w:sz w:val="14"/>
               </w:rPr>
               <w:t xml:space="preserve">F1+F2</w:t>
             </w:r>
@@ -39787,7 +39774,7 @@
             <w:r>
               <w:rPr>
                 <w:rFonts w:ascii="Times New Roman" w:hAnsi="Times New Roman"/>
-                <w:sz w:val="16"/>
+                <w:sz w:val="14"/>
               </w:rPr>
               <w:t xml:space="preserve">23.1</w:t>
             </w:r>
@@ -39810,7 +39797,7 @@
             <w:r>
               <w:rPr>
                 <w:rFonts w:ascii="Times New Roman" w:hAnsi="Times New Roman"/>
-                <w:sz w:val="16"/>
+                <w:sz w:val="14"/>
               </w:rPr>
               <w:t xml:space="preserve">18 072</w:t>
             </w:r>
@@ -39833,7 +39820,7 @@
             <w:r>
               <w:rPr>
                 <w:rFonts w:ascii="Times New Roman" w:hAnsi="Times New Roman"/>
-                <w:sz w:val="16"/>
+                <w:sz w:val="14"/>
               </w:rPr>
               <w:t xml:space="preserve">796</w:t>
             </w:r>
@@ -39856,7 +39843,7 @@
             <w:r>
               <w:rPr>
                 <w:rFonts w:ascii="Times New Roman" w:hAnsi="Times New Roman"/>
-                <w:sz w:val="16"/>
+                <w:sz w:val="14"/>
               </w:rPr>
               <w:t xml:space="preserve">9.39</w:t>
             </w:r>
@@ -39882,7 +39869,7 @@
               <w:rPr>
                 <w:rStyle w:val="VerbatimChar"/>
                 <w:rFonts w:ascii="Times New Roman" w:hAnsi="Times New Roman"/>
-                <w:sz w:val="16"/>
+                <w:sz w:val="14"/>
               </w:rPr>
               <w:t xml:space="preserve">gemini-3.1-flash-lite</w:t>
             </w:r>
@@ -39905,7 +39892,7 @@
             <w:r>
               <w:rPr>
                 <w:rFonts w:ascii="Times New Roman" w:hAnsi="Times New Roman"/>
-                <w:sz w:val="16"/>
+                <w:sz w:val="14"/>
               </w:rPr>
               <w:t xml:space="preserve">baseline</w:t>
             </w:r>
@@ -39928,7 +39915,7 @@
             <w:r>
               <w:rPr>
                 <w:rFonts w:ascii="Times New Roman" w:hAnsi="Times New Roman"/>
-                <w:sz w:val="16"/>
+                <w:sz w:val="14"/>
               </w:rPr>
               <w:t xml:space="preserve">23.1</w:t>
             </w:r>
@@ -39951,7 +39938,7 @@
             <w:r>
               <w:rPr>
                 <w:rFonts w:ascii="Times New Roman" w:hAnsi="Times New Roman"/>
-                <w:sz w:val="16"/>
+                <w:sz w:val="14"/>
               </w:rPr>
               <w:t xml:space="preserve">13 347</w:t>
             </w:r>
@@ -39974,7 +39961,7 @@
             <w:r>
               <w:rPr>
                 <w:rFonts w:ascii="Times New Roman" w:hAnsi="Times New Roman"/>
-                <w:sz w:val="16"/>
+                <w:sz w:val="14"/>
               </w:rPr>
               <w:t xml:space="preserve">932</w:t>
             </w:r>
@@ -39997,7 +39984,7 @@
             <w:r>
               <w:rPr>
                 <w:rFonts w:ascii="Times New Roman" w:hAnsi="Times New Roman"/>
-                <w:sz w:val="16"/>
+                <w:sz w:val="14"/>
               </w:rPr>
               <w:t xml:space="preserve">6.15</w:t>
             </w:r>
@@ -40036,7 +40023,7 @@
             <w:r>
               <w:rPr>
                 <w:rFonts w:ascii="Times New Roman" w:hAnsi="Times New Roman"/>
-                <w:sz w:val="16"/>
+                <w:sz w:val="14"/>
               </w:rPr>
               <w:t xml:space="preserve">F1+F2</w:t>
             </w:r>
@@ -40058,7 +40045,7 @@
             <w:r>
               <w:rPr>
                 <w:rFonts w:ascii="Times New Roman" w:hAnsi="Times New Roman"/>
-                <w:sz w:val="16"/>
+                <w:sz w:val="14"/>
               </w:rPr>
               <w:t xml:space="preserve">23.1</w:t>
             </w:r>
@@ -40080,7 +40067,7 @@
             <w:r>
               <w:rPr>
                 <w:rFonts w:ascii="Times New Roman" w:hAnsi="Times New Roman"/>
-                <w:sz w:val="16"/>
+                <w:sz w:val="14"/>
               </w:rPr>
               <w:t xml:space="preserve">18 394</w:t>
             </w:r>
@@ -40102,7 +40089,7 @@
             <w:r>
               <w:rPr>
                 <w:rFonts w:ascii="Times New Roman" w:hAnsi="Times New Roman"/>
-                <w:sz w:val="16"/>
+                <w:sz w:val="14"/>
               </w:rPr>
               <w:t xml:space="preserve">939</w:t>
             </w:r>
@@ -40124,7 +40111,7 @@
             <w:r>
               <w:rPr>
                 <w:rFonts w:ascii="Times New Roman" w:hAnsi="Times New Roman"/>
-                <w:sz w:val="16"/>
+                <w:sz w:val="14"/>
               </w:rPr>
               <w:t xml:space="preserve">5.74</w:t>
             </w:r>
@@ -40132,19 +40119,6 @@
         </w:tc>
       </w:tr>
     </w:tbl>
-    <w:p>
-      <w:pPr>
-        <w:pStyle w:val="BodyText"/>
-        <w:spacing w:after="0" w:before="0"/>
-        <w:sectPr>
-          <w:type w:val="continuous"/>
-          <w:pgSz w:w="12240" w:h="15840"/>
-          <w:pgMar w:left="900" w:right="900" w:top="1080" w:bottom="1440"/>
-          <w:cols w:num="1" w:space="360"/>
-        </w:sectPr>
-      </w:pPr>
-      <w:r/>
-    </w:p>
     <w:bookmarkEnd w:id="71"/>
     <w:bookmarkStart w:id="72" w:name="scorer-validity"/>
     <w:p>

</xml_diff>